<commit_message>
proceedings.pdf neu gebaut, LaTeX-Fix und Build-Dateien aktualisiert
- pdfmanagement-testphase Doppelladung behoben (RequirePackage auskommentiert)
- proceedings.pdf: 174 Seiten neu kompiliert
- Build-Artefakte aktualisiert

Co-Authored-By: Claude Sonnet 4.6 <noreply@anthropic.com>
</commit_message>
<xml_diff>
--- a/LNI-Startseiten.docx
+++ b/LNI-Startseiten.docx
@@ -404,20 +404,23 @@
     <w:p>
       <w:pPr>
         <w:pStyle w:val="Buchtitel-Herausgeber"/>
-      </w:pPr>
-      <w:r>
-        <w:t>Malgorzata Burchard-Dziubinska</w:t>
-      </w:r>
-      <w:r>
-        <w:t xml:space="preserve"> </w:t>
-      </w:r>
-      <w:r>
-        <w:t>(Editors)</w:t>
+        <w:rPr>
+          <w:lang w:val="en-US"/>
+        </w:rPr>
+      </w:pPr>
+      <w:r>
+        <w:rPr>
+          <w:lang w:val="en-US"/>
+        </w:rPr>
+        <w:t>Malgorzata Burchard-Dziubinska (Editors)</w:t>
       </w:r>
     </w:p>
     <w:p>
       <w:pPr>
         <w:pStyle w:val="Buchtitel-Herausgeber"/>
+        <w:rPr>
+          <w:lang w:val="en-US"/>
+        </w:rPr>
       </w:pPr>
     </w:p>
     <w:p>
@@ -506,55 +509,55 @@
         <w:pStyle w:val="Buchuntertitel"/>
         <w:rPr>
           <w:color w:val="auto"/>
-          <w:lang w:val="de-AT"/>
+          <w:lang w:val="en-US"/>
         </w:rPr>
       </w:pPr>
       <w:r>
         <w:rPr>
           <w:color w:val="auto"/>
-          <w:lang w:val="de-AT"/>
+          <w:lang w:val="en-US"/>
         </w:rPr>
         <w:t>September</w:t>
       </w:r>
       <w:r>
         <w:rPr>
           <w:color w:val="auto"/>
-          <w:lang w:val="de-AT"/>
+          <w:lang w:val="en-US"/>
         </w:rPr>
         <w:t xml:space="preserve"> </w:t>
       </w:r>
       <w:r>
         <w:rPr>
           <w:color w:val="auto"/>
-          <w:lang w:val="de-AT"/>
+          <w:lang w:val="en-US"/>
         </w:rPr>
         <w:t>09</w:t>
       </w:r>
       <w:r>
         <w:rPr>
           <w:color w:val="auto"/>
-          <w:lang w:val="de-AT"/>
+          <w:lang w:val="en-US"/>
         </w:rPr>
         <w:t>-1</w:t>
       </w:r>
       <w:r>
         <w:rPr>
           <w:color w:val="auto"/>
-          <w:lang w:val="de-AT"/>
+          <w:lang w:val="en-US"/>
         </w:rPr>
         <w:t>1</w:t>
       </w:r>
       <w:r>
         <w:rPr>
           <w:color w:val="auto"/>
-          <w:lang w:val="de-AT"/>
+          <w:lang w:val="en-US"/>
         </w:rPr>
         <w:t>, 202</w:t>
       </w:r>
       <w:r>
         <w:rPr>
           <w:color w:val="auto"/>
-          <w:lang w:val="de-AT"/>
+          <w:lang w:val="en-US"/>
         </w:rPr>
         <w:t>5</w:t>
       </w:r>
@@ -899,7 +902,7 @@
               <w:jc w:val="both"/>
             </w:pPr>
             <w:r>
-              <w:t>Prof. Stefan Naumann</w:t>
+              <w:t>Stefan Naumann</w:t>
             </w:r>
           </w:p>
         </w:tc>
@@ -945,7 +948,7 @@
               <w:jc w:val="both"/>
             </w:pPr>
             <w:r>
-              <w:t>Prof. Grit Behrens</w:t>
+              <w:t>Grit Behrens</w:t>
             </w:r>
           </w:p>
         </w:tc>
@@ -1089,30 +1092,44 @@
           <w:color w:val="EE0000"/>
           <w:lang w:val="en-GB"/>
         </w:rPr>
-        <w:t>Andreas Oberweis, KIT Karlsruhe</w:t>
-      </w:r>
+        <w:t xml:space="preserve">Andreas Oberweis, KIT </w:t>
+      </w:r>
+      <w:proofErr w:type="gramStart"/>
       <w:r>
         <w:rPr>
           <w:color w:val="EE0000"/>
           <w:lang w:val="en-GB"/>
         </w:rPr>
+        <w:t>Karlsruhe</w:t>
+      </w:r>
+      <w:r>
+        <w:rPr>
+          <w:color w:val="EE0000"/>
+          <w:lang w:val="en-GB"/>
+        </w:rPr>
         <w:t xml:space="preserve">, </w:t>
       </w:r>
-    </w:p>
-    <w:p>
-      <w:pPr>
-        <w:pStyle w:val="Textkrper-Einzug2"/>
+      <w:r>
         <w:rPr>
           <w:color w:val="EE0000"/>
           <w:lang w:val="en-GB"/>
         </w:rPr>
-      </w:pPr>
+        <w:t xml:space="preserve"> </w:t>
+      </w:r>
       <w:r>
         <w:rPr>
           <w:color w:val="EE0000"/>
           <w:lang w:val="en-GB"/>
         </w:rPr>
-        <w:t xml:space="preserve">(Chairman, </w:t>
+        <w:t>(</w:t>
+      </w:r>
+      <w:proofErr w:type="gramEnd"/>
+      <w:r>
+        <w:rPr>
+          <w:color w:val="EE0000"/>
+          <w:lang w:val="en-GB"/>
+        </w:rPr>
+        <w:t xml:space="preserve">Chairman, </w:t>
       </w:r>
       <w:r>
         <w:rPr>
@@ -1649,7 +1666,6 @@
           <w:iCs/>
           <w:lang w:val="en-GB"/>
         </w:rPr>
-        <w:lastRenderedPageBreak/>
         <w:t xml:space="preserve">This book is licensed under a </w:t>
       </w:r>
       <w:hyperlink r:id="rId10" w:history="1">
@@ -1680,6 +1696,7 @@
         <w:rPr>
           <w:lang w:val="en-US"/>
         </w:rPr>
+        <w:lastRenderedPageBreak/>
         <w:t>Preface</w:t>
       </w:r>
     </w:p>
@@ -2161,7 +2178,13 @@
         </w:tabs>
       </w:pPr>
       <w:r>
-        <w:t>We would like to thank the following companies for supporting the conference.</w:t>
+        <w:t xml:space="preserve">We </w:t>
+      </w:r>
+      <w:r>
+        <w:t>want</w:t>
+      </w:r>
+      <w:r>
+        <w:t xml:space="preserve"> to thank the following companies for supporting the conference.</w:t>
       </w:r>
     </w:p>
     <w:p>
@@ -2770,6 +2793,14 @@
                 <w14:ligatures w14:val="standardContextual"/>
               </w:rPr>
             </w:pPr>
+          </w:p>
+          <w:p>
+            <w:pPr>
+              <w:rPr>
+                <w:kern w:val="2"/>
+                <w14:ligatures w14:val="standardContextual"/>
+              </w:rPr>
+            </w:pPr>
             <w:r>
               <w:rPr>
                 <w:kern w:val="2"/>
@@ -2783,6 +2814,15 @@
           <w:tcPr>
             <w:tcW w:w="5245" w:type="dxa"/>
           </w:tcPr>
+          <w:p>
+            <w:pPr>
+              <w:ind w:left="-106"/>
+              <w:rPr>
+                <w:kern w:val="2"/>
+                <w14:ligatures w14:val="standardContextual"/>
+              </w:rPr>
+            </w:pPr>
+          </w:p>
           <w:p>
             <w:pPr>
               <w:ind w:left="-106"/>
@@ -2872,6 +2912,14 @@
                 <w14:ligatures w14:val="standardContextual"/>
               </w:rPr>
             </w:pPr>
+          </w:p>
+          <w:p>
+            <w:pPr>
+              <w:rPr>
+                <w:kern w:val="2"/>
+                <w14:ligatures w14:val="standardContextual"/>
+              </w:rPr>
+            </w:pPr>
             <w:r>
               <w:rPr>
                 <w:kern w:val="2"/>
@@ -2893,19 +2941,21 @@
                 <w14:ligatures w14:val="standardContextual"/>
               </w:rPr>
             </w:pPr>
-            <w:r>
+          </w:p>
+          <w:p>
+            <w:pPr>
+              <w:ind w:left="-106"/>
               <w:rPr>
                 <w:kern w:val="2"/>
                 <w14:ligatures w14:val="standardContextual"/>
               </w:rPr>
-              <w:t>University of Lodz</w:t>
-            </w:r>
+            </w:pPr>
             <w:r>
               <w:rPr>
                 <w:kern w:val="2"/>
                 <w14:ligatures w14:val="standardContextual"/>
               </w:rPr>
-              <w:t>, Lodz, Poland</w:t>
+              <w:t>University of Lodz, Lodz, Poland</w:t>
             </w:r>
           </w:p>
         </w:tc>
@@ -2933,7 +2983,6 @@
               <w:ind w:left="-106"/>
               <w:rPr>
                 <w:kern w:val="2"/>
-                <w:lang w:val="de-DE"/>
                 <w14:ligatures w14:val="standardContextual"/>
               </w:rPr>
             </w:pPr>
@@ -2948,7 +2997,6 @@
           <w:b/>
           <w:sz w:val="28"/>
           <w:szCs w:val="28"/>
-          <w:lang w:val="de-DE"/>
         </w:rPr>
       </w:pPr>
       <w:r>
@@ -2956,7 +3004,6 @@
           <w:b/>
           <w:sz w:val="28"/>
           <w:szCs w:val="28"/>
-          <w:lang w:val="de-DE"/>
         </w:rPr>
         <w:br w:type="page"/>
       </w:r>
@@ -2997,24 +3044,37 @@
         <w:tabs>
           <w:tab w:val="left" w:pos="142"/>
         </w:tabs>
-      </w:pPr>
-    </w:p>
-    <w:p>
+        <w:jc w:val="both"/>
+      </w:pPr>
+    </w:p>
+    <w:p>
+      <w:pPr>
+        <w:jc w:val="both"/>
+      </w:pPr>
       <w:r>
         <w:t>Achim Guldner, Trier University of Applied Sciences, Germany</w:t>
       </w:r>
     </w:p>
     <w:p>
+      <w:pPr>
+        <w:jc w:val="both"/>
+      </w:pPr>
       <w:r>
         <w:t>Amna Ramzy, German University in Cairo (GUC), Egypt</w:t>
       </w:r>
     </w:p>
     <w:p>
+      <w:pPr>
+        <w:jc w:val="both"/>
+      </w:pPr>
       <w:r>
         <w:t>Andi H. Widok, HTW Berlin, University of Applied Sciences, Berlin, Germany</w:t>
       </w:r>
     </w:p>
     <w:p>
+      <w:pPr>
+        <w:jc w:val="both"/>
+      </w:pPr>
       <w:r>
         <w:t xml:space="preserve">Andreas Abecker, </w:t>
       </w:r>
@@ -3036,11 +3096,17 @@
       </w:r>
     </w:p>
     <w:p>
+      <w:pPr>
+        <w:jc w:val="both"/>
+      </w:pPr>
       <w:r>
         <w:t>Andreas Winter, University of Oldenburg, Germany</w:t>
       </w:r>
     </w:p>
     <w:p>
+      <w:pPr>
+        <w:jc w:val="both"/>
+      </w:pPr>
       <w:r>
         <w:t xml:space="preserve">Anna Zagorski, </w:t>
       </w:r>
@@ -3054,11 +3120,17 @@
       </w:r>
     </w:p>
     <w:p>
+      <w:pPr>
+        <w:jc w:val="both"/>
+      </w:pPr>
       <w:r>
         <w:t>Barak Fishbain, Technion – Israel Institute of Technology, Israel</w:t>
       </w:r>
     </w:p>
     <w:p>
+      <w:pPr>
+        <w:jc w:val="both"/>
+      </w:pPr>
       <w:r>
         <w:t xml:space="preserve">Benjamin Wagner </w:t>
       </w:r>
@@ -3074,16 +3146,25 @@
       </w:r>
     </w:p>
     <w:p>
+      <w:pPr>
+        <w:jc w:val="both"/>
+      </w:pPr>
       <w:r>
         <w:t>Benno Schmidt, Bochum University of Applied Sciences, Germany</w:t>
       </w:r>
     </w:p>
     <w:p>
+      <w:pPr>
+        <w:jc w:val="both"/>
+      </w:pPr>
       <w:r>
         <w:t>Benoît Otjacques, Luxembourg Institute of Science and Technology (LIST), Luxembourg</w:t>
       </w:r>
     </w:p>
     <w:p>
+      <w:pPr>
+        <w:jc w:val="both"/>
+      </w:pPr>
       <w:r>
         <w:t xml:space="preserve">Denis Havlik, Austrian </w:t>
       </w:r>
@@ -3095,16 +3176,25 @@
       </w:r>
     </w:p>
     <w:p>
+      <w:pPr>
+        <w:jc w:val="both"/>
+      </w:pPr>
       <w:r>
         <w:t>Dennis Junger, HTW Berlin, University of Applied Sciences, Berlin, Germany</w:t>
       </w:r>
     </w:p>
     <w:p>
+      <w:pPr>
+        <w:jc w:val="both"/>
+      </w:pPr>
       <w:r>
         <w:t>Dieter Kranzlmüller, Leibniz Supercomputing Centre (LRZ) of the Bavarian Academy of Sciences and Humanities, Germany</w:t>
       </w:r>
     </w:p>
     <w:p>
+      <w:pPr>
+        <w:jc w:val="both"/>
+      </w:pPr>
       <w:r>
         <w:t>Frank Fuchs-</w:t>
       </w:r>
@@ -3119,6 +3209,7 @@
     </w:p>
     <w:p>
       <w:pPr>
+        <w:jc w:val="both"/>
         <w:rPr>
           <w:lang w:val="de-DE"/>
         </w:rPr>
@@ -3146,6 +3237,7 @@
     </w:p>
     <w:p>
       <w:pPr>
+        <w:jc w:val="both"/>
         <w:rPr>
           <w:lang w:val="de-DE"/>
         </w:rPr>
@@ -3159,55 +3251,48 @@
     </w:p>
     <w:p>
       <w:pPr>
-        <w:rPr>
-          <w:lang w:val="de-DE"/>
-        </w:rPr>
-      </w:pPr>
-      <w:r>
-        <w:rPr>
-          <w:lang w:val="de-DE"/>
-        </w:rPr>
+        <w:jc w:val="both"/>
+      </w:pPr>
+      <w:r>
         <w:t>Heiko Thimm, Hochschule Pforzheim, Germany</w:t>
       </w:r>
     </w:p>
     <w:p>
       <w:pPr>
-        <w:rPr>
-          <w:lang w:val="de-DE"/>
-        </w:rPr>
-      </w:pPr>
-      <w:r>
-        <w:rPr>
-          <w:lang w:val="de-DE"/>
-        </w:rPr>
+        <w:jc w:val="both"/>
+      </w:pPr>
+      <w:r>
         <w:t xml:space="preserve">Horst Kremers, Horst Kremers UNDRR SEM - RIMMA </w:t>
       </w:r>
       <w:proofErr w:type="spellStart"/>
       <w:r>
-        <w:rPr>
-          <w:lang w:val="de-DE"/>
-        </w:rPr>
         <w:t>CoE</w:t>
       </w:r>
       <w:proofErr w:type="spellEnd"/>
       <w:r>
-        <w:rPr>
-          <w:lang w:val="de-DE"/>
-        </w:rPr>
         <w:t xml:space="preserve"> Community, Germany</w:t>
       </w:r>
     </w:p>
     <w:p>
+      <w:pPr>
+        <w:jc w:val="both"/>
+      </w:pPr>
       <w:r>
         <w:t>Jochen Wittmann, HTW Berlin, University of Applied Sciences, Berlin, Germany</w:t>
       </w:r>
     </w:p>
     <w:p>
+      <w:pPr>
+        <w:jc w:val="both"/>
+      </w:pPr>
       <w:r>
         <w:t>Jorge Marx Gomez, Carl von Ossietzky University of Oldenburg - Department of Computing Science, Germany</w:t>
       </w:r>
     </w:p>
     <w:p>
+      <w:pPr>
+        <w:jc w:val="both"/>
+      </w:pPr>
       <w:r>
         <w:t xml:space="preserve">Karol Mrozik, </w:t>
       </w:r>
@@ -3221,16 +3306,25 @@
       </w:r>
     </w:p>
     <w:p>
+      <w:pPr>
+        <w:jc w:val="both"/>
+      </w:pPr>
       <w:r>
         <w:t>Klaus Greve, University of Bonn, Germany</w:t>
       </w:r>
     </w:p>
     <w:p>
+      <w:pPr>
+        <w:jc w:val="both"/>
+      </w:pPr>
       <w:r>
         <w:t>Kostas Karatzas, Aristotle University of Thessaloniki, Greece</w:t>
       </w:r>
     </w:p>
     <w:p>
+      <w:pPr>
+        <w:jc w:val="both"/>
+      </w:pPr>
       <w:r>
         <w:t xml:space="preserve">Margaret M. </w:t>
       </w:r>
@@ -3244,11 +3338,17 @@
       </w:r>
     </w:p>
     <w:p>
+      <w:pPr>
+        <w:jc w:val="both"/>
+      </w:pPr>
       <w:r>
         <w:t>Martina Willenbacher, HTW Berlin, University of Applied Sciences, Berlin, Germany</w:t>
       </w:r>
     </w:p>
     <w:p>
+      <w:pPr>
+        <w:jc w:val="both"/>
+      </w:pPr>
       <w:r>
         <w:t xml:space="preserve">Maximilian </w:t>
       </w:r>
@@ -3262,26 +3362,41 @@
       </w:r>
     </w:p>
     <w:p>
+      <w:pPr>
+        <w:jc w:val="both"/>
+      </w:pPr>
       <w:r>
         <w:t>Patricia Lago, Vrije Universiteit Amsterdam (VU), The Netherlands</w:t>
       </w:r>
     </w:p>
     <w:p>
+      <w:pPr>
+        <w:jc w:val="both"/>
+      </w:pPr>
       <w:r>
         <w:t>Pawel Bartoszczuk, SGH Warsaw School of Economics, Poland</w:t>
       </w:r>
     </w:p>
     <w:p>
+      <w:pPr>
+        <w:jc w:val="both"/>
+      </w:pPr>
       <w:r>
         <w:t>Ralf Klischewski, German University in Cairo (GUC), Egypt, Germany</w:t>
       </w:r>
     </w:p>
     <w:p>
+      <w:pPr>
+        <w:jc w:val="both"/>
+      </w:pPr>
       <w:r>
         <w:t>Rüdiger Schaldach, University of Kassel - Center for Environmental Systems Research, Germany</w:t>
       </w:r>
     </w:p>
     <w:p>
+      <w:pPr>
+        <w:jc w:val="both"/>
+      </w:pPr>
       <w:r>
         <w:t xml:space="preserve">Stanisław Czaja, </w:t>
       </w:r>
@@ -3295,11 +3410,17 @@
       </w:r>
     </w:p>
     <w:p>
+      <w:pPr>
+        <w:jc w:val="both"/>
+      </w:pPr>
       <w:r>
         <w:t>Stefan Naumann, Trier University of Applied Sciences, Germany</w:t>
       </w:r>
     </w:p>
     <w:p>
+      <w:pPr>
+        <w:jc w:val="both"/>
+      </w:pPr>
       <w:r>
         <w:t>Thomas Rose, RWTH Aachen University - Media Informatics / Media Processes, Germany</w:t>
       </w:r>
@@ -3396,60 +3517,6 @@
                 <w:szCs w:val="24"/>
                 <w:lang w:val="de-DE"/>
               </w:rPr>
-              <w:t>Anna Zagorski</w:t>
-            </w:r>
-          </w:p>
-        </w:tc>
-        <w:tc>
-          <w:tcPr>
-            <w:tcW w:w="5256" w:type="dxa"/>
-            <w:vAlign w:val="center"/>
-          </w:tcPr>
-          <w:p>
-            <w:pPr>
-              <w:rPr>
-                <w:b/>
-                <w:bCs/>
-                <w:color w:val="EE0000"/>
-                <w:sz w:val="24"/>
-                <w:szCs w:val="24"/>
-              </w:rPr>
-            </w:pPr>
-            <w:r>
-              <w:rPr>
-                <w:color w:val="EE0000"/>
-                <w:szCs w:val="24"/>
-                <w:lang w:val="de-DE"/>
-              </w:rPr>
-              <w:t>German Environment Agency (Umweltbundesamt), Germany</w:t>
-            </w:r>
-          </w:p>
-        </w:tc>
-      </w:tr>
-      <w:tr>
-        <w:trPr>
-          <w:trHeight w:val="460"/>
-          <w:tblCellSpacing w:w="15" w:type="dxa"/>
-        </w:trPr>
-        <w:tc>
-          <w:tcPr>
-            <w:tcW w:w="1798" w:type="dxa"/>
-            <w:vAlign w:val="center"/>
-          </w:tcPr>
-          <w:p>
-            <w:pPr>
-              <w:rPr>
-                <w:color w:val="EE0000"/>
-                <w:szCs w:val="24"/>
-                <w:lang w:val="de-DE"/>
-              </w:rPr>
-            </w:pPr>
-            <w:r>
-              <w:rPr>
-                <w:color w:val="EE0000"/>
-                <w:szCs w:val="24"/>
-                <w:lang w:val="de-DE"/>
-              </w:rPr>
               <w:t>Dennis Junger</w:t>
             </w:r>
           </w:p>
@@ -3462,7 +3529,10 @@
           <w:p>
             <w:pPr>
               <w:rPr>
+                <w:b/>
+                <w:bCs/>
                 <w:color w:val="EE0000"/>
+                <w:sz w:val="24"/>
                 <w:szCs w:val="24"/>
               </w:rPr>
             </w:pPr>
@@ -3528,7 +3598,7 @@
       </w:tr>
       <w:tr>
         <w:trPr>
-          <w:trHeight w:val="398"/>
+          <w:trHeight w:val="460"/>
           <w:tblCellSpacing w:w="15" w:type="dxa"/>
         </w:trPr>
         <w:tc>
@@ -3586,7 +3656,7 @@
       </w:tr>
       <w:tr>
         <w:trPr>
-          <w:trHeight w:val="460"/>
+          <w:trHeight w:val="398"/>
           <w:tblCellSpacing w:w="15" w:type="dxa"/>
         </w:trPr>
         <w:tc>
@@ -3739,6 +3809,40 @@
               </w:rPr>
               <w:t>HTW Berlin, University of Applied Sciences, Berlin, Germany</w:t>
             </w:r>
+          </w:p>
+        </w:tc>
+      </w:tr>
+      <w:tr>
+        <w:trPr>
+          <w:trHeight w:val="460"/>
+          <w:tblCellSpacing w:w="15" w:type="dxa"/>
+        </w:trPr>
+        <w:tc>
+          <w:tcPr>
+            <w:tcW w:w="1798" w:type="dxa"/>
+            <w:vAlign w:val="center"/>
+          </w:tcPr>
+          <w:p>
+            <w:pPr>
+              <w:rPr>
+                <w:color w:val="EE0000"/>
+                <w:szCs w:val="24"/>
+              </w:rPr>
+            </w:pPr>
+          </w:p>
+        </w:tc>
+        <w:tc>
+          <w:tcPr>
+            <w:tcW w:w="5256" w:type="dxa"/>
+            <w:vAlign w:val="center"/>
+          </w:tcPr>
+          <w:p>
+            <w:pPr>
+              <w:rPr>
+                <w:color w:val="EE0000"/>
+                <w:szCs w:val="24"/>
+              </w:rPr>
+            </w:pPr>
           </w:p>
         </w:tc>
       </w:tr>

</xml_diff>

<commit_message>
Neue Paper-PDFs aus short/ sortiert und proceedings neu gebaut
- papers/A1-2 bis A5-3: aktualisierte paper.pdf aus short/
- #zusaetzliche_daten/short/: neue Einreichungen hinzugefuegt
- proceedings.pdf: 175 Seiten neu kompiliert

Co-Authored-By: Claude Sonnet 4.6 <noreply@anthropic.com>
</commit_message>
<xml_diff>
--- a/LNI-Startseiten.docx
+++ b/LNI-Startseiten.docx
@@ -570,19 +570,21 @@
           <w:lang w:val="de-AT"/>
         </w:rPr>
       </w:pPr>
+      <w:proofErr w:type="spellStart"/>
       <w:r>
         <w:rPr>
           <w:color w:val="auto"/>
           <w:lang w:val="de-AT"/>
         </w:rPr>
-        <w:t>Lodz</w:t>
-      </w:r>
+        <w:t>Łódź</w:t>
+      </w:r>
+      <w:proofErr w:type="spellEnd"/>
       <w:r>
         <w:rPr>
           <w:color w:val="auto"/>
           <w:lang w:val="de-AT"/>
         </w:rPr>
-        <w:t xml:space="preserve"> - </w:t>
+        <w:t xml:space="preserve">- </w:t>
       </w:r>
       <w:r>
         <w:rPr>
@@ -832,13 +834,13 @@
         <w:tblLook w:val="04A0" w:firstRow="1" w:lastRow="0" w:firstColumn="1" w:lastColumn="0" w:noHBand="0" w:noVBand="1"/>
       </w:tblPr>
       <w:tblGrid>
-        <w:gridCol w:w="2410"/>
-        <w:gridCol w:w="4678"/>
+        <w:gridCol w:w="2268"/>
+        <w:gridCol w:w="4820"/>
       </w:tblGrid>
       <w:tr>
         <w:tc>
           <w:tcPr>
-            <w:tcW w:w="2410" w:type="dxa"/>
+            <w:tcW w:w="2268" w:type="dxa"/>
           </w:tcPr>
           <w:p>
             <w:pPr>
@@ -849,13 +851,17 @@
             </w:pPr>
             <w:bookmarkStart w:id="0" w:name="_Hlk187770951"/>
             <w:r>
+              <w:rPr>
+                <w:kern w:val="2"/>
+                <w14:ligatures w14:val="standardContextual"/>
+              </w:rPr>
               <w:t>Volker Wohlgemuth</w:t>
             </w:r>
           </w:p>
         </w:tc>
         <w:tc>
           <w:tcPr>
-            <w:tcW w:w="4678" w:type="dxa"/>
+            <w:tcW w:w="4820" w:type="dxa"/>
           </w:tcPr>
           <w:p>
             <w:pPr>
@@ -870,21 +876,7 @@
                 <w:kern w:val="2"/>
                 <w14:ligatures w14:val="standardContextual"/>
               </w:rPr>
-              <w:t>HTW Berlin, University of Applied Sciences, Berlin,</w:t>
-            </w:r>
-            <w:r>
-              <w:rPr>
-                <w:kern w:val="2"/>
-                <w14:ligatures w14:val="standardContextual"/>
-              </w:rPr>
-              <w:t xml:space="preserve"> </w:t>
-            </w:r>
-            <w:r>
-              <w:rPr>
-                <w:kern w:val="2"/>
-                <w14:ligatures w14:val="standardContextual"/>
-              </w:rPr>
-              <w:t>Germany</w:t>
+              <w:t>HTW Berlin – University of Applied Sciences, Berlin, Germany</w:t>
             </w:r>
           </w:p>
         </w:tc>
@@ -892,7 +884,76 @@
       <w:tr>
         <w:tc>
           <w:tcPr>
-            <w:tcW w:w="2410" w:type="dxa"/>
+            <w:tcW w:w="2268" w:type="dxa"/>
+          </w:tcPr>
+          <w:p>
+            <w:pPr>
+              <w:rPr>
+                <w:kern w:val="2"/>
+                <w14:ligatures w14:val="standardContextual"/>
+              </w:rPr>
+            </w:pPr>
+          </w:p>
+          <w:p>
+            <w:pPr>
+              <w:tabs>
+                <w:tab w:val="left" w:pos="142"/>
+              </w:tabs>
+              <w:jc w:val="both"/>
+            </w:pPr>
+            <w:r>
+              <w:rPr>
+                <w:kern w:val="2"/>
+                <w14:ligatures w14:val="standardContextual"/>
+              </w:rPr>
+              <w:t>Stefan Naumann</w:t>
+            </w:r>
+          </w:p>
+        </w:tc>
+        <w:tc>
+          <w:tcPr>
+            <w:tcW w:w="4820" w:type="dxa"/>
+          </w:tcPr>
+          <w:p>
+            <w:pPr>
+              <w:ind w:left="-106"/>
+              <w:rPr>
+                <w:kern w:val="2"/>
+                <w14:ligatures w14:val="standardContextual"/>
+              </w:rPr>
+            </w:pPr>
+          </w:p>
+          <w:p>
+            <w:pPr>
+              <w:ind w:left="-106"/>
+              <w:rPr>
+                <w:kern w:val="2"/>
+                <w14:ligatures w14:val="standardContextual"/>
+              </w:rPr>
+            </w:pPr>
+            <w:r>
+              <w:rPr>
+                <w:kern w:val="2"/>
+                <w14:ligatures w14:val="standardContextual"/>
+              </w:rPr>
+              <w:t>Trier University of Applied Sciences, Trier, Germany</w:t>
+            </w:r>
+          </w:p>
+          <w:p>
+            <w:pPr>
+              <w:ind w:left="-106"/>
+              <w:rPr>
+                <w:kern w:val="2"/>
+                <w14:ligatures w14:val="standardContextual"/>
+              </w:rPr>
+            </w:pPr>
+          </w:p>
+        </w:tc>
+      </w:tr>
+      <w:tr>
+        <w:tc>
+          <w:tcPr>
+            <w:tcW w:w="2268" w:type="dxa"/>
           </w:tcPr>
           <w:p>
             <w:pPr>
@@ -902,59 +963,17 @@
               <w:jc w:val="both"/>
             </w:pPr>
             <w:r>
-              <w:t>Stefan Naumann</w:t>
-            </w:r>
-          </w:p>
-        </w:tc>
-        <w:tc>
-          <w:tcPr>
-            <w:tcW w:w="4678" w:type="dxa"/>
-          </w:tcPr>
-          <w:p>
-            <w:pPr>
-              <w:ind w:left="-106"/>
-            </w:pPr>
-            <w:r>
-              <w:t xml:space="preserve">Trier University of Applied Sciences, </w:t>
-            </w:r>
-            <w:r>
-              <w:t xml:space="preserve">Trier, </w:t>
-            </w:r>
-            <w:r>
-              <w:t>Germany</w:t>
-            </w:r>
-          </w:p>
-          <w:p>
-            <w:pPr>
-              <w:ind w:left="-106"/>
               <w:rPr>
                 <w:kern w:val="2"/>
                 <w14:ligatures w14:val="standardContextual"/>
               </w:rPr>
-            </w:pPr>
-          </w:p>
-        </w:tc>
-      </w:tr>
-      <w:tr>
-        <w:tc>
-          <w:tcPr>
-            <w:tcW w:w="2410" w:type="dxa"/>
-          </w:tcPr>
-          <w:p>
-            <w:pPr>
-              <w:tabs>
-                <w:tab w:val="left" w:pos="142"/>
-              </w:tabs>
-              <w:jc w:val="both"/>
-            </w:pPr>
-            <w:r>
               <w:t>Grit Behrens</w:t>
             </w:r>
           </w:p>
         </w:tc>
         <w:tc>
           <w:tcPr>
-            <w:tcW w:w="4678" w:type="dxa"/>
+            <w:tcW w:w="4820" w:type="dxa"/>
           </w:tcPr>
           <w:p>
             <w:pPr>
@@ -969,14 +988,21 @@
                 <w:kern w:val="2"/>
                 <w14:ligatures w14:val="standardContextual"/>
               </w:rPr>
-              <w:t xml:space="preserve">University of Applied Sciences Bielefeld, </w:t>
+              <w:t>University of Applied Sciences Bielefeld,</w:t>
             </w:r>
             <w:r>
               <w:rPr>
                 <w:kern w:val="2"/>
                 <w14:ligatures w14:val="standardContextual"/>
               </w:rPr>
-              <w:t>Bielefeld,</w:t>
+              <w:t xml:space="preserve"> Minden,</w:t>
+            </w:r>
+            <w:r>
+              <w:rPr>
+                <w:kern w:val="2"/>
+                <w14:ligatures w14:val="standardContextual"/>
+              </w:rPr>
+              <w:t xml:space="preserve"> </w:t>
             </w:r>
           </w:p>
           <w:p>
@@ -1000,18 +1026,15 @@
       <w:tr>
         <w:tc>
           <w:tcPr>
-            <w:tcW w:w="2410" w:type="dxa"/>
+            <w:tcW w:w="2268" w:type="dxa"/>
           </w:tcPr>
           <w:p>
             <w:pPr>
-              <w:tabs>
-                <w:tab w:val="left" w:pos="142"/>
-              </w:tabs>
-              <w:jc w:val="both"/>
+              <w:rPr>
+                <w:kern w:val="2"/>
+                <w14:ligatures w14:val="standardContextual"/>
+              </w:rPr>
             </w:pPr>
-            <w:r>
-              <w:t>Malgorzata Burchard-</w:t>
-            </w:r>
           </w:p>
           <w:p>
             <w:pPr>
@@ -1024,18 +1047,40 @@
               </w:rPr>
             </w:pPr>
             <w:r>
-              <w:t xml:space="preserve">Dziubinska </w:t>
+              <w:rPr>
+                <w:kern w:val="2"/>
+                <w14:ligatures w14:val="standardContextual"/>
+              </w:rPr>
+              <w:t>Małgorzata Burchard-</w:t>
             </w:r>
+            <w:proofErr w:type="spellStart"/>
+            <w:r>
+              <w:rPr>
+                <w:kern w:val="2"/>
+                <w14:ligatures w14:val="standardContextual"/>
+              </w:rPr>
+              <w:t>Dziubińska</w:t>
+            </w:r>
+            <w:proofErr w:type="spellEnd"/>
           </w:p>
         </w:tc>
         <w:tc>
           <w:tcPr>
-            <w:tcW w:w="4678" w:type="dxa"/>
+            <w:tcW w:w="4820" w:type="dxa"/>
           </w:tcPr>
           <w:p>
             <w:pPr>
               <w:ind w:left="-106"/>
               <w:rPr>
+                <w:kern w:val="2"/>
+                <w14:ligatures w14:val="standardContextual"/>
+              </w:rPr>
+            </w:pPr>
+          </w:p>
+          <w:p>
+            <w:pPr>
+              <w:ind w:left="-106"/>
+              <w:rPr>
                 <w:color w:val="EE0000"/>
                 <w:kern w:val="2"/>
                 <w14:ligatures w14:val="standardContextual"/>
@@ -1046,7 +1091,53 @@
                 <w:kern w:val="2"/>
                 <w14:ligatures w14:val="standardContextual"/>
               </w:rPr>
-              <w:t>University of Lodz, Lodz, Poland</w:t>
+              <w:t xml:space="preserve">University of </w:t>
+            </w:r>
+            <w:proofErr w:type="spellStart"/>
+            <w:r>
+              <w:rPr>
+                <w:kern w:val="2"/>
+                <w14:ligatures w14:val="standardContextual"/>
+              </w:rPr>
+              <w:t>Łódź</w:t>
+            </w:r>
+            <w:proofErr w:type="spellEnd"/>
+            <w:r>
+              <w:rPr>
+                <w:kern w:val="2"/>
+                <w14:ligatures w14:val="standardContextual"/>
+              </w:rPr>
+              <w:t>,</w:t>
+            </w:r>
+            <w:r>
+              <w:rPr>
+                <w:kern w:val="2"/>
+                <w14:ligatures w14:val="standardContextual"/>
+              </w:rPr>
+              <w:t xml:space="preserve"> </w:t>
+            </w:r>
+            <w:proofErr w:type="spellStart"/>
+            <w:r>
+              <w:rPr>
+                <w:kern w:val="2"/>
+                <w14:ligatures w14:val="standardContextual"/>
+              </w:rPr>
+              <w:t>Łódź</w:t>
+            </w:r>
+            <w:proofErr w:type="spellEnd"/>
+            <w:r>
+              <w:rPr>
+                <w:kern w:val="2"/>
+                <w14:ligatures w14:val="standardContextual"/>
+              </w:rPr>
+              <w:t>,</w:t>
+            </w:r>
+            <w:r>
+              <w:rPr>
+                <w:kern w:val="2"/>
+                <w14:ligatures w14:val="standardContextual"/>
+              </w:rPr>
+              <w:t xml:space="preserve"> Poland</w:t>
             </w:r>
           </w:p>
         </w:tc>
@@ -1057,9 +1148,6 @@
       <w:pPr>
         <w:pStyle w:val="berschrift4"/>
         <w:ind w:left="0" w:firstLine="0"/>
-        <w:rPr>
-          <w:color w:val="EE0000"/>
-        </w:rPr>
       </w:pPr>
     </w:p>
     <w:p>
@@ -1067,14 +1155,12 @@
         <w:pStyle w:val="berschrift4"/>
         <w:ind w:left="0" w:firstLine="0"/>
         <w:rPr>
-          <w:color w:val="EE0000"/>
-          <w:lang w:val="en-GB"/>
-        </w:rPr>
-      </w:pPr>
-      <w:r>
-        <w:rPr>
-          <w:color w:val="EE0000"/>
-          <w:lang w:val="en-GB"/>
+          <w:lang w:val="de-DE"/>
+        </w:rPr>
+      </w:pPr>
+      <w:r>
+        <w:rPr>
+          <w:lang w:val="de-DE"/>
         </w:rPr>
         <w:t>Series Editorial Board</w:t>
       </w:r>
@@ -1083,65 +1169,42 @@
       <w:pPr>
         <w:pStyle w:val="Textkrper-Einzug2"/>
         <w:rPr>
-          <w:color w:val="EE0000"/>
-          <w:lang w:val="en-GB"/>
-        </w:rPr>
-      </w:pPr>
-      <w:r>
-        <w:rPr>
-          <w:color w:val="EE0000"/>
-          <w:lang w:val="en-GB"/>
-        </w:rPr>
-        <w:t xml:space="preserve">Andreas Oberweis, KIT </w:t>
-      </w:r>
-      <w:proofErr w:type="gramStart"/>
-      <w:r>
-        <w:rPr>
-          <w:color w:val="EE0000"/>
-          <w:lang w:val="en-GB"/>
-        </w:rPr>
-        <w:t>Karlsruhe</w:t>
-      </w:r>
-      <w:r>
-        <w:rPr>
-          <w:color w:val="EE0000"/>
-          <w:lang w:val="en-GB"/>
+          <w:lang w:val="de-DE"/>
+        </w:rPr>
+      </w:pPr>
+      <w:r>
+        <w:rPr>
+          <w:lang w:val="de-DE"/>
+        </w:rPr>
+        <w:t>Andreas Oberweis, KIT Karlsruhe</w:t>
+      </w:r>
+      <w:r>
+        <w:rPr>
+          <w:lang w:val="de-DE"/>
         </w:rPr>
         <w:t xml:space="preserve">, </w:t>
       </w:r>
       <w:r>
         <w:rPr>
-          <w:color w:val="EE0000"/>
-          <w:lang w:val="en-GB"/>
+          <w:lang w:val="de-DE"/>
         </w:rPr>
         <w:t xml:space="preserve"> </w:t>
       </w:r>
       <w:r>
         <w:rPr>
-          <w:color w:val="EE0000"/>
-          <w:lang w:val="en-GB"/>
-        </w:rPr>
-        <w:t>(</w:t>
-      </w:r>
-      <w:proofErr w:type="gramEnd"/>
-      <w:r>
-        <w:rPr>
-          <w:color w:val="EE0000"/>
-          <w:lang w:val="en-GB"/>
-        </w:rPr>
-        <w:t xml:space="preserve">Chairman, </w:t>
-      </w:r>
-      <w:r>
-        <w:rPr>
-          <w:color w:val="EE0000"/>
-          <w:lang w:val="en-GB"/>
+          <w:lang w:val="de-DE"/>
+        </w:rPr>
+        <w:t xml:space="preserve">(Chairman, </w:t>
+      </w:r>
+      <w:r>
+        <w:rPr>
+          <w:lang w:val="de-DE"/>
         </w:rPr>
         <w:t>andreas.oberweis@kit.edu</w:t>
       </w:r>
       <w:r>
         <w:rPr>
-          <w:color w:val="EE0000"/>
-          <w:lang w:val="en-GB"/>
+          <w:lang w:val="de-DE"/>
         </w:rPr>
         <w:t>)</w:t>
       </w:r>
@@ -1153,13 +1216,11 @@
         </w:tabs>
         <w:jc w:val="both"/>
         <w:rPr>
-          <w:color w:val="EE0000"/>
           <w:lang w:val="de-DE"/>
         </w:rPr>
       </w:pPr>
       <w:r>
         <w:rPr>
-          <w:color w:val="EE0000"/>
           <w:lang w:val="de-DE"/>
         </w:rPr>
         <w:t>Torsten Brinda, Universität Duisburg-Essen, Germany</w:t>
@@ -1173,13 +1234,11 @@
         <w:ind w:left="993" w:hanging="993"/>
         <w:jc w:val="both"/>
         <w:rPr>
-          <w:color w:val="EE0000"/>
           <w:lang w:val="de-DE"/>
         </w:rPr>
       </w:pPr>
       <w:r>
         <w:rPr>
-          <w:color w:val="EE0000"/>
           <w:lang w:val="de-DE"/>
         </w:rPr>
         <w:t>Dieter Fellner, Technische Universität Darmstadt, Germany</w:t>
@@ -1193,13 +1252,11 @@
         <w:ind w:left="993" w:hanging="993"/>
         <w:jc w:val="both"/>
         <w:rPr>
-          <w:color w:val="EE0000"/>
           <w:lang w:val="de-DE"/>
         </w:rPr>
       </w:pPr>
       <w:r>
         <w:rPr>
-          <w:color w:val="EE0000"/>
           <w:lang w:val="de-DE"/>
         </w:rPr>
         <w:t>Ulrich Frank, Universität Duisburg-Essen, Germany</w:t>
@@ -1213,13 +1270,11 @@
         <w:ind w:left="993" w:hanging="993"/>
         <w:jc w:val="both"/>
         <w:rPr>
-          <w:color w:val="EE0000"/>
           <w:lang w:val="de-DE"/>
         </w:rPr>
       </w:pPr>
       <w:r>
         <w:rPr>
-          <w:color w:val="EE0000"/>
           <w:lang w:val="de-DE"/>
         </w:rPr>
         <w:t>Barbara Hammer, Universität Bielefeld, Germany</w:t>
@@ -1233,20 +1288,17 @@
         <w:ind w:left="993" w:hanging="993"/>
         <w:jc w:val="both"/>
         <w:rPr>
-          <w:color w:val="EE0000"/>
           <w:lang w:val="de-DE"/>
         </w:rPr>
       </w:pPr>
       <w:r>
         <w:rPr>
-          <w:color w:val="EE0000"/>
           <w:lang w:val="de-DE"/>
         </w:rPr>
         <w:t xml:space="preserve">Falk Schreiber, Universität Konstanz, </w:t>
       </w:r>
       <w:r>
         <w:rPr>
-          <w:color w:val="EE0000"/>
           <w:lang w:val="de-DE"/>
         </w:rPr>
         <w:t>Germany</w:t>
@@ -1260,13 +1312,11 @@
         <w:ind w:left="993" w:hanging="993"/>
         <w:jc w:val="both"/>
         <w:rPr>
-          <w:color w:val="EE0000"/>
           <w:lang w:val="de-DE"/>
         </w:rPr>
       </w:pPr>
       <w:r>
         <w:rPr>
-          <w:color w:val="EE0000"/>
           <w:lang w:val="de-DE"/>
         </w:rPr>
         <w:t>Wolfgang Karl, KIT Karlsruhe, Germany</w:t>
@@ -1280,13 +1330,11 @@
         <w:ind w:left="993" w:hanging="993"/>
         <w:jc w:val="both"/>
         <w:rPr>
-          <w:color w:val="EE0000"/>
           <w:lang w:val="de-DE"/>
         </w:rPr>
       </w:pPr>
       <w:r>
         <w:rPr>
-          <w:color w:val="EE0000"/>
           <w:lang w:val="de-DE"/>
         </w:rPr>
         <w:t>Michael Koch, Universität der Bundeswehr München, Germany</w:t>
@@ -1300,13 +1348,11 @@
         <w:ind w:left="993" w:hanging="993"/>
         <w:jc w:val="both"/>
         <w:rPr>
-          <w:color w:val="EE0000"/>
           <w:lang w:val="de-DE"/>
         </w:rPr>
       </w:pPr>
       <w:r>
         <w:rPr>
-          <w:color w:val="EE0000"/>
           <w:lang w:val="de-DE"/>
         </w:rPr>
         <w:t>Heiko Roßnagel, Fraunhofer IAO Stuttgart, Germany</w:t>
@@ -1320,13 +1366,11 @@
         <w:ind w:left="993" w:hanging="993"/>
         <w:jc w:val="both"/>
         <w:rPr>
-          <w:color w:val="EE0000"/>
           <w:lang w:val="de-DE"/>
         </w:rPr>
       </w:pPr>
       <w:r>
         <w:rPr>
-          <w:color w:val="EE0000"/>
           <w:lang w:val="de-DE"/>
         </w:rPr>
         <w:t>Kurt Schneider, Universität Hannover, Germany</w:t>
@@ -1339,13 +1383,11 @@
         </w:tabs>
         <w:jc w:val="both"/>
         <w:rPr>
-          <w:color w:val="EE0000"/>
           <w:lang w:val="de-DE"/>
         </w:rPr>
       </w:pPr>
       <w:r>
         <w:rPr>
-          <w:color w:val="EE0000"/>
           <w:lang w:val="de-DE"/>
         </w:rPr>
         <w:t>Andreas Thor, HFT Leipzig, Germany</w:t>
@@ -1358,13 +1400,11 @@
         </w:tabs>
         <w:jc w:val="both"/>
         <w:rPr>
-          <w:color w:val="EE0000"/>
           <w:lang w:val="de-DE"/>
         </w:rPr>
       </w:pPr>
       <w:r>
         <w:rPr>
-          <w:color w:val="EE0000"/>
           <w:lang w:val="de-DE"/>
         </w:rPr>
         <w:t>Ingo Timm, Universität Trier, Germany</w:t>
@@ -1377,13 +1417,11 @@
         </w:tabs>
         <w:jc w:val="both"/>
         <w:rPr>
-          <w:color w:val="EE0000"/>
           <w:lang w:val="de-DE"/>
         </w:rPr>
       </w:pPr>
       <w:r>
         <w:rPr>
-          <w:color w:val="EE0000"/>
           <w:lang w:val="de-DE"/>
         </w:rPr>
         <w:t>Karin Vosseberg, Hochschule Bremerhaven, Germany</w:t>
@@ -1397,13 +1435,11 @@
         <w:ind w:left="993" w:hanging="993"/>
         <w:jc w:val="both"/>
         <w:rPr>
-          <w:color w:val="EE0000"/>
           <w:lang w:val="de-DE"/>
         </w:rPr>
       </w:pPr>
       <w:r>
         <w:rPr>
-          <w:color w:val="EE0000"/>
           <w:lang w:val="de-DE"/>
         </w:rPr>
         <w:t>Maria Wimmer, Universität Koblenz-Landau, Germany</w:t>
@@ -1699,468 +1735,1169 @@
         <w:lastRenderedPageBreak/>
         <w:t>Preface</w:t>
       </w:r>
-    </w:p>
-    <w:p>
-      <w:pPr>
-        <w:pStyle w:val="Volume-Text"/>
-        <w:rPr>
+      <w:r>
+        <w:rPr>
+          <w:lang w:val="en-US"/>
+        </w:rPr>
+        <w:t xml:space="preserve"> 1</w:t>
+      </w:r>
+    </w:p>
+    <w:p>
+      <w:pPr>
+        <w:pStyle w:val="Zwischenberschriften"/>
+        <w:rPr>
+          <w:color w:val="385623" w:themeColor="accent6" w:themeShade="80"/>
+          <w:lang w:val="en-US"/>
+        </w:rPr>
+      </w:pPr>
+    </w:p>
+    <w:p>
+      <w:pPr>
+        <w:pStyle w:val="Zwischenberschriften"/>
+        <w:rPr>
+          <w:b w:val="0"/>
+          <w:color w:val="385623" w:themeColor="accent6" w:themeShade="80"/>
+          <w:sz w:val="20"/>
+          <w:szCs w:val="20"/>
+          <w:lang w:val="en-US"/>
+        </w:rPr>
+      </w:pPr>
+      <w:r>
+        <w:rPr>
+          <w:b w:val="0"/>
+          <w:color w:val="385623" w:themeColor="accent6" w:themeShade="80"/>
+          <w:sz w:val="20"/>
+          <w:szCs w:val="20"/>
+          <w:lang w:val="en-US"/>
+        </w:rPr>
+        <w:t xml:space="preserve">This book contains the short and work-in-progress contributions of the 40th International and Interdisciplinary Conference on Environmental Informatics – </w:t>
+      </w:r>
+      <w:proofErr w:type="spellStart"/>
+      <w:r>
+        <w:rPr>
+          <w:b w:val="0"/>
+          <w:color w:val="385623" w:themeColor="accent6" w:themeShade="80"/>
+          <w:sz w:val="20"/>
+          <w:szCs w:val="20"/>
+          <w:lang w:val="en-US"/>
+        </w:rPr>
+        <w:t>EnviroInfo</w:t>
+      </w:r>
+      <w:proofErr w:type="spellEnd"/>
+      <w:r>
+        <w:rPr>
+          <w:b w:val="0"/>
+          <w:color w:val="385623" w:themeColor="accent6" w:themeShade="80"/>
+          <w:sz w:val="20"/>
+          <w:szCs w:val="20"/>
+          <w:lang w:val="en-US"/>
+        </w:rPr>
+        <w:t xml:space="preserve"> 2026.</w:t>
+      </w:r>
+    </w:p>
+    <w:p>
+      <w:pPr>
+        <w:pStyle w:val="Zwischenberschriften"/>
+        <w:rPr>
+          <w:b w:val="0"/>
+          <w:color w:val="385623" w:themeColor="accent6" w:themeShade="80"/>
+          <w:sz w:val="20"/>
+          <w:szCs w:val="20"/>
+          <w:lang w:val="en-US"/>
+        </w:rPr>
+      </w:pPr>
+    </w:p>
+    <w:p>
+      <w:pPr>
+        <w:pStyle w:val="Zwischenberschriften"/>
+        <w:rPr>
+          <w:b w:val="0"/>
+          <w:color w:val="385623" w:themeColor="accent6" w:themeShade="80"/>
+          <w:sz w:val="20"/>
+          <w:szCs w:val="20"/>
+          <w:lang w:val="en-US"/>
+        </w:rPr>
+      </w:pPr>
+      <w:r>
+        <w:rPr>
+          <w:b w:val="0"/>
+          <w:color w:val="385623" w:themeColor="accent6" w:themeShade="80"/>
+          <w:sz w:val="20"/>
+          <w:szCs w:val="20"/>
+          <w:lang w:val="en-US"/>
+        </w:rPr>
+        <w:t xml:space="preserve">Held from 9 to 11 September 2026 at the University of </w:t>
+      </w:r>
+      <w:proofErr w:type="spellStart"/>
+      <w:r>
+        <w:rPr>
+          <w:b w:val="0"/>
+          <w:color w:val="385623" w:themeColor="accent6" w:themeShade="80"/>
+          <w:sz w:val="20"/>
+          <w:szCs w:val="20"/>
+          <w:lang w:val="en-US"/>
+        </w:rPr>
+        <w:t>Łódź</w:t>
+      </w:r>
+      <w:proofErr w:type="spellEnd"/>
+      <w:r>
+        <w:rPr>
+          <w:b w:val="0"/>
+          <w:color w:val="385623" w:themeColor="accent6" w:themeShade="80"/>
+          <w:sz w:val="20"/>
+          <w:szCs w:val="20"/>
+          <w:lang w:val="en-US"/>
+        </w:rPr>
+        <w:t xml:space="preserve">, Poland, the conference was </w:t>
+      </w:r>
+      <w:proofErr w:type="spellStart"/>
+      <w:r>
+        <w:rPr>
+          <w:b w:val="0"/>
+          <w:color w:val="385623" w:themeColor="accent6" w:themeShade="80"/>
+          <w:sz w:val="20"/>
+          <w:szCs w:val="20"/>
+          <w:lang w:val="en-US"/>
+        </w:rPr>
+        <w:t>organised</w:t>
+      </w:r>
+      <w:proofErr w:type="spellEnd"/>
+      <w:r>
+        <w:rPr>
+          <w:b w:val="0"/>
+          <w:color w:val="385623" w:themeColor="accent6" w:themeShade="80"/>
+          <w:sz w:val="20"/>
+          <w:szCs w:val="20"/>
+          <w:lang w:val="en-US"/>
+        </w:rPr>
+        <w:t xml:space="preserve"> by the technical committee of Environmental Informatics of the Gesellschaft für Informatik e.V. (GI). It took place in conjunction with the international scientific conference "Sustainable Development and Other Paradigms and Concepts in the Context of Contemporary Civilization Trends – Global and Local Dimensions" (SD26) and the Annual Meeting of the Polish Association of Environmental Economists. The University of </w:t>
+      </w:r>
+      <w:proofErr w:type="spellStart"/>
+      <w:r>
+        <w:rPr>
+          <w:b w:val="0"/>
+          <w:color w:val="385623" w:themeColor="accent6" w:themeShade="80"/>
+          <w:sz w:val="20"/>
+          <w:szCs w:val="20"/>
+          <w:lang w:val="en-US"/>
+        </w:rPr>
+        <w:t>Łódź</w:t>
+      </w:r>
+      <w:proofErr w:type="spellEnd"/>
+      <w:r>
+        <w:rPr>
+          <w:b w:val="0"/>
+          <w:color w:val="385623" w:themeColor="accent6" w:themeShade="80"/>
+          <w:sz w:val="20"/>
+          <w:szCs w:val="20"/>
+          <w:lang w:val="en-US"/>
+        </w:rPr>
+        <w:t xml:space="preserve"> served as the central host institution for all three events.</w:t>
+      </w:r>
+    </w:p>
+    <w:p>
+      <w:pPr>
+        <w:pStyle w:val="Zwischenberschriften"/>
+        <w:rPr>
+          <w:b w:val="0"/>
+          <w:color w:val="385623" w:themeColor="accent6" w:themeShade="80"/>
+          <w:sz w:val="20"/>
+          <w:szCs w:val="20"/>
+          <w:lang w:val="en-US"/>
+        </w:rPr>
+      </w:pPr>
+    </w:p>
+    <w:p>
+      <w:pPr>
+        <w:pStyle w:val="Zwischenberschriften"/>
+        <w:rPr>
+          <w:b w:val="0"/>
+          <w:color w:val="385623" w:themeColor="accent6" w:themeShade="80"/>
+          <w:sz w:val="20"/>
+          <w:szCs w:val="20"/>
+          <w:lang w:val="en-US"/>
+        </w:rPr>
+      </w:pPr>
+      <w:r>
+        <w:rPr>
+          <w:b w:val="0"/>
+          <w:color w:val="385623" w:themeColor="accent6" w:themeShade="80"/>
+          <w:sz w:val="20"/>
+          <w:szCs w:val="20"/>
+          <w:lang w:val="en-US"/>
+        </w:rPr>
+        <w:t xml:space="preserve">Over four decades, the </w:t>
+      </w:r>
+      <w:proofErr w:type="spellStart"/>
+      <w:r>
+        <w:rPr>
+          <w:b w:val="0"/>
+          <w:color w:val="385623" w:themeColor="accent6" w:themeShade="80"/>
+          <w:sz w:val="20"/>
+          <w:szCs w:val="20"/>
+          <w:lang w:val="en-US"/>
+        </w:rPr>
+        <w:t>EnviroInfo</w:t>
+      </w:r>
+      <w:proofErr w:type="spellEnd"/>
+      <w:r>
+        <w:rPr>
+          <w:b w:val="0"/>
+          <w:color w:val="385623" w:themeColor="accent6" w:themeShade="80"/>
+          <w:sz w:val="20"/>
+          <w:szCs w:val="20"/>
+          <w:lang w:val="en-US"/>
+        </w:rPr>
+        <w:t xml:space="preserve"> series has brought together researchers and practitioners from across the world who work at the intersection of applied computer science and environmental sustainability. The shared ambition has always been to translate advances in information and communication technologies into concrete steps toward a more sustainable society.</w:t>
+      </w:r>
+    </w:p>
+    <w:p>
+      <w:pPr>
+        <w:pStyle w:val="Zwischenberschriften"/>
+        <w:rPr>
+          <w:b w:val="0"/>
+          <w:color w:val="385623" w:themeColor="accent6" w:themeShade="80"/>
+          <w:sz w:val="20"/>
+          <w:szCs w:val="20"/>
+          <w:lang w:val="en-US"/>
+        </w:rPr>
+      </w:pPr>
+    </w:p>
+    <w:p>
+      <w:pPr>
+        <w:pStyle w:val="Zwischenberschriften"/>
+        <w:rPr>
+          <w:b w:val="0"/>
+          <w:color w:val="385623" w:themeColor="accent6" w:themeShade="80"/>
+          <w:sz w:val="20"/>
+          <w:szCs w:val="20"/>
+          <w:lang w:val="en-US"/>
+        </w:rPr>
+      </w:pPr>
+      <w:r>
+        <w:rPr>
+          <w:b w:val="0"/>
+          <w:color w:val="385623" w:themeColor="accent6" w:themeShade="80"/>
+          <w:sz w:val="20"/>
+          <w:szCs w:val="20"/>
+          <w:lang w:val="en-US"/>
+        </w:rPr>
+        <w:t xml:space="preserve">The theme of </w:t>
+      </w:r>
+      <w:proofErr w:type="spellStart"/>
+      <w:r>
+        <w:rPr>
+          <w:b w:val="0"/>
+          <w:color w:val="385623" w:themeColor="accent6" w:themeShade="80"/>
+          <w:sz w:val="20"/>
+          <w:szCs w:val="20"/>
+          <w:lang w:val="en-US"/>
+        </w:rPr>
+        <w:t>EnviroInfo</w:t>
+      </w:r>
+      <w:proofErr w:type="spellEnd"/>
+      <w:r>
+        <w:rPr>
+          <w:b w:val="0"/>
+          <w:color w:val="385623" w:themeColor="accent6" w:themeShade="80"/>
+          <w:sz w:val="20"/>
+          <w:szCs w:val="20"/>
+          <w:lang w:val="en-US"/>
+        </w:rPr>
+        <w:t xml:space="preserve"> 2026 – "Sustainable Development and Other Paradigms and Concepts in the Context of Contemporary Civilization Trends – Global and Local Dimensions" – opens up the conversation beyond any single framework. It situates environmental informatics within a wider debate about how societies, at both local and global scale, respond to the pressures of our time: through green computing and sustainable software, through circular economy models, through business intelligence, and through the critical examination of the paradigms that shape development itself.</w:t>
+      </w:r>
+    </w:p>
+    <w:p>
+      <w:pPr>
+        <w:pStyle w:val="Zwischenberschriften"/>
+        <w:rPr>
+          <w:b w:val="0"/>
+          <w:color w:val="385623" w:themeColor="accent6" w:themeShade="80"/>
+          <w:sz w:val="20"/>
+          <w:szCs w:val="20"/>
+          <w:lang w:val="en-US"/>
+        </w:rPr>
+      </w:pPr>
+    </w:p>
+    <w:p>
+      <w:pPr>
+        <w:pStyle w:val="Zwischenberschriften"/>
+        <w:rPr>
+          <w:b w:val="0"/>
+          <w:color w:val="385623" w:themeColor="accent6" w:themeShade="80"/>
+          <w:sz w:val="20"/>
+          <w:szCs w:val="20"/>
+          <w:lang w:val="en-US"/>
+        </w:rPr>
+      </w:pPr>
+      <w:r>
+        <w:rPr>
+          <w:b w:val="0"/>
+          <w:color w:val="385623" w:themeColor="accent6" w:themeShade="80"/>
+          <w:sz w:val="20"/>
+          <w:szCs w:val="20"/>
+          <w:lang w:val="en-US"/>
+        </w:rPr>
+        <w:t>The contributions gathered here are works in progress or early-stage results – deliberately so. This volume is a space for approaches that are still taking shape, for questions not yet fully answered, and for methodological experiments that connect disciplines and cross the boundary between research and practice. Taken together, they map a field in motion: from data infrastructures and environmental management systems to green coding, sustainability indicators, and the interfaces between science, policy, and civil society.</w:t>
+      </w:r>
+    </w:p>
+    <w:p>
+      <w:pPr>
+        <w:pStyle w:val="Zwischenberschriften"/>
+        <w:rPr>
+          <w:b w:val="0"/>
+          <w:color w:val="385623" w:themeColor="accent6" w:themeShade="80"/>
+          <w:sz w:val="20"/>
+          <w:szCs w:val="20"/>
+          <w:lang w:val="en-US"/>
+        </w:rPr>
+      </w:pPr>
+    </w:p>
+    <w:p>
+      <w:pPr>
+        <w:pStyle w:val="Zwischenberschriften"/>
+        <w:rPr>
+          <w:b w:val="0"/>
+          <w:color w:val="385623" w:themeColor="accent6" w:themeShade="80"/>
+          <w:sz w:val="20"/>
+          <w:szCs w:val="20"/>
+          <w:lang w:val="en-US"/>
+        </w:rPr>
+      </w:pPr>
+      <w:r>
+        <w:rPr>
+          <w:b w:val="0"/>
+          <w:color w:val="385623" w:themeColor="accent6" w:themeShade="80"/>
+          <w:sz w:val="20"/>
+          <w:szCs w:val="20"/>
+          <w:lang w:val="en-US"/>
+        </w:rPr>
+        <w:t xml:space="preserve">We thank all authors for sharing their work at this stage of development. We equally thank the members of the </w:t>
+      </w:r>
+      <w:proofErr w:type="spellStart"/>
+      <w:r>
+        <w:rPr>
+          <w:b w:val="0"/>
+          <w:color w:val="385623" w:themeColor="accent6" w:themeShade="80"/>
+          <w:sz w:val="20"/>
+          <w:szCs w:val="20"/>
+          <w:lang w:val="en-US"/>
+        </w:rPr>
+        <w:t>programme</w:t>
+      </w:r>
+      <w:proofErr w:type="spellEnd"/>
+      <w:r>
+        <w:rPr>
+          <w:b w:val="0"/>
+          <w:color w:val="385623" w:themeColor="accent6" w:themeShade="80"/>
+          <w:sz w:val="20"/>
+          <w:szCs w:val="20"/>
+          <w:lang w:val="en-US"/>
+        </w:rPr>
+        <w:t xml:space="preserve"> and </w:t>
+      </w:r>
+      <w:proofErr w:type="spellStart"/>
+      <w:r>
+        <w:rPr>
+          <w:b w:val="0"/>
+          <w:color w:val="385623" w:themeColor="accent6" w:themeShade="80"/>
+          <w:sz w:val="20"/>
+          <w:szCs w:val="20"/>
+          <w:lang w:val="en-US"/>
+        </w:rPr>
+        <w:t>organisation</w:t>
+      </w:r>
+      <w:proofErr w:type="spellEnd"/>
+      <w:r>
+        <w:rPr>
+          <w:b w:val="0"/>
+          <w:color w:val="385623" w:themeColor="accent6" w:themeShade="80"/>
+          <w:sz w:val="20"/>
+          <w:szCs w:val="20"/>
+          <w:lang w:val="en-US"/>
+        </w:rPr>
+        <w:t xml:space="preserve"> committee for their thorough and careful reviews. Our appreciation goes to the University of </w:t>
+      </w:r>
+      <w:proofErr w:type="spellStart"/>
+      <w:r>
+        <w:rPr>
+          <w:b w:val="0"/>
+          <w:color w:val="385623" w:themeColor="accent6" w:themeShade="80"/>
+          <w:sz w:val="20"/>
+          <w:szCs w:val="20"/>
+          <w:lang w:val="en-US"/>
+        </w:rPr>
+        <w:t>Łódź</w:t>
+      </w:r>
+      <w:proofErr w:type="spellEnd"/>
+      <w:r>
+        <w:rPr>
+          <w:b w:val="0"/>
+          <w:color w:val="385623" w:themeColor="accent6" w:themeShade="80"/>
+          <w:sz w:val="20"/>
+          <w:szCs w:val="20"/>
+          <w:lang w:val="en-US"/>
+        </w:rPr>
+        <w:t xml:space="preserve"> as host, to the </w:t>
+      </w:r>
+      <w:proofErr w:type="spellStart"/>
+      <w:r>
+        <w:rPr>
+          <w:b w:val="0"/>
+          <w:color w:val="385623" w:themeColor="accent6" w:themeShade="80"/>
+          <w:sz w:val="20"/>
+          <w:szCs w:val="20"/>
+          <w:lang w:val="en-US"/>
+        </w:rPr>
+        <w:t>organisers</w:t>
+      </w:r>
+      <w:proofErr w:type="spellEnd"/>
+      <w:r>
+        <w:rPr>
+          <w:b w:val="0"/>
+          <w:color w:val="385623" w:themeColor="accent6" w:themeShade="80"/>
+          <w:sz w:val="20"/>
+          <w:szCs w:val="20"/>
+          <w:lang w:val="en-US"/>
+        </w:rPr>
+        <w:t xml:space="preserve"> of SD26 and the Polish Association of Environmental Economists as co-</w:t>
+      </w:r>
+      <w:proofErr w:type="spellStart"/>
+      <w:r>
+        <w:rPr>
+          <w:b w:val="0"/>
+          <w:color w:val="385623" w:themeColor="accent6" w:themeShade="80"/>
+          <w:sz w:val="20"/>
+          <w:szCs w:val="20"/>
+          <w:lang w:val="en-US"/>
+        </w:rPr>
+        <w:t>organisers</w:t>
+      </w:r>
+      <w:proofErr w:type="spellEnd"/>
+      <w:r>
+        <w:rPr>
+          <w:b w:val="0"/>
+          <w:color w:val="385623" w:themeColor="accent6" w:themeShade="80"/>
+          <w:sz w:val="20"/>
+          <w:szCs w:val="20"/>
+          <w:lang w:val="en-US"/>
+        </w:rPr>
+        <w:t>, and to the Gesellschaft für Informatik e.V. Finally, we thank our sponsors, whose support was essential to making this conference happen.</w:t>
+      </w:r>
+    </w:p>
+    <w:p>
+      <w:pPr>
+        <w:pStyle w:val="Zwischenberschriften"/>
+        <w:rPr>
+          <w:b w:val="0"/>
+          <w:color w:val="385623" w:themeColor="accent6" w:themeShade="80"/>
+          <w:sz w:val="20"/>
+          <w:szCs w:val="20"/>
+          <w:lang w:val="en-US"/>
+        </w:rPr>
+      </w:pPr>
+    </w:p>
+    <w:p>
+      <w:pPr>
+        <w:pStyle w:val="Zwischenberschriften"/>
+        <w:rPr>
+          <w:b w:val="0"/>
+          <w:color w:val="385623" w:themeColor="accent6" w:themeShade="80"/>
+          <w:sz w:val="20"/>
+          <w:szCs w:val="20"/>
+          <w:lang w:val="en-US"/>
+        </w:rPr>
+      </w:pPr>
+      <w:proofErr w:type="spellStart"/>
+      <w:r>
+        <w:rPr>
+          <w:b w:val="0"/>
+          <w:color w:val="385623" w:themeColor="accent6" w:themeShade="80"/>
+          <w:sz w:val="20"/>
+          <w:szCs w:val="20"/>
+          <w:lang w:val="en-US"/>
+        </w:rPr>
+        <w:t>Łódź</w:t>
+      </w:r>
+      <w:proofErr w:type="spellEnd"/>
+      <w:r>
+        <w:rPr>
+          <w:b w:val="0"/>
+          <w:color w:val="385623" w:themeColor="accent6" w:themeShade="80"/>
+          <w:sz w:val="20"/>
+          <w:szCs w:val="20"/>
+          <w:lang w:val="en-US"/>
+        </w:rPr>
+        <w:t>, September 2026</w:t>
+      </w:r>
+    </w:p>
+    <w:p>
+      <w:pPr>
+        <w:pStyle w:val="Zwischenberschriften"/>
+        <w:rPr>
+          <w:b w:val="0"/>
+          <w:color w:val="385623" w:themeColor="accent6" w:themeShade="80"/>
+          <w:sz w:val="20"/>
+          <w:szCs w:val="20"/>
+          <w:lang w:val="en-US"/>
+        </w:rPr>
+      </w:pPr>
+      <w:r>
+        <w:rPr>
+          <w:b w:val="0"/>
+          <w:color w:val="385623" w:themeColor="accent6" w:themeShade="80"/>
+          <w:sz w:val="20"/>
+          <w:szCs w:val="20"/>
+          <w:lang w:val="en-US"/>
+        </w:rPr>
+        <w:t>On behalf of the Organizing Committee</w:t>
+      </w:r>
+    </w:p>
+    <w:p>
+      <w:pPr>
+        <w:pStyle w:val="Zwischenberschriften"/>
+        <w:rPr>
+          <w:b w:val="0"/>
+          <w:color w:val="385623" w:themeColor="accent6" w:themeShade="80"/>
+          <w:sz w:val="20"/>
+          <w:szCs w:val="20"/>
+        </w:rPr>
+      </w:pPr>
+      <w:r>
+        <w:rPr>
+          <w:b w:val="0"/>
+          <w:color w:val="385623" w:themeColor="accent6" w:themeShade="80"/>
+          <w:sz w:val="20"/>
+          <w:szCs w:val="20"/>
+        </w:rPr>
+        <w:t>Volker Wohlgemuth, Stefan Naumann, Grit Behrens, Malgorzata Burchard-</w:t>
+      </w:r>
+      <w:proofErr w:type="spellStart"/>
+      <w:r>
+        <w:rPr>
+          <w:b w:val="0"/>
+          <w:color w:val="385623" w:themeColor="accent6" w:themeShade="80"/>
+          <w:sz w:val="20"/>
+          <w:szCs w:val="20"/>
+        </w:rPr>
+        <w:t>Dziubińska</w:t>
+      </w:r>
+      <w:proofErr w:type="spellEnd"/>
+    </w:p>
+    <w:p>
+      <w:pPr>
+        <w:rPr>
+          <w:color w:val="385623" w:themeColor="accent6" w:themeShade="80"/>
+          <w:lang w:val="de-DE"/>
+        </w:rPr>
+      </w:pPr>
+      <w:r>
+        <w:rPr>
+          <w:b/>
+          <w:color w:val="385623" w:themeColor="accent6" w:themeShade="80"/>
+        </w:rPr>
+        <w:br w:type="page"/>
+      </w:r>
+    </w:p>
+    <w:p>
+      <w:pPr>
+        <w:pStyle w:val="Zwischenberschriften"/>
+        <w:rPr>
+          <w:color w:val="385623" w:themeColor="accent6" w:themeShade="80"/>
+          <w:lang w:val="en-US"/>
+        </w:rPr>
+      </w:pPr>
+      <w:r>
+        <w:rPr>
+          <w:color w:val="385623" w:themeColor="accent6" w:themeShade="80"/>
+          <w:lang w:val="en-US"/>
+        </w:rPr>
+        <w:lastRenderedPageBreak/>
+        <w:t xml:space="preserve">Preface </w:t>
+      </w:r>
+      <w:r>
+        <w:rPr>
+          <w:color w:val="385623" w:themeColor="accent6" w:themeShade="80"/>
+          <w:lang w:val="en-US"/>
+        </w:rPr>
+        <w:t>2</w:t>
+      </w:r>
+    </w:p>
+    <w:p>
+      <w:pPr>
+        <w:pStyle w:val="Zwischenberschriften"/>
+        <w:rPr>
+          <w:b w:val="0"/>
+          <w:color w:val="385623" w:themeColor="accent6" w:themeShade="80"/>
+          <w:sz w:val="20"/>
+          <w:szCs w:val="20"/>
+          <w:lang w:val="en-US"/>
+        </w:rPr>
+      </w:pPr>
+    </w:p>
+    <w:p>
+      <w:pPr>
+        <w:pStyle w:val="Zwischenberschriften"/>
+        <w:rPr>
+          <w:b w:val="0"/>
+          <w:color w:val="385623" w:themeColor="accent6" w:themeShade="80"/>
+          <w:sz w:val="20"/>
+          <w:szCs w:val="20"/>
+          <w:lang w:val="en-US"/>
+        </w:rPr>
+      </w:pPr>
+      <w:r>
+        <w:rPr>
+          <w:b w:val="0"/>
+          <w:color w:val="385623" w:themeColor="accent6" w:themeShade="80"/>
+          <w:sz w:val="20"/>
+          <w:szCs w:val="20"/>
+          <w:lang w:val="en-US"/>
+        </w:rPr>
+        <w:t xml:space="preserve">This book contains the short and work-in-progress contributions of the 40th International and Interdisciplinary Conference on Environmental Informatics – </w:t>
+      </w:r>
+      <w:proofErr w:type="spellStart"/>
+      <w:r>
+        <w:rPr>
+          <w:b w:val="0"/>
+          <w:color w:val="385623" w:themeColor="accent6" w:themeShade="80"/>
+          <w:sz w:val="20"/>
+          <w:szCs w:val="20"/>
+          <w:lang w:val="en-US"/>
+        </w:rPr>
+        <w:t>EnviroInfo</w:t>
+      </w:r>
+      <w:proofErr w:type="spellEnd"/>
+      <w:r>
+        <w:rPr>
+          <w:b w:val="0"/>
+          <w:color w:val="385623" w:themeColor="accent6" w:themeShade="80"/>
+          <w:sz w:val="20"/>
+          <w:szCs w:val="20"/>
+          <w:lang w:val="en-US"/>
+        </w:rPr>
+        <w:t xml:space="preserve"> 2026.</w:t>
+      </w:r>
+    </w:p>
+    <w:p>
+      <w:pPr>
+        <w:pStyle w:val="Zwischenberschriften"/>
+        <w:rPr>
+          <w:b w:val="0"/>
+          <w:color w:val="385623" w:themeColor="accent6" w:themeShade="80"/>
+          <w:sz w:val="20"/>
+          <w:szCs w:val="20"/>
+          <w:lang w:val="en-US"/>
+        </w:rPr>
+      </w:pPr>
+    </w:p>
+    <w:p>
+      <w:pPr>
+        <w:pStyle w:val="Zwischenberschriften"/>
+        <w:rPr>
+          <w:b w:val="0"/>
+          <w:color w:val="385623" w:themeColor="accent6" w:themeShade="80"/>
+          <w:sz w:val="20"/>
+          <w:szCs w:val="20"/>
+          <w:lang w:val="en-US"/>
+        </w:rPr>
+      </w:pPr>
+      <w:r>
+        <w:rPr>
+          <w:b w:val="0"/>
+          <w:color w:val="385623" w:themeColor="accent6" w:themeShade="80"/>
+          <w:sz w:val="20"/>
+          <w:szCs w:val="20"/>
+          <w:lang w:val="en-US"/>
+        </w:rPr>
+        <w:t xml:space="preserve">The conference took place from 9 to 11 September 2026 at the University of </w:t>
+      </w:r>
+      <w:proofErr w:type="spellStart"/>
+      <w:r>
+        <w:rPr>
+          <w:b w:val="0"/>
+          <w:color w:val="385623" w:themeColor="accent6" w:themeShade="80"/>
+          <w:sz w:val="20"/>
+          <w:szCs w:val="20"/>
+          <w:lang w:val="en-US"/>
+        </w:rPr>
+        <w:t>Łódź</w:t>
+      </w:r>
+      <w:proofErr w:type="spellEnd"/>
+      <w:r>
+        <w:rPr>
+          <w:b w:val="0"/>
+          <w:color w:val="385623" w:themeColor="accent6" w:themeShade="80"/>
+          <w:sz w:val="20"/>
+          <w:szCs w:val="20"/>
+          <w:lang w:val="en-US"/>
+        </w:rPr>
+        <w:t xml:space="preserve">, Poland, </w:t>
+      </w:r>
+      <w:proofErr w:type="spellStart"/>
+      <w:r>
+        <w:rPr>
+          <w:b w:val="0"/>
+          <w:color w:val="385623" w:themeColor="accent6" w:themeShade="80"/>
+          <w:sz w:val="20"/>
+          <w:szCs w:val="20"/>
+          <w:lang w:val="en-US"/>
+        </w:rPr>
+        <w:t>organised</w:t>
+      </w:r>
+      <w:proofErr w:type="spellEnd"/>
+      <w:r>
+        <w:rPr>
+          <w:b w:val="0"/>
+          <w:color w:val="385623" w:themeColor="accent6" w:themeShade="80"/>
+          <w:sz w:val="20"/>
+          <w:szCs w:val="20"/>
+          <w:lang w:val="en-US"/>
+        </w:rPr>
+        <w:t xml:space="preserve"> by the Technical Committee on Environmental Informatics of the Gesellschaft für Informatik e.V. (GI), together with the University of </w:t>
+      </w:r>
+      <w:proofErr w:type="spellStart"/>
+      <w:r>
+        <w:rPr>
+          <w:b w:val="0"/>
+          <w:color w:val="385623" w:themeColor="accent6" w:themeShade="80"/>
+          <w:sz w:val="20"/>
+          <w:szCs w:val="20"/>
+          <w:lang w:val="en-US"/>
+        </w:rPr>
+        <w:t>Łódź</w:t>
+      </w:r>
+      <w:proofErr w:type="spellEnd"/>
+      <w:r>
+        <w:rPr>
+          <w:b w:val="0"/>
+          <w:color w:val="385623" w:themeColor="accent6" w:themeShade="80"/>
+          <w:sz w:val="20"/>
+          <w:szCs w:val="20"/>
+          <w:lang w:val="en-US"/>
+        </w:rPr>
+        <w:t xml:space="preserve"> and the Polish Association of Environmental Economists. </w:t>
+      </w:r>
+      <w:proofErr w:type="spellStart"/>
+      <w:r>
+        <w:rPr>
+          <w:b w:val="0"/>
+          <w:color w:val="385623" w:themeColor="accent6" w:themeShade="80"/>
+          <w:sz w:val="20"/>
+          <w:szCs w:val="20"/>
+          <w:lang w:val="en-US"/>
+        </w:rPr>
+        <w:t>EnviroInfo</w:t>
+      </w:r>
+      <w:proofErr w:type="spellEnd"/>
+      <w:r>
+        <w:rPr>
+          <w:b w:val="0"/>
+          <w:color w:val="385623" w:themeColor="accent6" w:themeShade="80"/>
+          <w:sz w:val="20"/>
+          <w:szCs w:val="20"/>
+          <w:lang w:val="en-US"/>
+        </w:rPr>
+        <w:t xml:space="preserve"> 2026 ran alongside the international scientific conference "Sustainable Development and Other Paradigms and Concepts in the Context of Contemporary Civilizational Trends – Global and Local Dimensions", put together by the Department of Development Economics and the Department of City and Regional Management of the University of </w:t>
+      </w:r>
+      <w:proofErr w:type="spellStart"/>
+      <w:r>
+        <w:rPr>
+          <w:b w:val="0"/>
+          <w:color w:val="385623" w:themeColor="accent6" w:themeShade="80"/>
+          <w:sz w:val="20"/>
+          <w:szCs w:val="20"/>
+          <w:lang w:val="en-US"/>
+        </w:rPr>
+        <w:t>Łódź</w:t>
+      </w:r>
+      <w:proofErr w:type="spellEnd"/>
+      <w:r>
+        <w:rPr>
+          <w:b w:val="0"/>
+          <w:color w:val="385623" w:themeColor="accent6" w:themeShade="80"/>
+          <w:sz w:val="20"/>
+          <w:szCs w:val="20"/>
+          <w:lang w:val="en-US"/>
+        </w:rPr>
+        <w:t xml:space="preserve"> and the Polish Association of Environmental and Natural Resource Economists. The University of </w:t>
+      </w:r>
+      <w:proofErr w:type="spellStart"/>
+      <w:r>
+        <w:rPr>
+          <w:b w:val="0"/>
+          <w:color w:val="385623" w:themeColor="accent6" w:themeShade="80"/>
+          <w:sz w:val="20"/>
+          <w:szCs w:val="20"/>
+          <w:lang w:val="en-US"/>
+        </w:rPr>
+        <w:t>Łódź</w:t>
+      </w:r>
+      <w:proofErr w:type="spellEnd"/>
+      <w:r>
+        <w:rPr>
+          <w:b w:val="0"/>
+          <w:color w:val="385623" w:themeColor="accent6" w:themeShade="80"/>
+          <w:sz w:val="20"/>
+          <w:szCs w:val="20"/>
+          <w:lang w:val="en-US"/>
+        </w:rPr>
+        <w:t xml:space="preserve"> provided the institutional home for what marks a milestone edition of the series.</w:t>
+      </w:r>
+    </w:p>
+    <w:p>
+      <w:pPr>
+        <w:pStyle w:val="Zwischenberschriften"/>
+        <w:rPr>
+          <w:b w:val="0"/>
+          <w:color w:val="385623" w:themeColor="accent6" w:themeShade="80"/>
+          <w:sz w:val="20"/>
+          <w:szCs w:val="20"/>
+          <w:lang w:val="en-US"/>
+        </w:rPr>
+      </w:pPr>
+    </w:p>
+    <w:p>
+      <w:pPr>
+        <w:pStyle w:val="Zwischenberschriften"/>
+        <w:rPr>
+          <w:b w:val="0"/>
+          <w:color w:val="385623" w:themeColor="accent6" w:themeShade="80"/>
+          <w:sz w:val="20"/>
+          <w:szCs w:val="20"/>
+          <w:lang w:val="en-US"/>
+        </w:rPr>
+      </w:pPr>
+      <w:r>
+        <w:rPr>
+          <w:b w:val="0"/>
+          <w:color w:val="385623" w:themeColor="accent6" w:themeShade="80"/>
+          <w:sz w:val="20"/>
+          <w:szCs w:val="20"/>
+          <w:lang w:val="en-US"/>
+        </w:rPr>
+        <w:t xml:space="preserve">For forty years, </w:t>
+      </w:r>
+      <w:proofErr w:type="spellStart"/>
+      <w:r>
+        <w:rPr>
+          <w:b w:val="0"/>
+          <w:color w:val="385623" w:themeColor="accent6" w:themeShade="80"/>
+          <w:sz w:val="20"/>
+          <w:szCs w:val="20"/>
+          <w:lang w:val="en-US"/>
+        </w:rPr>
+        <w:t>EnviroInfo</w:t>
+      </w:r>
+      <w:proofErr w:type="spellEnd"/>
+      <w:r>
+        <w:rPr>
+          <w:b w:val="0"/>
+          <w:color w:val="385623" w:themeColor="accent6" w:themeShade="80"/>
+          <w:sz w:val="20"/>
+          <w:szCs w:val="20"/>
+          <w:lang w:val="en-US"/>
+        </w:rPr>
+        <w:t xml:space="preserve"> has drawn together researchers and practitioners from applied computer science and sustainability who share a common goal: to channel advances in information and communication technologies into real progress toward a sustainable society. The 40th edition carries that tradition forward under the theme "Sustainable Development and Other Paradigms and Concepts in the Context of Contemporary Civilizational Trends – Global and Local Dimensions" – a framing that treats sustainable development not as a settled answer but as a live paradigm, still being tested against other concepts and pressures at every scale from the local to the global.</w:t>
+      </w:r>
+    </w:p>
+    <w:p>
+      <w:pPr>
+        <w:pStyle w:val="Zwischenberschriften"/>
+        <w:rPr>
+          <w:b w:val="0"/>
+          <w:color w:val="385623" w:themeColor="accent6" w:themeShade="80"/>
+          <w:sz w:val="20"/>
+          <w:szCs w:val="20"/>
+          <w:lang w:val="en-US"/>
+        </w:rPr>
+      </w:pPr>
+    </w:p>
+    <w:p>
+      <w:pPr>
+        <w:pStyle w:val="Zwischenberschriften"/>
+        <w:rPr>
+          <w:b w:val="0"/>
+          <w:color w:val="385623" w:themeColor="accent6" w:themeShade="80"/>
+          <w:sz w:val="20"/>
+          <w:szCs w:val="20"/>
+          <w:lang w:val="en-US"/>
+        </w:rPr>
+      </w:pPr>
+      <w:r>
+        <w:rPr>
+          <w:b w:val="0"/>
+          <w:color w:val="385623" w:themeColor="accent6" w:themeShade="80"/>
+          <w:sz w:val="20"/>
+          <w:szCs w:val="20"/>
+          <w:lang w:val="en-US"/>
+        </w:rPr>
+        <w:t>The contributions gathered here are works in progress or early-stage results. This volume makes space for approaches still taking shape, for methods being tested across disciplinary boundaries, and for research that reaches toward policy and practice rather than staying within academic walls. The range is wide: green computing and sustainable software engineering, circular economy models, business intelligence, data infrastructure, and applications that draw science, governance, and civil society into conversation.</w:t>
+      </w:r>
+    </w:p>
+    <w:p>
+      <w:pPr>
+        <w:pStyle w:val="Zwischenberschriften"/>
+        <w:rPr>
+          <w:b w:val="0"/>
+          <w:color w:val="385623" w:themeColor="accent6" w:themeShade="80"/>
+          <w:sz w:val="20"/>
+          <w:szCs w:val="20"/>
+          <w:lang w:val="en-US"/>
+        </w:rPr>
+      </w:pPr>
+    </w:p>
+    <w:p>
+      <w:pPr>
+        <w:pStyle w:val="Zwischenberschriften"/>
+        <w:rPr>
+          <w:b w:val="0"/>
+          <w:color w:val="385623" w:themeColor="accent6" w:themeShade="80"/>
+          <w:sz w:val="20"/>
+          <w:szCs w:val="20"/>
+          <w:lang w:val="en-US"/>
+        </w:rPr>
+      </w:pPr>
+      <w:r>
+        <w:rPr>
+          <w:b w:val="0"/>
+          <w:color w:val="385623" w:themeColor="accent6" w:themeShade="80"/>
+          <w:sz w:val="20"/>
+          <w:szCs w:val="20"/>
+          <w:lang w:val="en-US"/>
+        </w:rPr>
+        <w:t xml:space="preserve">Thanks are owed first to the authors, who shared their work at a formative stage. The members of the </w:t>
+      </w:r>
+      <w:proofErr w:type="spellStart"/>
+      <w:r>
+        <w:rPr>
+          <w:b w:val="0"/>
+          <w:color w:val="385623" w:themeColor="accent6" w:themeShade="80"/>
+          <w:sz w:val="20"/>
+          <w:szCs w:val="20"/>
+          <w:lang w:val="en-US"/>
+        </w:rPr>
+        <w:t>Programme</w:t>
+      </w:r>
+      <w:proofErr w:type="spellEnd"/>
+      <w:r>
+        <w:rPr>
+          <w:b w:val="0"/>
+          <w:color w:val="385623" w:themeColor="accent6" w:themeShade="80"/>
+          <w:sz w:val="20"/>
+          <w:szCs w:val="20"/>
+          <w:lang w:val="en-US"/>
+        </w:rPr>
+        <w:t xml:space="preserve"> and </w:t>
+      </w:r>
+      <w:proofErr w:type="spellStart"/>
+      <w:r>
+        <w:rPr>
+          <w:b w:val="0"/>
+          <w:color w:val="385623" w:themeColor="accent6" w:themeShade="80"/>
+          <w:sz w:val="20"/>
+          <w:szCs w:val="20"/>
+          <w:lang w:val="en-US"/>
+        </w:rPr>
+        <w:t>Organisation</w:t>
+      </w:r>
+      <w:proofErr w:type="spellEnd"/>
+      <w:r>
+        <w:rPr>
+          <w:b w:val="0"/>
+          <w:color w:val="385623" w:themeColor="accent6" w:themeShade="80"/>
+          <w:sz w:val="20"/>
+          <w:szCs w:val="20"/>
+          <w:lang w:val="en-US"/>
+        </w:rPr>
+        <w:t xml:space="preserve"> Committees deserve equal recognition for the care they brought to the review process. We are grateful to the University of </w:t>
+      </w:r>
+      <w:proofErr w:type="spellStart"/>
+      <w:r>
+        <w:rPr>
+          <w:b w:val="0"/>
+          <w:color w:val="385623" w:themeColor="accent6" w:themeShade="80"/>
+          <w:sz w:val="20"/>
+          <w:szCs w:val="20"/>
+          <w:lang w:val="en-US"/>
+        </w:rPr>
+        <w:t>Łódź</w:t>
+      </w:r>
+      <w:proofErr w:type="spellEnd"/>
+      <w:r>
+        <w:rPr>
+          <w:b w:val="0"/>
+          <w:color w:val="385623" w:themeColor="accent6" w:themeShade="80"/>
+          <w:sz w:val="20"/>
+          <w:szCs w:val="20"/>
+          <w:lang w:val="en-US"/>
+        </w:rPr>
+        <w:t xml:space="preserve"> for hosting the event, to the Polish Association of Environmental Economists for the joint </w:t>
+      </w:r>
+      <w:proofErr w:type="spellStart"/>
+      <w:r>
+        <w:rPr>
+          <w:b w:val="0"/>
+          <w:color w:val="385623" w:themeColor="accent6" w:themeShade="80"/>
+          <w:sz w:val="20"/>
+          <w:szCs w:val="20"/>
+          <w:lang w:val="en-US"/>
+        </w:rPr>
+        <w:t>organisation</w:t>
+      </w:r>
+      <w:proofErr w:type="spellEnd"/>
+      <w:r>
+        <w:rPr>
+          <w:b w:val="0"/>
+          <w:color w:val="385623" w:themeColor="accent6" w:themeShade="80"/>
+          <w:sz w:val="20"/>
+          <w:szCs w:val="20"/>
+          <w:lang w:val="en-US"/>
+        </w:rPr>
+        <w:t xml:space="preserve">, and to the Gesellschaft für Informatik e.V. for its steady support of </w:t>
+      </w:r>
+      <w:proofErr w:type="spellStart"/>
+      <w:r>
+        <w:rPr>
+          <w:b w:val="0"/>
+          <w:color w:val="385623" w:themeColor="accent6" w:themeShade="80"/>
+          <w:sz w:val="20"/>
+          <w:szCs w:val="20"/>
+          <w:lang w:val="en-US"/>
+        </w:rPr>
+        <w:t>EnviroInfo</w:t>
+      </w:r>
+      <w:proofErr w:type="spellEnd"/>
+      <w:r>
+        <w:rPr>
+          <w:b w:val="0"/>
+          <w:color w:val="385623" w:themeColor="accent6" w:themeShade="80"/>
+          <w:sz w:val="20"/>
+          <w:szCs w:val="20"/>
+          <w:lang w:val="en-US"/>
+        </w:rPr>
+        <w:t xml:space="preserve"> across four decades. </w:t>
+      </w:r>
+      <w:r>
+        <w:rPr>
+          <w:b w:val="0"/>
+          <w:color w:val="385623" w:themeColor="accent6" w:themeShade="80"/>
+          <w:sz w:val="20"/>
+          <w:szCs w:val="20"/>
+          <w:lang w:val="en-US"/>
+        </w:rPr>
+        <w:t>Finally, we thank our sponsors, whose support was essential to making this conference happen.</w:t>
+      </w:r>
+    </w:p>
+    <w:p>
+      <w:pPr>
+        <w:pStyle w:val="Zwischenberschriften"/>
+        <w:rPr>
+          <w:b w:val="0"/>
+          <w:color w:val="385623" w:themeColor="accent6" w:themeShade="80"/>
+          <w:sz w:val="20"/>
+          <w:szCs w:val="20"/>
+          <w:lang w:val="en-US"/>
+        </w:rPr>
+      </w:pPr>
+    </w:p>
+    <w:p>
+      <w:pPr>
+        <w:pStyle w:val="Zwischenberschriften"/>
+        <w:rPr>
+          <w:b w:val="0"/>
+          <w:color w:val="385623" w:themeColor="accent6" w:themeShade="80"/>
+          <w:sz w:val="20"/>
+          <w:szCs w:val="20"/>
+          <w:lang w:val="en-US"/>
+        </w:rPr>
+      </w:pPr>
+      <w:proofErr w:type="spellStart"/>
+      <w:r>
+        <w:rPr>
+          <w:b w:val="0"/>
+          <w:color w:val="385623" w:themeColor="accent6" w:themeShade="80"/>
+          <w:sz w:val="20"/>
+          <w:szCs w:val="20"/>
+          <w:lang w:val="en-US"/>
+        </w:rPr>
+        <w:t>Łódź</w:t>
+      </w:r>
+      <w:proofErr w:type="spellEnd"/>
+      <w:r>
+        <w:rPr>
+          <w:b w:val="0"/>
+          <w:color w:val="385623" w:themeColor="accent6" w:themeShade="80"/>
+          <w:sz w:val="20"/>
+          <w:szCs w:val="20"/>
+          <w:lang w:val="en-US"/>
+        </w:rPr>
+        <w:t>, September 2026</w:t>
+      </w:r>
+      <w:r>
+        <w:rPr>
+          <w:b w:val="0"/>
+          <w:color w:val="385623" w:themeColor="accent6" w:themeShade="80"/>
+          <w:sz w:val="20"/>
+          <w:szCs w:val="20"/>
+          <w:lang w:val="en-US"/>
+        </w:rPr>
+        <w:br/>
+        <w:t xml:space="preserve">On behalf of the </w:t>
+      </w:r>
+      <w:proofErr w:type="spellStart"/>
+      <w:r>
+        <w:rPr>
+          <w:b w:val="0"/>
+          <w:color w:val="385623" w:themeColor="accent6" w:themeShade="80"/>
+          <w:sz w:val="20"/>
+          <w:szCs w:val="20"/>
+          <w:lang w:val="en-US"/>
+        </w:rPr>
+        <w:t>Organising</w:t>
+      </w:r>
+      <w:proofErr w:type="spellEnd"/>
+      <w:r>
+        <w:rPr>
+          <w:b w:val="0"/>
+          <w:color w:val="385623" w:themeColor="accent6" w:themeShade="80"/>
+          <w:sz w:val="20"/>
+          <w:szCs w:val="20"/>
+          <w:lang w:val="en-US"/>
+        </w:rPr>
+        <w:t xml:space="preserve"> Committee</w:t>
+      </w:r>
+      <w:r>
+        <w:rPr>
+          <w:b w:val="0"/>
+          <w:color w:val="385623" w:themeColor="accent6" w:themeShade="80"/>
+          <w:sz w:val="20"/>
+          <w:szCs w:val="20"/>
+          <w:lang w:val="en-US"/>
+        </w:rPr>
+        <w:br/>
+        <w:t>Volker Wohlgemuth, Conference President</w:t>
+      </w:r>
+    </w:p>
+    <w:p>
+      <w:pPr>
+        <w:pStyle w:val="Zwischenberschriften"/>
+      </w:pPr>
+      <w:r>
+        <w:rPr>
+          <w:b w:val="0"/>
           <w:color w:val="EE0000"/>
-          <w:lang w:val="en-US"/>
-        </w:rPr>
-      </w:pPr>
-    </w:p>
-    <w:p>
-      <w:pPr>
-        <w:pStyle w:val="Zwischenberschriften"/>
-        <w:jc w:val="both"/>
-        <w:rPr>
-          <w:b w:val="0"/>
-          <w:color w:val="EE0000"/>
-          <w:sz w:val="20"/>
-          <w:szCs w:val="20"/>
-          <w:lang w:val="en-GB"/>
-        </w:rPr>
-      </w:pPr>
-      <w:r>
-        <w:rPr>
-          <w:b w:val="0"/>
-          <w:color w:val="EE0000"/>
-          <w:sz w:val="20"/>
-          <w:szCs w:val="20"/>
-          <w:lang w:val="en-GB"/>
-        </w:rPr>
-        <w:t>This book contains the short and work-in-progress contributions of the 39th International and Interdisciplinary Conference on Environmental Informatics – EnviroInfo 2025.</w:t>
-      </w:r>
-    </w:p>
-    <w:p>
-      <w:pPr>
-        <w:pStyle w:val="Zwischenberschriften"/>
-        <w:jc w:val="both"/>
-        <w:rPr>
-          <w:b w:val="0"/>
-          <w:color w:val="EE0000"/>
-          <w:sz w:val="20"/>
-          <w:szCs w:val="20"/>
-          <w:lang w:val="en-GB"/>
-        </w:rPr>
-      </w:pPr>
-    </w:p>
-    <w:p>
-      <w:pPr>
-        <w:pStyle w:val="Zwischenberschriften"/>
-        <w:jc w:val="both"/>
-        <w:rPr>
-          <w:b w:val="0"/>
-          <w:color w:val="EE0000"/>
-          <w:sz w:val="20"/>
-          <w:szCs w:val="20"/>
-          <w:lang w:val="en-GB"/>
-        </w:rPr>
-      </w:pPr>
-      <w:r>
-        <w:rPr>
-          <w:b w:val="0"/>
-          <w:color w:val="EE0000"/>
-          <w:sz w:val="20"/>
-          <w:szCs w:val="20"/>
-          <w:lang w:val="en-GB"/>
-        </w:rPr>
-        <w:t xml:space="preserve">The conference </w:t>
-      </w:r>
-      <w:r>
-        <w:rPr>
-          <w:b w:val="0"/>
-          <w:color w:val="EE0000"/>
-          <w:sz w:val="20"/>
-          <w:szCs w:val="20"/>
-          <w:lang w:val="en-GB"/>
-        </w:rPr>
-        <w:t>took</w:t>
-      </w:r>
-      <w:r>
-        <w:rPr>
-          <w:b w:val="0"/>
-          <w:color w:val="EE0000"/>
-          <w:sz w:val="20"/>
-          <w:szCs w:val="20"/>
-          <w:lang w:val="en-GB"/>
-        </w:rPr>
-        <w:t xml:space="preserve"> place from 17 to 19 September 2025 at the University of Potsdam, Campus III – </w:t>
-      </w:r>
-      <w:proofErr w:type="spellStart"/>
-      <w:r>
-        <w:rPr>
-          <w:b w:val="0"/>
-          <w:color w:val="EE0000"/>
-          <w:sz w:val="20"/>
-          <w:szCs w:val="20"/>
-          <w:lang w:val="en-GB"/>
-        </w:rPr>
-        <w:t>Griebnitzsee</w:t>
-      </w:r>
-      <w:proofErr w:type="spellEnd"/>
-      <w:r>
-        <w:rPr>
-          <w:b w:val="0"/>
-          <w:color w:val="EE0000"/>
-          <w:sz w:val="20"/>
-          <w:szCs w:val="20"/>
-          <w:lang w:val="en-GB"/>
-        </w:rPr>
-        <w:t xml:space="preserve"> and is organised by </w:t>
-      </w:r>
-      <w:r>
-        <w:rPr>
-          <w:b w:val="0"/>
-          <w:color w:val="EE0000"/>
-          <w:sz w:val="20"/>
-          <w:szCs w:val="20"/>
-          <w:lang w:val="en-GB"/>
-        </w:rPr>
-        <w:t xml:space="preserve">technical committee of Environmental </w:t>
-      </w:r>
-      <w:proofErr w:type="spellStart"/>
-      <w:r>
-        <w:rPr>
-          <w:b w:val="0"/>
-          <w:color w:val="EE0000"/>
-          <w:sz w:val="20"/>
-          <w:szCs w:val="20"/>
-          <w:lang w:val="en-GB"/>
-        </w:rPr>
-        <w:t>Informativs</w:t>
-      </w:r>
-      <w:proofErr w:type="spellEnd"/>
-      <w:r>
-        <w:rPr>
-          <w:b w:val="0"/>
-          <w:color w:val="EE0000"/>
-          <w:sz w:val="20"/>
-          <w:szCs w:val="20"/>
-          <w:lang w:val="en-GB"/>
-        </w:rPr>
-        <w:t xml:space="preserve"> </w:t>
-      </w:r>
-      <w:r>
-        <w:rPr>
-          <w:b w:val="0"/>
-          <w:color w:val="EE0000"/>
-          <w:sz w:val="20"/>
-          <w:szCs w:val="20"/>
-          <w:lang w:val="en-GB"/>
-        </w:rPr>
-        <w:t>of the Gesellschaft für Informatik e.V. (GI). The University of Potsdam, together with the Hasso Plattner Institute (HPI), acts as an important host partner.</w:t>
-      </w:r>
-    </w:p>
-    <w:p>
-      <w:pPr>
-        <w:pStyle w:val="Zwischenberschriften"/>
-        <w:jc w:val="both"/>
-        <w:rPr>
-          <w:b w:val="0"/>
-          <w:color w:val="EE0000"/>
-          <w:sz w:val="20"/>
-          <w:szCs w:val="20"/>
-          <w:lang w:val="en-GB"/>
-        </w:rPr>
-      </w:pPr>
-    </w:p>
-    <w:p>
-      <w:pPr>
-        <w:pStyle w:val="Zwischenberschriften"/>
-        <w:jc w:val="both"/>
-        <w:rPr>
-          <w:b w:val="0"/>
-          <w:color w:val="EE0000"/>
-          <w:sz w:val="20"/>
-          <w:szCs w:val="20"/>
-          <w:lang w:val="en-GB"/>
-        </w:rPr>
-      </w:pPr>
-      <w:r>
-        <w:rPr>
-          <w:b w:val="0"/>
-          <w:color w:val="EE0000"/>
-          <w:sz w:val="20"/>
-          <w:szCs w:val="20"/>
-          <w:lang w:val="en-GB"/>
-        </w:rPr>
-        <w:t>For almost four decades, the EnviroInfo series has been bringing together national and international players who are involved in applied computer science and sustainability – with the aim of making concrete contributions to a sustainable society through information and communication technologies.</w:t>
-      </w:r>
-    </w:p>
-    <w:p>
-      <w:pPr>
-        <w:pStyle w:val="Zwischenberschriften"/>
-        <w:jc w:val="both"/>
-        <w:rPr>
-          <w:b w:val="0"/>
-          <w:color w:val="EE0000"/>
-          <w:sz w:val="20"/>
-          <w:szCs w:val="20"/>
-          <w:lang w:val="en-GB"/>
-        </w:rPr>
-      </w:pPr>
-      <w:r>
-        <w:rPr>
-          <w:b w:val="0"/>
-          <w:color w:val="EE0000"/>
-          <w:sz w:val="20"/>
-          <w:szCs w:val="20"/>
-          <w:lang w:val="en-GB"/>
-        </w:rPr>
-        <w:t>The motto of EnviroInfo 2025 "Open Data, Open Science and Open Society for a Sustainable Future" illustrates the claim to understand openness as a central component of sustainable development. Open data creates transparency and forms the basis for informed decisions, open science promotes collaboration and accelerates innovation, and an open society strengthens participation and ensures that digital solutions are firmly anchored in society.</w:t>
-      </w:r>
-    </w:p>
-    <w:p>
-      <w:pPr>
-        <w:pStyle w:val="Zwischenberschriften"/>
-        <w:jc w:val="both"/>
-        <w:rPr>
-          <w:b w:val="0"/>
-          <w:color w:val="EE0000"/>
-          <w:sz w:val="20"/>
-          <w:szCs w:val="20"/>
-          <w:lang w:val="en-GB"/>
-        </w:rPr>
-      </w:pPr>
-    </w:p>
-    <w:p>
-      <w:pPr>
-        <w:pStyle w:val="Zwischenberschriften"/>
-        <w:jc w:val="both"/>
-        <w:rPr>
-          <w:b w:val="0"/>
-          <w:color w:val="EE0000"/>
-          <w:sz w:val="20"/>
-          <w:szCs w:val="20"/>
-          <w:lang w:val="en-GB"/>
-        </w:rPr>
-      </w:pPr>
-      <w:r>
-        <w:rPr>
-          <w:b w:val="0"/>
-          <w:color w:val="EE0000"/>
-          <w:sz w:val="20"/>
-          <w:szCs w:val="20"/>
-          <w:lang w:val="en-GB"/>
-        </w:rPr>
-        <w:t>With this volume, we would like to present contributions that are still in development or show initial results, as well as innovative approaches that combine interdisciplinarity and practical relevance. They take up the motto of the conference by showing how openness in data, science and society drives the further development of methods and technologies in environmental informatics. The variety ranges from green coding and sustainable digital systems to new forms of data infrastructure and practical applications that connect science, politics and society.</w:t>
-      </w:r>
-    </w:p>
-    <w:p>
-      <w:pPr>
-        <w:pStyle w:val="Zwischenberschriften"/>
-        <w:jc w:val="both"/>
-        <w:rPr>
-          <w:b w:val="0"/>
-          <w:color w:val="EE0000"/>
-          <w:sz w:val="20"/>
-          <w:szCs w:val="20"/>
-          <w:lang w:val="en-GB"/>
-        </w:rPr>
-      </w:pPr>
-    </w:p>
-    <w:p>
-      <w:pPr>
-        <w:pStyle w:val="Zwischenberschriften"/>
-        <w:jc w:val="both"/>
-        <w:rPr>
-          <w:b w:val="0"/>
-          <w:color w:val="EE0000"/>
-          <w:sz w:val="20"/>
-          <w:szCs w:val="20"/>
-          <w:lang w:val="en-GB"/>
-        </w:rPr>
-      </w:pPr>
-      <w:r>
-        <w:rPr>
-          <w:b w:val="0"/>
-          <w:color w:val="EE0000"/>
-          <w:sz w:val="20"/>
-          <w:szCs w:val="20"/>
-          <w:lang w:val="en-GB"/>
-        </w:rPr>
-        <w:t xml:space="preserve">Our special thanks go to all authors for their valuable contributions and to the members of the programme and organisation committee for their careful review. We would also like to thank our partners, especially the University of Potsdam and the Hasso Plattner Institute (HPI) as host institutions, the Gesellschaft für Informatik e.V., as well as our sponsors </w:t>
-      </w:r>
-      <w:proofErr w:type="spellStart"/>
-      <w:r>
-        <w:rPr>
-          <w:b w:val="0"/>
-          <w:color w:val="EE0000"/>
-          <w:sz w:val="20"/>
-          <w:szCs w:val="20"/>
-          <w:lang w:val="en-GB"/>
-        </w:rPr>
-        <w:t>Disy</w:t>
-      </w:r>
-      <w:proofErr w:type="spellEnd"/>
-      <w:r>
-        <w:rPr>
-          <w:b w:val="0"/>
-          <w:color w:val="EE0000"/>
-          <w:sz w:val="20"/>
-          <w:szCs w:val="20"/>
-          <w:lang w:val="en-GB"/>
-        </w:rPr>
-        <w:t xml:space="preserve"> </w:t>
-      </w:r>
-      <w:proofErr w:type="spellStart"/>
-      <w:r>
-        <w:rPr>
-          <w:b w:val="0"/>
-          <w:color w:val="EE0000"/>
-          <w:sz w:val="20"/>
-          <w:szCs w:val="20"/>
-          <w:lang w:val="en-GB"/>
-        </w:rPr>
-        <w:t>Informationssysteme</w:t>
-      </w:r>
-      <w:proofErr w:type="spellEnd"/>
-      <w:r>
-        <w:rPr>
-          <w:b w:val="0"/>
-          <w:color w:val="EE0000"/>
-          <w:sz w:val="20"/>
-          <w:szCs w:val="20"/>
-          <w:lang w:val="en-GB"/>
-        </w:rPr>
-        <w:t xml:space="preserve"> GmbH and Hewlett Packard Enterprise, who contributed significantly to the success of the conference with their commitment.</w:t>
-      </w:r>
-    </w:p>
-    <w:p>
-      <w:pPr>
-        <w:pStyle w:val="Zwischenberschriften"/>
-        <w:rPr>
-          <w:b w:val="0"/>
-          <w:color w:val="EE0000"/>
-          <w:sz w:val="20"/>
-          <w:szCs w:val="20"/>
-          <w:lang w:val="en-GB"/>
-        </w:rPr>
-      </w:pPr>
-    </w:p>
-    <w:p>
-      <w:pPr>
-        <w:pStyle w:val="Zwischenberschriften"/>
-        <w:rPr>
-          <w:b w:val="0"/>
-          <w:color w:val="EE0000"/>
-          <w:sz w:val="20"/>
-          <w:szCs w:val="20"/>
-          <w:lang w:val="en-GB"/>
-        </w:rPr>
-      </w:pPr>
-    </w:p>
-    <w:p>
-      <w:pPr>
-        <w:pStyle w:val="Zwischenberschriften"/>
-        <w:rPr>
-          <w:b w:val="0"/>
-          <w:color w:val="EE0000"/>
-          <w:sz w:val="20"/>
-          <w:szCs w:val="20"/>
-          <w:lang w:val="en-GB"/>
-        </w:rPr>
-      </w:pPr>
-      <w:r>
-        <w:rPr>
-          <w:b w:val="0"/>
-          <w:color w:val="EE0000"/>
-          <w:sz w:val="20"/>
-          <w:szCs w:val="20"/>
-          <w:lang w:val="en-GB"/>
-        </w:rPr>
-        <w:t>Potsdam, September 2025</w:t>
-      </w:r>
-    </w:p>
-    <w:p>
-      <w:pPr>
-        <w:pStyle w:val="Zwischenberschriften"/>
-        <w:rPr>
-          <w:b w:val="0"/>
-          <w:color w:val="EE0000"/>
-          <w:sz w:val="20"/>
-          <w:szCs w:val="20"/>
-          <w:lang w:val="en-GB"/>
-        </w:rPr>
-      </w:pPr>
-    </w:p>
-    <w:p>
-      <w:pPr>
-        <w:pStyle w:val="Zwischenberschriften"/>
-        <w:rPr>
-          <w:b w:val="0"/>
-          <w:color w:val="EE0000"/>
-          <w:sz w:val="20"/>
-          <w:szCs w:val="20"/>
-          <w:lang w:val="en-GB"/>
-        </w:rPr>
-      </w:pPr>
-    </w:p>
-    <w:p>
-      <w:pPr>
-        <w:pStyle w:val="Zwischenberschriften"/>
-        <w:rPr>
-          <w:b w:val="0"/>
-          <w:sz w:val="20"/>
-          <w:szCs w:val="20"/>
-          <w:lang w:val="en-US"/>
-        </w:rPr>
-      </w:pPr>
-      <w:r>
-        <w:rPr>
-          <w:b w:val="0"/>
-          <w:sz w:val="20"/>
-          <w:szCs w:val="20"/>
-          <w:lang w:val="en-US"/>
-        </w:rPr>
-        <w:t>On behalf of the organization Committee</w:t>
-      </w:r>
-    </w:p>
-    <w:p>
-      <w:pPr>
-        <w:pStyle w:val="Zwischenberschriften"/>
-        <w:rPr>
-          <w:b w:val="0"/>
-          <w:sz w:val="20"/>
-          <w:szCs w:val="20"/>
-          <w:lang w:val="en-US"/>
-        </w:rPr>
-      </w:pPr>
-      <w:r>
-        <w:rPr>
-          <w:b w:val="0"/>
-          <w:sz w:val="20"/>
-          <w:szCs w:val="20"/>
-          <w:lang w:val="en-US"/>
-        </w:rPr>
-        <w:t>Volker Wohlgemuth, Conference President</w:t>
-      </w:r>
-    </w:p>
-    <w:p>
-      <w:pPr>
-        <w:pStyle w:val="Zwischenberschriften"/>
-        <w:rPr>
-          <w:lang w:val="en-US"/>
-        </w:rPr>
-      </w:pPr>
-      <w:r>
-        <w:rPr>
+          <w:sz w:val="20"/>
+          <w:szCs w:val="20"/>
           <w:lang w:val="en-US"/>
         </w:rPr>
         <w:br w:type="page"/>
       </w:r>
       <w:r>
-        <w:rPr>
-          <w:lang w:val="en-US"/>
-        </w:rPr>
         <w:lastRenderedPageBreak/>
         <w:t>Sponsor</w:t>
       </w:r>
       <w:r>
-        <w:rPr>
-          <w:lang w:val="en-US"/>
-        </w:rPr>
         <w:t>s</w:t>
       </w:r>
     </w:p>
@@ -2169,6 +2906,9 @@
         <w:tabs>
           <w:tab w:val="left" w:pos="142"/>
         </w:tabs>
+        <w:rPr>
+          <w:lang w:val="de-DE"/>
+        </w:rPr>
       </w:pPr>
     </w:p>
     <w:p>
@@ -2214,169 +2954,8 @@
               <w:tabs>
                 <w:tab w:val="left" w:pos="142"/>
               </w:tabs>
-              <w:rPr>
-                <w:color w:val="EE0000"/>
-                <w:lang w:val="en-GB"/>
-              </w:rPr>
-            </w:pPr>
-            <w:proofErr w:type="spellStart"/>
-            <w:r>
-              <w:rPr>
-                <w:color w:val="EE0000"/>
-                <w:lang w:val="en-GB"/>
-              </w:rPr>
-              <w:t>Disy</w:t>
-            </w:r>
-            <w:proofErr w:type="spellEnd"/>
-            <w:r>
-              <w:rPr>
-                <w:color w:val="EE0000"/>
-                <w:lang w:val="en-GB"/>
-              </w:rPr>
-              <w:t xml:space="preserve"> </w:t>
-            </w:r>
-            <w:proofErr w:type="spellStart"/>
-            <w:r>
-              <w:rPr>
-                <w:color w:val="EE0000"/>
-                <w:lang w:val="en-GB"/>
-              </w:rPr>
-              <w:t>Informationssysteme</w:t>
-            </w:r>
-            <w:proofErr w:type="spellEnd"/>
-            <w:r>
-              <w:rPr>
-                <w:color w:val="EE0000"/>
-                <w:lang w:val="en-GB"/>
-              </w:rPr>
-              <w:t xml:space="preserve"> GmbH</w:t>
-            </w:r>
-          </w:p>
-        </w:tc>
-        <w:tc>
-          <w:tcPr>
-            <w:tcW w:w="3084" w:type="dxa"/>
-          </w:tcPr>
-          <w:p>
-            <w:pPr>
-              <w:tabs>
-                <w:tab w:val="left" w:pos="142"/>
-              </w:tabs>
-              <w:jc w:val="right"/>
-              <w:rPr>
-                <w:color w:val="EE0000"/>
-                <w:lang w:val="de-AT"/>
-              </w:rPr>
             </w:pPr>
             <w:r>
-              <w:rPr>
-                <w:noProof/>
-                <w:color w:val="EE0000"/>
-                <w:lang w:val="de-DE"/>
-              </w:rPr>
-              <w:drawing>
-                <wp:inline distT="0" distB="0" distL="0" distR="0" wp14:anchorId="24515836" wp14:editId="6E3527A7">
-                  <wp:extent cx="635719" cy="386297"/>
-                  <wp:effectExtent l="0" t="0" r="0" b="0"/>
-                  <wp:docPr id="2" name="Bild 2"/>
-                  <wp:cNvGraphicFramePr>
-                    <a:graphicFrameLocks xmlns:a="http://schemas.openxmlformats.org/drawingml/2006/main" noChangeAspect="1"/>
-                  </wp:cNvGraphicFramePr>
-                  <a:graphic xmlns:a="http://schemas.openxmlformats.org/drawingml/2006/main">
-                    <a:graphicData uri="http://schemas.openxmlformats.org/drawingml/2006/picture">
-                      <pic:pic xmlns:pic="http://schemas.openxmlformats.org/drawingml/2006/picture">
-                        <pic:nvPicPr>
-                          <pic:cNvPr id="2" name="Bild 2"/>
-                          <pic:cNvPicPr>
-                            <a:picLocks noChangeAspect="1" noChangeArrowheads="1"/>
-                          </pic:cNvPicPr>
-                        </pic:nvPicPr>
-                        <pic:blipFill>
-                          <a:blip r:embed="rId11" cstate="print">
-                            <a:extLst>
-                              <a:ext uri="{28A0092B-C50C-407E-A947-70E740481C1C}">
-                                <a14:useLocalDpi xmlns:a14="http://schemas.microsoft.com/office/drawing/2010/main" val="0"/>
-                              </a:ext>
-                            </a:extLst>
-                          </a:blip>
-                          <a:stretch>
-                            <a:fillRect/>
-                          </a:stretch>
-                        </pic:blipFill>
-                        <pic:spPr bwMode="auto">
-                          <a:xfrm>
-                            <a:off x="0" y="0"/>
-                            <a:ext cx="664582" cy="403836"/>
-                          </a:xfrm>
-                          <a:prstGeom prst="rect">
-                            <a:avLst/>
-                          </a:prstGeom>
-                          <a:noFill/>
-                          <a:ln>
-                            <a:noFill/>
-                          </a:ln>
-                        </pic:spPr>
-                      </pic:pic>
-                    </a:graphicData>
-                  </a:graphic>
-                </wp:inline>
-              </w:drawing>
-            </w:r>
-          </w:p>
-        </w:tc>
-      </w:tr>
-      <w:tr>
-        <w:tc>
-          <w:tcPr>
-            <w:tcW w:w="4395" w:type="dxa"/>
-          </w:tcPr>
-          <w:p>
-            <w:pPr>
-              <w:tabs>
-                <w:tab w:val="left" w:pos="142"/>
-              </w:tabs>
-              <w:rPr>
-                <w:color w:val="EE0000"/>
-                <w:lang w:val="de-AT"/>
-              </w:rPr>
-            </w:pPr>
-          </w:p>
-        </w:tc>
-        <w:tc>
-          <w:tcPr>
-            <w:tcW w:w="3084" w:type="dxa"/>
-          </w:tcPr>
-          <w:p>
-            <w:pPr>
-              <w:tabs>
-                <w:tab w:val="left" w:pos="142"/>
-              </w:tabs>
-              <w:rPr>
-                <w:color w:val="EE0000"/>
-                <w:lang w:val="de-AT"/>
-              </w:rPr>
-            </w:pPr>
-          </w:p>
-        </w:tc>
-      </w:tr>
-      <w:tr>
-        <w:tc>
-          <w:tcPr>
-            <w:tcW w:w="4395" w:type="dxa"/>
-          </w:tcPr>
-          <w:p>
-            <w:pPr>
-              <w:tabs>
-                <w:tab w:val="left" w:pos="142"/>
-              </w:tabs>
-              <w:rPr>
-                <w:color w:val="EE0000"/>
-              </w:rPr>
-            </w:pPr>
-            <w:r>
-              <w:rPr>
-                <w:color w:val="EE0000"/>
-              </w:rPr>
               <w:t>Hewlett Packard Enterprise</w:t>
             </w:r>
           </w:p>
@@ -2392,14 +2971,12 @@
               </w:tabs>
               <w:jc w:val="right"/>
               <w:rPr>
-                <w:color w:val="EE0000"/>
                 <w:lang w:val="de-AT"/>
               </w:rPr>
             </w:pPr>
             <w:r>
               <w:rPr>
                 <w:noProof/>
-                <w:color w:val="EE0000"/>
                 <w:lang w:val="de-AT"/>
               </w:rPr>
               <w:drawing>
@@ -2420,7 +2997,7 @@
                           </pic:cNvPicPr>
                         </pic:nvPicPr>
                         <pic:blipFill>
-                          <a:blip r:embed="rId12" cstate="print">
+                          <a:blip r:embed="rId11" cstate="print">
                             <a:extLst>
                               <a:ext uri="{28A0092B-C50C-407E-A947-70E740481C1C}">
                                 <a14:useLocalDpi xmlns:a14="http://schemas.microsoft.com/office/drawing/2010/main" val="0"/>
@@ -2461,7 +3038,6 @@
                 <w:tab w:val="left" w:pos="142"/>
               </w:tabs>
               <w:rPr>
-                <w:color w:val="EE0000"/>
                 <w:lang w:val="de-AT"/>
               </w:rPr>
             </w:pPr>
@@ -2478,7 +3054,6 @@
               </w:tabs>
               <w:jc w:val="right"/>
               <w:rPr>
-                <w:color w:val="EE0000"/>
                 <w:lang w:val="de-AT"/>
               </w:rPr>
             </w:pPr>
@@ -2496,13 +3071,11 @@
                 <w:tab w:val="left" w:pos="142"/>
               </w:tabs>
               <w:rPr>
-                <w:color w:val="EE0000"/>
                 <w:lang w:val="de-AT"/>
               </w:rPr>
             </w:pPr>
             <w:r>
               <w:rPr>
-                <w:color w:val="EE0000"/>
                 <w:lang w:val="de-AT"/>
               </w:rPr>
               <w:t xml:space="preserve">German </w:t>
@@ -2510,7 +3083,6 @@
             <w:proofErr w:type="spellStart"/>
             <w:r>
               <w:rPr>
-                <w:color w:val="EE0000"/>
                 <w:lang w:val="de-AT"/>
               </w:rPr>
               <w:t>Informatics</w:t>
@@ -2518,7 +3090,6 @@
             <w:proofErr w:type="spellEnd"/>
             <w:r>
               <w:rPr>
-                <w:color w:val="EE0000"/>
                 <w:lang w:val="de-AT"/>
               </w:rPr>
               <w:t xml:space="preserve"> Society</w:t>
@@ -2536,14 +3107,12 @@
               </w:tabs>
               <w:jc w:val="right"/>
               <w:rPr>
-                <w:color w:val="EE0000"/>
                 <w:lang w:val="de-AT"/>
               </w:rPr>
             </w:pPr>
             <w:r>
               <w:rPr>
                 <w:noProof/>
-                <w:color w:val="EE0000"/>
                 <w:lang w:val="de-DE"/>
               </w:rPr>
               <w:drawing>
@@ -2564,7 +3133,7 @@
                           </pic:cNvPicPr>
                         </pic:nvPicPr>
                         <pic:blipFill>
-                          <a:blip r:embed="rId13" cstate="print">
+                          <a:blip r:embed="rId12" cstate="print">
                             <a:extLst>
                               <a:ext uri="{28A0092B-C50C-407E-A947-70E740481C1C}">
                                 <a14:useLocalDpi xmlns:a14="http://schemas.microsoft.com/office/drawing/2010/main" val="0"/>
@@ -2608,7 +3177,6 @@
                 <w:tab w:val="left" w:pos="142"/>
               </w:tabs>
               <w:rPr>
-                <w:color w:val="EE0000"/>
                 <w:lang w:val="de-AT"/>
               </w:rPr>
             </w:pPr>
@@ -2625,7 +3193,6 @@
               </w:tabs>
               <w:jc w:val="right"/>
               <w:rPr>
-                <w:color w:val="EE0000"/>
                 <w:lang w:val="de-AT"/>
               </w:rPr>
             </w:pPr>
@@ -2633,6 +3200,9 @@
         </w:tc>
       </w:tr>
       <w:tr>
+        <w:trPr>
+          <w:trHeight w:val="60"/>
+        </w:trPr>
         <w:tc>
           <w:tcPr>
             <w:tcW w:w="4395" w:type="dxa"/>
@@ -2643,7 +3213,6 @@
                 <w:tab w:val="left" w:pos="142"/>
               </w:tabs>
               <w:rPr>
-                <w:color w:val="EE0000"/>
                 <w:lang w:val="de-AT"/>
               </w:rPr>
             </w:pPr>
@@ -2660,7 +3229,6 @@
               </w:tabs>
               <w:jc w:val="right"/>
               <w:rPr>
-                <w:color w:val="EE0000"/>
                 <w:lang w:val="de-AT"/>
               </w:rPr>
             </w:pPr>
@@ -2776,7 +3344,28 @@
                 <w:kern w:val="2"/>
                 <w14:ligatures w14:val="standardContextual"/>
               </w:rPr>
-              <w:t>HTW Berlin, University of Applied Sciences, Berlin, Germany</w:t>
+              <w:t>HTW Berlin – University of Applied Sciences</w:t>
+            </w:r>
+            <w:r>
+              <w:rPr>
+                <w:kern w:val="2"/>
+                <w14:ligatures w14:val="standardContextual"/>
+              </w:rPr>
+              <w:t>,</w:t>
+            </w:r>
+            <w:r>
+              <w:rPr>
+                <w:kern w:val="2"/>
+                <w14:ligatures w14:val="standardContextual"/>
+              </w:rPr>
+              <w:t xml:space="preserve"> Berlin</w:t>
+            </w:r>
+            <w:r>
+              <w:rPr>
+                <w:kern w:val="2"/>
+                <w14:ligatures w14:val="standardContextual"/>
+              </w:rPr>
+              <w:t xml:space="preserve"> , Germany</w:t>
             </w:r>
           </w:p>
         </w:tc>
@@ -2836,7 +3425,21 @@
                 <w:kern w:val="2"/>
                 <w14:ligatures w14:val="standardContextual"/>
               </w:rPr>
-              <w:t>Trier University of Applied Sciences, Germany</w:t>
+              <w:t>Trier University of Applied Sciences,</w:t>
+            </w:r>
+            <w:r>
+              <w:rPr>
+                <w:kern w:val="2"/>
+                <w14:ligatures w14:val="standardContextual"/>
+              </w:rPr>
+              <w:t xml:space="preserve"> Trier,</w:t>
+            </w:r>
+            <w:r>
+              <w:rPr>
+                <w:kern w:val="2"/>
+                <w14:ligatures w14:val="standardContextual"/>
+              </w:rPr>
+              <w:t xml:space="preserve"> Germany</w:t>
             </w:r>
           </w:p>
           <w:p>
@@ -2895,7 +3498,21 @@
                 <w:kern w:val="2"/>
                 <w14:ligatures w14:val="standardContextual"/>
               </w:rPr>
-              <w:t>, Germany</w:t>
+              <w:t>,</w:t>
+            </w:r>
+            <w:r>
+              <w:rPr>
+                <w:kern w:val="2"/>
+                <w14:ligatures w14:val="standardContextual"/>
+              </w:rPr>
+              <w:t xml:space="preserve"> Minden,</w:t>
+            </w:r>
+            <w:r>
+              <w:rPr>
+                <w:kern w:val="2"/>
+                <w14:ligatures w14:val="standardContextual"/>
+              </w:rPr>
+              <w:t xml:space="preserve"> Germany</w:t>
             </w:r>
           </w:p>
         </w:tc>
@@ -2925,8 +3542,17 @@
                 <w:kern w:val="2"/>
                 <w14:ligatures w14:val="standardContextual"/>
               </w:rPr>
-              <w:t>Malgorzata Burchard-Dziubinska</w:t>
+              <w:t>Małgorzata Burchard-</w:t>
             </w:r>
+            <w:proofErr w:type="spellStart"/>
+            <w:r>
+              <w:rPr>
+                <w:kern w:val="2"/>
+                <w14:ligatures w14:val="standardContextual"/>
+              </w:rPr>
+              <w:t>Dziubińska</w:t>
+            </w:r>
+            <w:proofErr w:type="spellEnd"/>
           </w:p>
         </w:tc>
         <w:tc>
@@ -2955,7 +3581,53 @@
                 <w:kern w:val="2"/>
                 <w14:ligatures w14:val="standardContextual"/>
               </w:rPr>
-              <w:t>University of Lodz, Lodz, Poland</w:t>
+              <w:t xml:space="preserve">University of </w:t>
+            </w:r>
+            <w:proofErr w:type="spellStart"/>
+            <w:r>
+              <w:rPr>
+                <w:kern w:val="2"/>
+                <w14:ligatures w14:val="standardContextual"/>
+              </w:rPr>
+              <w:t>Łódź</w:t>
+            </w:r>
+            <w:proofErr w:type="spellEnd"/>
+            <w:r>
+              <w:rPr>
+                <w:kern w:val="2"/>
+                <w14:ligatures w14:val="standardContextual"/>
+              </w:rPr>
+              <w:t>,</w:t>
+            </w:r>
+            <w:r>
+              <w:rPr>
+                <w:kern w:val="2"/>
+                <w14:ligatures w14:val="standardContextual"/>
+              </w:rPr>
+              <w:t xml:space="preserve"> </w:t>
+            </w:r>
+            <w:proofErr w:type="spellStart"/>
+            <w:r>
+              <w:rPr>
+                <w:kern w:val="2"/>
+                <w14:ligatures w14:val="standardContextual"/>
+              </w:rPr>
+              <w:t>Łódź</w:t>
+            </w:r>
+            <w:proofErr w:type="spellEnd"/>
+            <w:r>
+              <w:rPr>
+                <w:kern w:val="2"/>
+                <w14:ligatures w14:val="standardContextual"/>
+              </w:rPr>
+              <w:t>,</w:t>
+            </w:r>
+            <w:r>
+              <w:rPr>
+                <w:kern w:val="2"/>
+                <w14:ligatures w14:val="standardContextual"/>
+              </w:rPr>
+              <w:t xml:space="preserve"> Poland</w:t>
             </w:r>
           </w:p>
         </w:tc>
@@ -3068,7 +3740,13 @@
         <w:jc w:val="both"/>
       </w:pPr>
       <w:r>
-        <w:t>Andi H. Widok, HTW Berlin, University of Applied Sciences, Berlin, Germany</w:t>
+        <w:t xml:space="preserve">Andi H. Widok, </w:t>
+      </w:r>
+      <w:r>
+        <w:t>HTW Berlin – University of Applied Sciences</w:t>
+      </w:r>
+      <w:r>
+        <w:t>, Berlin, Germany</w:t>
       </w:r>
     </w:p>
     <w:p>
@@ -3135,12 +3813,10 @@
         <w:t xml:space="preserve">Benjamin Wagner </w:t>
       </w:r>
       <w:proofErr w:type="spellStart"/>
-      <w:proofErr w:type="gramStart"/>
       <w:r>
         <w:t>vom</w:t>
       </w:r>
       <w:proofErr w:type="spellEnd"/>
-      <w:proofErr w:type="gramEnd"/>
       <w:r>
         <w:t xml:space="preserve"> Berg, University of Applied Sciences Bremerhaven, Germany</w:t>
       </w:r>
@@ -3180,7 +3856,13 @@
         <w:jc w:val="both"/>
       </w:pPr>
       <w:r>
-        <w:t>Dennis Junger, HTW Berlin, University of Applied Sciences, Berlin, Germany</w:t>
+        <w:t xml:space="preserve">Dennis Junger, </w:t>
+      </w:r>
+      <w:r>
+        <w:t>HTW Berlin – University of Applied Sciences</w:t>
+      </w:r>
+      <w:r>
+        <w:t>, Berlin, Germany</w:t>
       </w:r>
     </w:p>
     <w:p>
@@ -3204,7 +3886,13 @@
       </w:r>
       <w:proofErr w:type="spellEnd"/>
       <w:r>
-        <w:t>, HTW Berlin, University of Applied Sciences, Berlin, Germany</w:t>
+        <w:t xml:space="preserve">, </w:t>
+      </w:r>
+      <w:r>
+        <w:t>HTW Berlin – University of Applied Sciences</w:t>
+      </w:r>
+      <w:r>
+        <w:t>, Berlin, Germany</w:t>
       </w:r>
     </w:p>
     <w:p>
@@ -3278,7 +3966,13 @@
         <w:jc w:val="both"/>
       </w:pPr>
       <w:r>
-        <w:t>Jochen Wittmann, HTW Berlin, University of Applied Sciences, Berlin, Germany</w:t>
+        <w:t xml:space="preserve">Jochen Wittmann, </w:t>
+      </w:r>
+      <w:r>
+        <w:t>HTW Berlin – University of Applied Sciences.</w:t>
+      </w:r>
+      <w:r>
+        <w:t>, Berlin, Germany</w:t>
       </w:r>
     </w:p>
     <w:p>
@@ -3342,7 +4036,13 @@
         <w:jc w:val="both"/>
       </w:pPr>
       <w:r>
-        <w:t>Martina Willenbacher, HTW Berlin, University of Applied Sciences, Berlin, Germany</w:t>
+        <w:t xml:space="preserve">Martina Willenbacher, </w:t>
+      </w:r>
+      <w:r>
+        <w:t>HTW Berlin – University of Applied Sciences.</w:t>
+      </w:r>
+      <w:r>
+        <w:t>, Berlin, Germany</w:t>
       </w:r>
     </w:p>
     <w:p>
@@ -3433,15 +4133,6 @@
           <w:szCs w:val="28"/>
         </w:rPr>
       </w:pPr>
-    </w:p>
-    <w:p>
-      <w:pPr>
-        <w:rPr>
-          <w:b/>
-          <w:sz w:val="28"/>
-          <w:szCs w:val="28"/>
-        </w:rPr>
-      </w:pPr>
       <w:r>
         <w:br w:type="page"/>
       </w:r>
@@ -3453,15 +4144,13 @@
           <w:lang w:val="en-US"/>
         </w:rPr>
       </w:pPr>
-      <w:proofErr w:type="spellStart"/>
       <w:r>
         <w:rPr>
           <w:lang w:val="en-US"/>
         </w:rPr>
         <w:lastRenderedPageBreak/>
-        <w:t>Organising</w:t>
-      </w:r>
-      <w:proofErr w:type="spellEnd"/>
+        <w:t>Organizing</w:t>
+      </w:r>
       <w:r>
         <w:rPr>
           <w:lang w:val="en-US"/>
@@ -3506,14 +4195,12 @@
           <w:p>
             <w:pPr>
               <w:rPr>
-                <w:color w:val="EE0000"/>
                 <w:szCs w:val="24"/>
                 <w:lang w:val="de-DE"/>
               </w:rPr>
             </w:pPr>
             <w:r>
               <w:rPr>
-                <w:color w:val="EE0000"/>
                 <w:szCs w:val="24"/>
                 <w:lang w:val="de-DE"/>
               </w:rPr>
@@ -3531,17 +4218,21 @@
               <w:rPr>
                 <w:b/>
                 <w:bCs/>
-                <w:color w:val="EE0000"/>
                 <w:sz w:val="24"/>
                 <w:szCs w:val="24"/>
               </w:rPr>
             </w:pPr>
             <w:r>
               <w:rPr>
-                <w:color w:val="EE0000"/>
                 <w:szCs w:val="24"/>
               </w:rPr>
-              <w:t>HTW Berlin, University of Applied Sciences, Berlin, Germany</w:t>
+              <w:t>HTW Berlin – University of Applied Sciences.</w:t>
+            </w:r>
+            <w:r>
+              <w:rPr>
+                <w:szCs w:val="24"/>
+              </w:rPr>
+              <w:t>, Berlin, Germany</w:t>
             </w:r>
           </w:p>
         </w:tc>
@@ -3559,14 +4250,12 @@
           <w:p>
             <w:pPr>
               <w:rPr>
-                <w:color w:val="EE0000"/>
                 <w:szCs w:val="24"/>
                 <w:lang w:val="de-DE"/>
               </w:rPr>
             </w:pPr>
             <w:r>
               <w:rPr>
-                <w:color w:val="EE0000"/>
                 <w:szCs w:val="24"/>
                 <w:lang w:val="de-DE"/>
               </w:rPr>
@@ -3582,13 +4271,11 @@
           <w:p>
             <w:pPr>
               <w:rPr>
-                <w:color w:val="EE0000"/>
                 <w:szCs w:val="24"/>
               </w:rPr>
             </w:pPr>
             <w:r>
               <w:rPr>
-                <w:color w:val="EE0000"/>
                 <w:szCs w:val="24"/>
               </w:rPr>
               <w:t>University of Applied Sciences Bielefeld, Germany</w:t>
@@ -3609,19 +4296,26 @@
           <w:p>
             <w:pPr>
               <w:rPr>
-                <w:color w:val="EE0000"/>
                 <w:szCs w:val="24"/>
                 <w:lang w:val="de-DE"/>
               </w:rPr>
             </w:pPr>
             <w:r>
               <w:rPr>
-                <w:color w:val="EE0000"/>
                 <w:szCs w:val="24"/>
                 <w:lang w:val="de-DE"/>
               </w:rPr>
-              <w:t>Max Westing</w:t>
+              <w:t>Małgorzata Burchard-</w:t>
             </w:r>
+            <w:proofErr w:type="spellStart"/>
+            <w:r>
+              <w:rPr>
+                <w:szCs w:val="24"/>
+                <w:lang w:val="de-DE"/>
+              </w:rPr>
+              <w:t>Dziubińska</w:t>
+            </w:r>
+            <w:proofErr w:type="spellEnd"/>
           </w:p>
         </w:tc>
         <w:tc>
@@ -3632,25 +4326,43 @@
           <w:p>
             <w:pPr>
               <w:rPr>
-                <w:color w:val="EE0000"/>
                 <w:szCs w:val="24"/>
               </w:rPr>
             </w:pPr>
             <w:r>
               <w:rPr>
-                <w:color w:val="EE0000"/>
                 <w:szCs w:val="24"/>
               </w:rPr>
-              <w:t>Trier University of Applied Sciences, Germany</w:t>
+              <w:t xml:space="preserve">University of </w:t>
             </w:r>
-          </w:p>
-          <w:p>
-            <w:pPr>
-              <w:rPr>
-                <w:color w:val="EE0000"/>
+            <w:proofErr w:type="spellStart"/>
+            <w:r>
+              <w:rPr>
                 <w:szCs w:val="24"/>
               </w:rPr>
-            </w:pPr>
+              <w:t>Łódź</w:t>
+            </w:r>
+            <w:proofErr w:type="spellEnd"/>
+            <w:r>
+              <w:rPr>
+                <w:szCs w:val="24"/>
+              </w:rPr>
+              <w:t xml:space="preserve">, </w:t>
+            </w:r>
+            <w:proofErr w:type="spellStart"/>
+            <w:r>
+              <w:rPr>
+                <w:szCs w:val="24"/>
+              </w:rPr>
+              <w:t>Łódź</w:t>
+            </w:r>
+            <w:proofErr w:type="spellEnd"/>
+            <w:r>
+              <w:rPr>
+                <w:szCs w:val="24"/>
+              </w:rPr>
+              <w:t>, Poland</w:t>
+            </w:r>
           </w:p>
         </w:tc>
       </w:tr>
@@ -3667,64 +4379,12 @@
           <w:p>
             <w:pPr>
               <w:rPr>
-                <w:color w:val="EE0000"/>
                 <w:szCs w:val="24"/>
                 <w:lang w:val="de-DE"/>
               </w:rPr>
             </w:pPr>
             <w:r>
               <w:rPr>
-                <w:color w:val="EE0000"/>
-                <w:szCs w:val="24"/>
-                <w:lang w:val="de-DE"/>
-              </w:rPr>
-              <w:t>Maximilian Höb</w:t>
-            </w:r>
-          </w:p>
-        </w:tc>
-        <w:tc>
-          <w:tcPr>
-            <w:tcW w:w="5256" w:type="dxa"/>
-            <w:vAlign w:val="center"/>
-          </w:tcPr>
-          <w:p>
-            <w:pPr>
-              <w:rPr>
-                <w:color w:val="EE0000"/>
-                <w:szCs w:val="24"/>
-              </w:rPr>
-            </w:pPr>
-            <w:r>
-              <w:rPr>
-                <w:color w:val="EE0000"/>
-                <w:szCs w:val="24"/>
-              </w:rPr>
-              <w:t>Leibniz Supercomputing Centre (LRZ), Bavarian Academy of Sciences, Germany</w:t>
-            </w:r>
-          </w:p>
-        </w:tc>
-      </w:tr>
-      <w:tr>
-        <w:trPr>
-          <w:trHeight w:val="460"/>
-          <w:tblCellSpacing w:w="15" w:type="dxa"/>
-        </w:trPr>
-        <w:tc>
-          <w:tcPr>
-            <w:tcW w:w="1798" w:type="dxa"/>
-            <w:vAlign w:val="center"/>
-          </w:tcPr>
-          <w:p>
-            <w:pPr>
-              <w:rPr>
-                <w:color w:val="EE0000"/>
-                <w:szCs w:val="24"/>
-                <w:lang w:val="de-DE"/>
-              </w:rPr>
-            </w:pPr>
-            <w:r>
-              <w:rPr>
-                <w:color w:val="EE0000"/>
                 <w:szCs w:val="24"/>
                 <w:lang w:val="de-DE"/>
               </w:rPr>
@@ -3740,13 +4400,11 @@
           <w:p>
             <w:pPr>
               <w:rPr>
-                <w:color w:val="EE0000"/>
                 <w:szCs w:val="24"/>
               </w:rPr>
             </w:pPr>
             <w:r>
               <w:rPr>
-                <w:color w:val="EE0000"/>
                 <w:szCs w:val="24"/>
               </w:rPr>
               <w:t>Trier University of Applied Sciences, Germany</w:t>
@@ -3755,7 +4413,6 @@
           <w:p>
             <w:pPr>
               <w:rPr>
-                <w:color w:val="EE0000"/>
                 <w:szCs w:val="24"/>
               </w:rPr>
             </w:pPr>
@@ -3775,14 +4432,12 @@
           <w:p>
             <w:pPr>
               <w:rPr>
-                <w:color w:val="EE0000"/>
                 <w:szCs w:val="24"/>
                 <w:lang w:val="de-DE"/>
               </w:rPr>
             </w:pPr>
             <w:r>
               <w:rPr>
-                <w:color w:val="EE0000"/>
                 <w:szCs w:val="24"/>
                 <w:lang w:val="de-DE"/>
               </w:rPr>
@@ -3798,54 +4453,18 @@
           <w:p>
             <w:pPr>
               <w:rPr>
-                <w:color w:val="EE0000"/>
                 <w:szCs w:val="24"/>
               </w:rPr>
             </w:pPr>
             <w:r>
               <w:rPr>
-                <w:color w:val="EE0000"/>
                 <w:szCs w:val="24"/>
               </w:rPr>
-              <w:t>HTW Berlin, University of Applied Sciences, Berlin, Germany</w:t>
+              <w:t>HTW Berlin – University of Applied Sciences, Berlin, Germany</w:t>
             </w:r>
           </w:p>
         </w:tc>
       </w:tr>
-      <w:tr>
-        <w:trPr>
-          <w:trHeight w:val="460"/>
-          <w:tblCellSpacing w:w="15" w:type="dxa"/>
-        </w:trPr>
-        <w:tc>
-          <w:tcPr>
-            <w:tcW w:w="1798" w:type="dxa"/>
-            <w:vAlign w:val="center"/>
-          </w:tcPr>
-          <w:p>
-            <w:pPr>
-              <w:rPr>
-                <w:color w:val="EE0000"/>
-                <w:szCs w:val="24"/>
-              </w:rPr>
-            </w:pPr>
-          </w:p>
-        </w:tc>
-        <w:tc>
-          <w:tcPr>
-            <w:tcW w:w="5256" w:type="dxa"/>
-            <w:vAlign w:val="center"/>
-          </w:tcPr>
-          <w:p>
-            <w:pPr>
-              <w:rPr>
-                <w:color w:val="EE0000"/>
-                <w:szCs w:val="24"/>
-              </w:rPr>
-            </w:pPr>
-          </w:p>
-        </w:tc>
-      </w:tr>
     </w:tbl>
     <w:p>
       <w:pPr>
@@ -3856,12 +4475,7 @@
       </w:pPr>
     </w:p>
     <w:sectPr>
-      <w:headerReference w:type="even" r:id="rId14"/>
-      <w:headerReference w:type="default" r:id="rId15"/>
-      <w:footerReference w:type="even" r:id="rId16"/>
-      <w:footerReference w:type="default" r:id="rId17"/>
-      <w:headerReference w:type="first" r:id="rId18"/>
-      <w:footerReference w:type="first" r:id="rId19"/>
+      <w:headerReference w:type="first" r:id="rId13"/>
       <w:footnotePr>
         <w:numRestart w:val="eachSect"/>
       </w:footnotePr>
@@ -3894,36 +4508,6 @@
 </w:endnotes>
 </file>
 
-<file path=word/footer1.xml><?xml version="1.0" encoding="utf-8"?>
-<w:ftr xmlns:wpc="http://schemas.microsoft.com/office/word/2010/wordprocessingCanvas" xmlns:cx="http://schemas.microsoft.com/office/drawing/2014/chartex" xmlns:cx1="http://schemas.microsoft.com/office/drawing/2015/9/8/chartex" xmlns:cx2="http://schemas.microsoft.com/office/drawing/2015/10/21/chartex" xmlns:cx3="http://schemas.microsoft.com/office/drawing/2016/5/9/chartex" xmlns:cx4="http://schemas.microsoft.com/office/drawing/2016/5/10/chartex" xmlns:cx5="http://schemas.microsoft.com/office/drawing/2016/5/11/chartex" xmlns:cx6="http://schemas.microsoft.com/office/drawing/2016/5/12/chartex" xmlns:cx7="http://schemas.microsoft.com/office/drawing/2016/5/13/chartex" xmlns:cx8="http://schemas.microsoft.com/office/drawing/2016/5/14/chartex" xmlns:mc="http://schemas.openxmlformats.org/markup-compatibility/2006" xmlns:aink="http://schemas.microsoft.com/office/drawing/2016/ink" xmlns:am3d="http://schemas.microsoft.com/office/drawing/2017/model3d" xmlns:o="urn:schemas-microsoft-com:office:office" xmlns:oel="http://schemas.microsoft.com/office/2019/extlst" xmlns:r="http://schemas.openxmlformats.org/officeDocument/2006/relationships" xmlns:m="http://schemas.openxmlformats.org/officeDocument/2006/math" xmlns:v="urn:schemas-microsoft-com:vml" xmlns:wp14="http://schemas.microsoft.com/office/word/2010/wordprocessingDrawing" xmlns:wp="http://schemas.openxmlformats.org/drawingml/2006/wordprocessingDrawing" xmlns:w10="urn:schemas-microsoft-com:office:word" xmlns:w="http://schemas.openxmlformats.org/wordprocessingml/2006/main" xmlns:w14="http://schemas.microsoft.com/office/word/2010/wordml" xmlns:w15="http://schemas.microsoft.com/office/word/2012/wordml" xmlns:w16cex="http://schemas.microsoft.com/office/word/2018/wordml/cex" xmlns:w16cid="http://schemas.microsoft.com/office/word/2016/wordml/cid" xmlns:w16="http://schemas.microsoft.com/office/word/2018/wordml" xmlns:w16du="http://schemas.microsoft.com/office/word/2023/wordml/word16du" xmlns:w16sdtdh="http://schemas.microsoft.com/office/word/2020/wordml/sdtdatahash" xmlns:w16sdtfl="http://schemas.microsoft.com/office/word/2024/wordml/sdtformatlock" xmlns:w16se="http://schemas.microsoft.com/office/word/2015/wordml/symex" xmlns:wpg="http://schemas.microsoft.com/office/word/2010/wordprocessingGroup" xmlns:wpi="http://schemas.microsoft.com/office/word/2010/wordprocessingInk" xmlns:wne="http://schemas.microsoft.com/office/word/2006/wordml" xmlns:wps="http://schemas.microsoft.com/office/word/2010/wordprocessingShape" mc:Ignorable="w14 w15 w16se w16cid w16 w16cex w16sdtdh w16sdtfl w16du wp14">
-  <w:p>
-    <w:pPr>
-      <w:pStyle w:val="Fuzeile"/>
-    </w:pPr>
-  </w:p>
-</w:ftr>
-</file>
-
-<file path=word/footer2.xml><?xml version="1.0" encoding="utf-8"?>
-<w:ftr xmlns:wpc="http://schemas.microsoft.com/office/word/2010/wordprocessingCanvas" xmlns:cx="http://schemas.microsoft.com/office/drawing/2014/chartex" xmlns:cx1="http://schemas.microsoft.com/office/drawing/2015/9/8/chartex" xmlns:cx2="http://schemas.microsoft.com/office/drawing/2015/10/21/chartex" xmlns:cx3="http://schemas.microsoft.com/office/drawing/2016/5/9/chartex" xmlns:cx4="http://schemas.microsoft.com/office/drawing/2016/5/10/chartex" xmlns:cx5="http://schemas.microsoft.com/office/drawing/2016/5/11/chartex" xmlns:cx6="http://schemas.microsoft.com/office/drawing/2016/5/12/chartex" xmlns:cx7="http://schemas.microsoft.com/office/drawing/2016/5/13/chartex" xmlns:cx8="http://schemas.microsoft.com/office/drawing/2016/5/14/chartex" xmlns:mc="http://schemas.openxmlformats.org/markup-compatibility/2006" xmlns:aink="http://schemas.microsoft.com/office/drawing/2016/ink" xmlns:am3d="http://schemas.microsoft.com/office/drawing/2017/model3d" xmlns:o="urn:schemas-microsoft-com:office:office" xmlns:oel="http://schemas.microsoft.com/office/2019/extlst" xmlns:r="http://schemas.openxmlformats.org/officeDocument/2006/relationships" xmlns:m="http://schemas.openxmlformats.org/officeDocument/2006/math" xmlns:v="urn:schemas-microsoft-com:vml" xmlns:wp14="http://schemas.microsoft.com/office/word/2010/wordprocessingDrawing" xmlns:wp="http://schemas.openxmlformats.org/drawingml/2006/wordprocessingDrawing" xmlns:w10="urn:schemas-microsoft-com:office:word" xmlns:w="http://schemas.openxmlformats.org/wordprocessingml/2006/main" xmlns:w14="http://schemas.microsoft.com/office/word/2010/wordml" xmlns:w15="http://schemas.microsoft.com/office/word/2012/wordml" xmlns:w16cex="http://schemas.microsoft.com/office/word/2018/wordml/cex" xmlns:w16cid="http://schemas.microsoft.com/office/word/2016/wordml/cid" xmlns:w16="http://schemas.microsoft.com/office/word/2018/wordml" xmlns:w16du="http://schemas.microsoft.com/office/word/2023/wordml/word16du" xmlns:w16sdtdh="http://schemas.microsoft.com/office/word/2020/wordml/sdtdatahash" xmlns:w16sdtfl="http://schemas.microsoft.com/office/word/2024/wordml/sdtformatlock" xmlns:w16se="http://schemas.microsoft.com/office/word/2015/wordml/symex" xmlns:wpg="http://schemas.microsoft.com/office/word/2010/wordprocessingGroup" xmlns:wpi="http://schemas.microsoft.com/office/word/2010/wordprocessingInk" xmlns:wne="http://schemas.microsoft.com/office/word/2006/wordml" xmlns:wps="http://schemas.microsoft.com/office/word/2010/wordprocessingShape" mc:Ignorable="w14 w15 w16se w16cid w16 w16cex w16sdtdh w16sdtfl w16du wp14">
-  <w:p>
-    <w:pPr>
-      <w:pStyle w:val="Fuzeile"/>
-    </w:pPr>
-  </w:p>
-</w:ftr>
-</file>
-
-<file path=word/footer3.xml><?xml version="1.0" encoding="utf-8"?>
-<w:ftr xmlns:wpc="http://schemas.microsoft.com/office/word/2010/wordprocessingCanvas" xmlns:cx="http://schemas.microsoft.com/office/drawing/2014/chartex" xmlns:cx1="http://schemas.microsoft.com/office/drawing/2015/9/8/chartex" xmlns:cx2="http://schemas.microsoft.com/office/drawing/2015/10/21/chartex" xmlns:cx3="http://schemas.microsoft.com/office/drawing/2016/5/9/chartex" xmlns:cx4="http://schemas.microsoft.com/office/drawing/2016/5/10/chartex" xmlns:cx5="http://schemas.microsoft.com/office/drawing/2016/5/11/chartex" xmlns:cx6="http://schemas.microsoft.com/office/drawing/2016/5/12/chartex" xmlns:cx7="http://schemas.microsoft.com/office/drawing/2016/5/13/chartex" xmlns:cx8="http://schemas.microsoft.com/office/drawing/2016/5/14/chartex" xmlns:mc="http://schemas.openxmlformats.org/markup-compatibility/2006" xmlns:aink="http://schemas.microsoft.com/office/drawing/2016/ink" xmlns:am3d="http://schemas.microsoft.com/office/drawing/2017/model3d" xmlns:o="urn:schemas-microsoft-com:office:office" xmlns:oel="http://schemas.microsoft.com/office/2019/extlst" xmlns:r="http://schemas.openxmlformats.org/officeDocument/2006/relationships" xmlns:m="http://schemas.openxmlformats.org/officeDocument/2006/math" xmlns:v="urn:schemas-microsoft-com:vml" xmlns:wp14="http://schemas.microsoft.com/office/word/2010/wordprocessingDrawing" xmlns:wp="http://schemas.openxmlformats.org/drawingml/2006/wordprocessingDrawing" xmlns:w10="urn:schemas-microsoft-com:office:word" xmlns:w="http://schemas.openxmlformats.org/wordprocessingml/2006/main" xmlns:w14="http://schemas.microsoft.com/office/word/2010/wordml" xmlns:w15="http://schemas.microsoft.com/office/word/2012/wordml" xmlns:w16cex="http://schemas.microsoft.com/office/word/2018/wordml/cex" xmlns:w16cid="http://schemas.microsoft.com/office/word/2016/wordml/cid" xmlns:w16="http://schemas.microsoft.com/office/word/2018/wordml" xmlns:w16du="http://schemas.microsoft.com/office/word/2023/wordml/word16du" xmlns:w16sdtdh="http://schemas.microsoft.com/office/word/2020/wordml/sdtdatahash" xmlns:w16sdtfl="http://schemas.microsoft.com/office/word/2024/wordml/sdtformatlock" xmlns:w16se="http://schemas.microsoft.com/office/word/2015/wordml/symex" xmlns:wpg="http://schemas.microsoft.com/office/word/2010/wordprocessingGroup" xmlns:wpi="http://schemas.microsoft.com/office/word/2010/wordprocessingInk" xmlns:wne="http://schemas.microsoft.com/office/word/2006/wordml" xmlns:wps="http://schemas.microsoft.com/office/word/2010/wordprocessingShape" mc:Ignorable="w14 w15 w16se w16cid w16 w16cex w16sdtdh w16sdtfl w16du wp14">
-  <w:p>
-    <w:pPr>
-      <w:pStyle w:val="Fuzeile"/>
-    </w:pPr>
-  </w:p>
-</w:ftr>
-</file>
-
 <file path=word/footnotes.xml><?xml version="1.0" encoding="utf-8"?>
 <w:footnotes xmlns:wpc="http://schemas.microsoft.com/office/word/2010/wordprocessingCanvas" xmlns:cx="http://schemas.microsoft.com/office/drawing/2014/chartex" xmlns:cx1="http://schemas.microsoft.com/office/drawing/2015/9/8/chartex" xmlns:cx2="http://schemas.microsoft.com/office/drawing/2015/10/21/chartex" xmlns:cx3="http://schemas.microsoft.com/office/drawing/2016/5/9/chartex" xmlns:cx4="http://schemas.microsoft.com/office/drawing/2016/5/10/chartex" xmlns:cx5="http://schemas.microsoft.com/office/drawing/2016/5/11/chartex" xmlns:cx6="http://schemas.microsoft.com/office/drawing/2016/5/12/chartex" xmlns:cx7="http://schemas.microsoft.com/office/drawing/2016/5/13/chartex" xmlns:cx8="http://schemas.microsoft.com/office/drawing/2016/5/14/chartex" xmlns:mc="http://schemas.openxmlformats.org/markup-compatibility/2006" xmlns:aink="http://schemas.microsoft.com/office/drawing/2016/ink" xmlns:am3d="http://schemas.microsoft.com/office/drawing/2017/model3d" xmlns:o="urn:schemas-microsoft-com:office:office" xmlns:oel="http://schemas.microsoft.com/office/2019/extlst" xmlns:r="http://schemas.openxmlformats.org/officeDocument/2006/relationships" xmlns:m="http://schemas.openxmlformats.org/officeDocument/2006/math" xmlns:v="urn:schemas-microsoft-com:vml" xmlns:wp14="http://schemas.microsoft.com/office/word/2010/wordprocessingDrawing" xmlns:wp="http://schemas.openxmlformats.org/drawingml/2006/wordprocessingDrawing" xmlns:w10="urn:schemas-microsoft-com:office:word" xmlns:w="http://schemas.openxmlformats.org/wordprocessingml/2006/main" xmlns:w14="http://schemas.microsoft.com/office/word/2010/wordml" xmlns:w15="http://schemas.microsoft.com/office/word/2012/wordml" xmlns:w16cex="http://schemas.microsoft.com/office/word/2018/wordml/cex" xmlns:w16cid="http://schemas.microsoft.com/office/word/2016/wordml/cid" xmlns:w16="http://schemas.microsoft.com/office/word/2018/wordml" xmlns:w16du="http://schemas.microsoft.com/office/word/2023/wordml/word16du" xmlns:w16sdtdh="http://schemas.microsoft.com/office/word/2020/wordml/sdtdatahash" xmlns:w16sdtfl="http://schemas.microsoft.com/office/word/2024/wordml/sdtformatlock" xmlns:w16se="http://schemas.microsoft.com/office/word/2015/wordml/symex" xmlns:wpg="http://schemas.microsoft.com/office/word/2010/wordprocessingGroup" xmlns:wpi="http://schemas.microsoft.com/office/word/2010/wordprocessingInk" xmlns:wne="http://schemas.microsoft.com/office/word/2006/wordml" xmlns:wps="http://schemas.microsoft.com/office/word/2010/wordprocessingShape" mc:Ignorable="w14 w15 w16se w16cid w16 w16cex w16sdtdh w16sdtfl w16du wp14">
   <w:footnote w:type="separator" w:id="-1">
@@ -3944,26 +4528,6 @@
 </file>
 
 <file path=word/header1.xml><?xml version="1.0" encoding="utf-8"?>
-<w:hdr xmlns:wpc="http://schemas.microsoft.com/office/word/2010/wordprocessingCanvas" xmlns:cx="http://schemas.microsoft.com/office/drawing/2014/chartex" xmlns:cx1="http://schemas.microsoft.com/office/drawing/2015/9/8/chartex" xmlns:cx2="http://schemas.microsoft.com/office/drawing/2015/10/21/chartex" xmlns:cx3="http://schemas.microsoft.com/office/drawing/2016/5/9/chartex" xmlns:cx4="http://schemas.microsoft.com/office/drawing/2016/5/10/chartex" xmlns:cx5="http://schemas.microsoft.com/office/drawing/2016/5/11/chartex" xmlns:cx6="http://schemas.microsoft.com/office/drawing/2016/5/12/chartex" xmlns:cx7="http://schemas.microsoft.com/office/drawing/2016/5/13/chartex" xmlns:cx8="http://schemas.microsoft.com/office/drawing/2016/5/14/chartex" xmlns:mc="http://schemas.openxmlformats.org/markup-compatibility/2006" xmlns:aink="http://schemas.microsoft.com/office/drawing/2016/ink" xmlns:am3d="http://schemas.microsoft.com/office/drawing/2017/model3d" xmlns:o="urn:schemas-microsoft-com:office:office" xmlns:oel="http://schemas.microsoft.com/office/2019/extlst" xmlns:r="http://schemas.openxmlformats.org/officeDocument/2006/relationships" xmlns:m="http://schemas.openxmlformats.org/officeDocument/2006/math" xmlns:v="urn:schemas-microsoft-com:vml" xmlns:wp14="http://schemas.microsoft.com/office/word/2010/wordprocessingDrawing" xmlns:wp="http://schemas.openxmlformats.org/drawingml/2006/wordprocessingDrawing" xmlns:w10="urn:schemas-microsoft-com:office:word" xmlns:w="http://schemas.openxmlformats.org/wordprocessingml/2006/main" xmlns:w14="http://schemas.microsoft.com/office/word/2010/wordml" xmlns:w15="http://schemas.microsoft.com/office/word/2012/wordml" xmlns:w16cex="http://schemas.microsoft.com/office/word/2018/wordml/cex" xmlns:w16cid="http://schemas.microsoft.com/office/word/2016/wordml/cid" xmlns:w16="http://schemas.microsoft.com/office/word/2018/wordml" xmlns:w16du="http://schemas.microsoft.com/office/word/2023/wordml/word16du" xmlns:w16sdtdh="http://schemas.microsoft.com/office/word/2020/wordml/sdtdatahash" xmlns:w16sdtfl="http://schemas.microsoft.com/office/word/2024/wordml/sdtformatlock" xmlns:w16se="http://schemas.microsoft.com/office/word/2015/wordml/symex" xmlns:wpg="http://schemas.microsoft.com/office/word/2010/wordprocessingGroup" xmlns:wpi="http://schemas.microsoft.com/office/word/2010/wordprocessingInk" xmlns:wne="http://schemas.microsoft.com/office/word/2006/wordml" xmlns:wps="http://schemas.microsoft.com/office/word/2010/wordprocessingShape" mc:Ignorable="w14 w15 w16se w16cid w16 w16cex w16sdtdh w16sdtfl w16du wp14">
-  <w:p>
-    <w:pPr>
-      <w:pStyle w:val="Kopfzeile"/>
-    </w:pPr>
-  </w:p>
-</w:hdr>
-</file>
-
-<file path=word/header2.xml><?xml version="1.0" encoding="utf-8"?>
-<w:hdr xmlns:wpc="http://schemas.microsoft.com/office/word/2010/wordprocessingCanvas" xmlns:cx="http://schemas.microsoft.com/office/drawing/2014/chartex" xmlns:cx1="http://schemas.microsoft.com/office/drawing/2015/9/8/chartex" xmlns:cx2="http://schemas.microsoft.com/office/drawing/2015/10/21/chartex" xmlns:cx3="http://schemas.microsoft.com/office/drawing/2016/5/9/chartex" xmlns:cx4="http://schemas.microsoft.com/office/drawing/2016/5/10/chartex" xmlns:cx5="http://schemas.microsoft.com/office/drawing/2016/5/11/chartex" xmlns:cx6="http://schemas.microsoft.com/office/drawing/2016/5/12/chartex" xmlns:cx7="http://schemas.microsoft.com/office/drawing/2016/5/13/chartex" xmlns:cx8="http://schemas.microsoft.com/office/drawing/2016/5/14/chartex" xmlns:mc="http://schemas.openxmlformats.org/markup-compatibility/2006" xmlns:aink="http://schemas.microsoft.com/office/drawing/2016/ink" xmlns:am3d="http://schemas.microsoft.com/office/drawing/2017/model3d" xmlns:o="urn:schemas-microsoft-com:office:office" xmlns:oel="http://schemas.microsoft.com/office/2019/extlst" xmlns:r="http://schemas.openxmlformats.org/officeDocument/2006/relationships" xmlns:m="http://schemas.openxmlformats.org/officeDocument/2006/math" xmlns:v="urn:schemas-microsoft-com:vml" xmlns:wp14="http://schemas.microsoft.com/office/word/2010/wordprocessingDrawing" xmlns:wp="http://schemas.openxmlformats.org/drawingml/2006/wordprocessingDrawing" xmlns:w10="urn:schemas-microsoft-com:office:word" xmlns:w="http://schemas.openxmlformats.org/wordprocessingml/2006/main" xmlns:w14="http://schemas.microsoft.com/office/word/2010/wordml" xmlns:w15="http://schemas.microsoft.com/office/word/2012/wordml" xmlns:w16cex="http://schemas.microsoft.com/office/word/2018/wordml/cex" xmlns:w16cid="http://schemas.microsoft.com/office/word/2016/wordml/cid" xmlns:w16="http://schemas.microsoft.com/office/word/2018/wordml" xmlns:w16du="http://schemas.microsoft.com/office/word/2023/wordml/word16du" xmlns:w16sdtdh="http://schemas.microsoft.com/office/word/2020/wordml/sdtdatahash" xmlns:w16sdtfl="http://schemas.microsoft.com/office/word/2024/wordml/sdtformatlock" xmlns:w16se="http://schemas.microsoft.com/office/word/2015/wordml/symex" xmlns:wpg="http://schemas.microsoft.com/office/word/2010/wordprocessingGroup" xmlns:wpi="http://schemas.microsoft.com/office/word/2010/wordprocessingInk" xmlns:wne="http://schemas.microsoft.com/office/word/2006/wordml" xmlns:wps="http://schemas.microsoft.com/office/word/2010/wordprocessingShape" mc:Ignorable="w14 w15 w16se w16cid w16 w16cex w16sdtdh w16sdtfl w16du wp14">
-  <w:p>
-    <w:pPr>
-      <w:pStyle w:val="Kopfzeile"/>
-    </w:pPr>
-  </w:p>
-</w:hdr>
-</file>
-
-<file path=word/header3.xml><?xml version="1.0" encoding="utf-8"?>
 <w:hdr xmlns:wpc="http://schemas.microsoft.com/office/word/2010/wordprocessingCanvas" xmlns:cx="http://schemas.microsoft.com/office/drawing/2014/chartex" xmlns:cx1="http://schemas.microsoft.com/office/drawing/2015/9/8/chartex" xmlns:cx2="http://schemas.microsoft.com/office/drawing/2015/10/21/chartex" xmlns:cx3="http://schemas.microsoft.com/office/drawing/2016/5/9/chartex" xmlns:cx4="http://schemas.microsoft.com/office/drawing/2016/5/10/chartex" xmlns:cx5="http://schemas.microsoft.com/office/drawing/2016/5/11/chartex" xmlns:cx6="http://schemas.microsoft.com/office/drawing/2016/5/12/chartex" xmlns:cx7="http://schemas.microsoft.com/office/drawing/2016/5/13/chartex" xmlns:cx8="http://schemas.microsoft.com/office/drawing/2016/5/14/chartex" xmlns:mc="http://schemas.openxmlformats.org/markup-compatibility/2006" xmlns:aink="http://schemas.microsoft.com/office/drawing/2016/ink" xmlns:am3d="http://schemas.microsoft.com/office/drawing/2017/model3d" xmlns:o="urn:schemas-microsoft-com:office:office" xmlns:oel="http://schemas.microsoft.com/office/2019/extlst" xmlns:r="http://schemas.openxmlformats.org/officeDocument/2006/relationships" xmlns:m="http://schemas.openxmlformats.org/officeDocument/2006/math" xmlns:v="urn:schemas-microsoft-com:vml" xmlns:wp14="http://schemas.microsoft.com/office/word/2010/wordprocessingDrawing" xmlns:wp="http://schemas.openxmlformats.org/drawingml/2006/wordprocessingDrawing" xmlns:w10="urn:schemas-microsoft-com:office:word" xmlns:w="http://schemas.openxmlformats.org/wordprocessingml/2006/main" xmlns:w14="http://schemas.microsoft.com/office/word/2010/wordml" xmlns:w15="http://schemas.microsoft.com/office/word/2012/wordml" xmlns:w16cex="http://schemas.microsoft.com/office/word/2018/wordml/cex" xmlns:w16cid="http://schemas.microsoft.com/office/word/2016/wordml/cid" xmlns:w16="http://schemas.microsoft.com/office/word/2018/wordml" xmlns:w16du="http://schemas.microsoft.com/office/word/2023/wordml/word16du" xmlns:w16sdtdh="http://schemas.microsoft.com/office/word/2020/wordml/sdtdatahash" xmlns:w16sdtfl="http://schemas.microsoft.com/office/word/2024/wordml/sdtformatlock" xmlns:w16se="http://schemas.microsoft.com/office/word/2015/wordml/symex" xmlns:wpg="http://schemas.microsoft.com/office/word/2010/wordprocessingGroup" xmlns:wpi="http://schemas.microsoft.com/office/word/2010/wordprocessingInk" xmlns:wne="http://schemas.microsoft.com/office/word/2006/wordml" xmlns:wps="http://schemas.microsoft.com/office/word/2010/wordprocessingShape" mc:Ignorable="w14 w15 w16se w16cid w16 w16cex w16sdtdh w16sdtfl w16du wp14">
   <w:p>
     <w:pPr>

</xml_diff>

<commit_message>
Aufraeumaktion: alte Ordner und Duplikate entfernt
- doi-papers/ entfernt (ersetzt durch sliced_papers/)
- proceeding_paper_sliced/ (env2025) entfernt
- Declined/ entfernt
- Template und veraltete Excels entfernt
- LNI-Startseiten.docx aktualisiert

Co-Authored-By: Claude Sonnet 4.6 <noreply@anthropic.com>
</commit_message>
<xml_diff>
--- a/LNI-Startseiten.docx
+++ b/LNI-Startseiten.docx
@@ -924,17 +924,8 @@
                 <w:kern w:val="2"/>
                 <w14:ligatures w14:val="standardContextual"/>
               </w:rPr>
-              <w:t>Małgorzata Burchard-</w:t>
+              <w:t>Małgorzata Burchard-Dziubińska</w:t>
             </w:r>
-            <w:proofErr w:type="spellStart"/>
-            <w:r>
-              <w:rPr>
-                <w:kern w:val="2"/>
-                <w14:ligatures w14:val="standardContextual"/>
-              </w:rPr>
-              <w:t>Dziubińska</w:t>
-            </w:r>
-            <w:proofErr w:type="spellEnd"/>
           </w:p>
         </w:tc>
         <w:tc>
@@ -963,39 +954,7 @@
                 <w:kern w:val="2"/>
                 <w14:ligatures w14:val="standardContextual"/>
               </w:rPr>
-              <w:t xml:space="preserve">University of </w:t>
-            </w:r>
-            <w:proofErr w:type="spellStart"/>
-            <w:r>
-              <w:rPr>
-                <w:kern w:val="2"/>
-                <w14:ligatures w14:val="standardContextual"/>
-              </w:rPr>
-              <w:t>Łódź</w:t>
-            </w:r>
-            <w:proofErr w:type="spellEnd"/>
-            <w:r>
-              <w:rPr>
-                <w:kern w:val="2"/>
-                <w14:ligatures w14:val="standardContextual"/>
-              </w:rPr>
-              <w:t xml:space="preserve">, </w:t>
-            </w:r>
-            <w:proofErr w:type="spellStart"/>
-            <w:r>
-              <w:rPr>
-                <w:kern w:val="2"/>
-                <w14:ligatures w14:val="standardContextual"/>
-              </w:rPr>
-              <w:t>Łódź</w:t>
-            </w:r>
-            <w:proofErr w:type="spellEnd"/>
-            <w:r>
-              <w:rPr>
-                <w:kern w:val="2"/>
-                <w14:ligatures w14:val="standardContextual"/>
-              </w:rPr>
-              <w:t>, Poland</w:t>
+              <w:t>University of Łódź, Łódź, Poland</w:t>
             </w:r>
           </w:p>
         </w:tc>
@@ -1022,15 +981,7 @@
         <w:pStyle w:val="Textkrper-Einzug2"/>
       </w:pPr>
       <w:r>
-        <w:t xml:space="preserve">Andreas Oberweis, KIT </w:t>
-      </w:r>
-      <w:proofErr w:type="gramStart"/>
-      <w:r>
-        <w:t>Karlsruhe,  (</w:t>
-      </w:r>
-      <w:proofErr w:type="gramEnd"/>
-      <w:r>
-        <w:t>Chairman, andreas.oberweis@kit.edu)</w:t>
+        <w:t>Andreas Oberweis, KIT Karlsruhe,  (Chairman, andreas.oberweis@kit.edu)</w:t>
       </w:r>
     </w:p>
     <w:p>
@@ -1729,9 +1680,8 @@
           <w:szCs w:val="20"/>
           <w:lang w:val="en-US"/>
         </w:rPr>
-        <w:t xml:space="preserve">We thank the University of </w:t>
-      </w:r>
-      <w:proofErr w:type="spellStart"/>
+        <w:t xml:space="preserve">We thank the University of Łódź as host, the organizers of SD26 and the Polish Association of Environmental Economists as co-organizers, and </w:t>
+      </w:r>
       <w:r>
         <w:rPr>
           <w:b w:val="0"/>
@@ -1739,18 +1689,20 @@
           <w:szCs w:val="20"/>
           <w:lang w:val="en-US"/>
         </w:rPr>
-        <w:t>Łódź</w:t>
-      </w:r>
-      <w:proofErr w:type="spellEnd"/>
-      <w:r>
+        <w:t xml:space="preserve">the Gesellschaft für Informatik e.V. We also thank the European universities of the UNIC alliance (European University of Cities in Post-industrial Transition – UNIC 2.0), for their cooperation in making this conference possible. </w:t>
+      </w:r>
+    </w:p>
+    <w:p>
+      <w:pPr>
+        <w:pStyle w:val="Zwischenberschriften"/>
+        <w:jc w:val="both"/>
         <w:rPr>
           <w:b w:val="0"/>
           <w:sz w:val="20"/>
           <w:szCs w:val="20"/>
           <w:lang w:val="en-US"/>
         </w:rPr>
-        <w:t xml:space="preserve"> as host, the organizers of SD26 and the Polish Association of Environmental Economists as co-organizers, and </w:t>
-      </w:r>
+      </w:pPr>
       <w:r>
         <w:rPr>
           <w:b w:val="0"/>
@@ -1758,7 +1710,7 @@
           <w:szCs w:val="20"/>
           <w:lang w:val="en-US"/>
         </w:rPr>
-        <w:t xml:space="preserve">the Gesellschaft für Informatik e.V. We also thank the European universities of the UNIC alliance (European University of Cities in Post-industrial Transition – UNIC 2.0), for their cooperation in making this conference possible. </w:t>
+        <w:t>Finally, we thank our sponsors, whose support was essential to making this conference happen.</w:t>
       </w:r>
     </w:p>
     <w:p>
@@ -1772,32 +1724,31 @@
           <w:lang w:val="en-US"/>
         </w:rPr>
       </w:pPr>
-      <w:r>
+    </w:p>
+    <w:p>
+      <w:pPr>
+        <w:pStyle w:val="Zwischenberschriften"/>
+        <w:jc w:val="both"/>
         <w:rPr>
           <w:b w:val="0"/>
           <w:sz w:val="20"/>
           <w:szCs w:val="20"/>
           <w:lang w:val="en-US"/>
         </w:rPr>
-        <w:t>Finally, we thank our sponsors, whose support was essential to making this conference happen.</w:t>
-      </w:r>
-    </w:p>
-    <w:p>
-      <w:pPr>
-        <w:pStyle w:val="Zwischenberschriften"/>
-        <w:jc w:val="both"/>
+      </w:pPr>
+      <w:r>
         <w:rPr>
           <w:b w:val="0"/>
           <w:sz w:val="20"/>
           <w:szCs w:val="20"/>
           <w:lang w:val="en-US"/>
         </w:rPr>
-      </w:pPr>
+        <w:t>Łódź, September 2026</w:t>
+      </w:r>
     </w:p>
     <w:p>
       <w:pPr>
         <w:pStyle w:val="Zwischenberschriften"/>
-        <w:jc w:val="both"/>
         <w:rPr>
           <w:b w:val="0"/>
           <w:sz w:val="20"/>
@@ -1805,7 +1756,6 @@
           <w:lang w:val="en-US"/>
         </w:rPr>
       </w:pPr>
-      <w:proofErr w:type="spellStart"/>
       <w:r>
         <w:rPr>
           <w:b w:val="0"/>
@@ -1813,61 +1763,21 @@
           <w:szCs w:val="20"/>
           <w:lang w:val="en-US"/>
         </w:rPr>
-        <w:t>Łódź</w:t>
-      </w:r>
-      <w:proofErr w:type="spellEnd"/>
+        <w:t>On behalf of the Organizing Committee</w:t>
+      </w:r>
+    </w:p>
+    <w:p>
+      <w:pPr>
+        <w:pStyle w:val="Zwischenberschriften"/>
+      </w:pPr>
       <w:r>
         <w:rPr>
           <w:b w:val="0"/>
           <w:sz w:val="20"/>
           <w:szCs w:val="20"/>
-          <w:lang w:val="en-US"/>
-        </w:rPr>
-        <w:t>, September 2026</w:t>
-      </w:r>
-    </w:p>
-    <w:p>
-      <w:pPr>
-        <w:pStyle w:val="Zwischenberschriften"/>
-        <w:rPr>
-          <w:b w:val="0"/>
-          <w:sz w:val="20"/>
-          <w:szCs w:val="20"/>
-          <w:lang w:val="en-US"/>
-        </w:rPr>
-      </w:pPr>
-      <w:r>
-        <w:rPr>
-          <w:b w:val="0"/>
-          <w:sz w:val="20"/>
-          <w:szCs w:val="20"/>
-          <w:lang w:val="en-US"/>
-        </w:rPr>
-        <w:t>On behalf of the Organizing Committee</w:t>
-      </w:r>
-    </w:p>
-    <w:p>
-      <w:pPr>
-        <w:pStyle w:val="Zwischenberschriften"/>
-      </w:pPr>
-      <w:r>
-        <w:rPr>
-          <w:b w:val="0"/>
-          <w:sz w:val="20"/>
-          <w:szCs w:val="20"/>
-        </w:rPr>
-        <w:t>Volker Wohlgemuth, Stefan Naumann, Grit Behrens, Malgorzata Burchard-</w:t>
-      </w:r>
-      <w:proofErr w:type="spellStart"/>
-      <w:r>
-        <w:rPr>
-          <w:b w:val="0"/>
-          <w:sz w:val="20"/>
-          <w:szCs w:val="20"/>
-        </w:rPr>
-        <w:t>Dziubińska</w:t>
-      </w:r>
-      <w:proofErr w:type="spellEnd"/>
+        </w:rPr>
+        <w:t>Volker Wohlgemuth, Stefan Naumann, Grit Behrens, Malgorzata Burchard-Dziubińska</w:t>
+      </w:r>
       <w:r>
         <w:br w:type="page"/>
       </w:r>
@@ -2042,21 +1952,7 @@
               <w:rPr>
                 <w:lang w:val="de-AT"/>
               </w:rPr>
-              <w:t xml:space="preserve">German </w:t>
-            </w:r>
-            <w:proofErr w:type="spellStart"/>
-            <w:r>
-              <w:rPr>
-                <w:lang w:val="de-AT"/>
-              </w:rPr>
-              <w:t>Informatics</w:t>
-            </w:r>
-            <w:proofErr w:type="spellEnd"/>
-            <w:r>
-              <w:rPr>
-                <w:lang w:val="de-AT"/>
-              </w:rPr>
-              <w:t xml:space="preserve"> Society</w:t>
+              <w:t>German Informatics Society</w:t>
             </w:r>
           </w:p>
         </w:tc>
@@ -2573,15 +2469,7 @@
         <w:jc w:val="both"/>
       </w:pPr>
       <w:r>
-        <w:t xml:space="preserve">Benjamin Wagner </w:t>
-      </w:r>
-      <w:proofErr w:type="gramStart"/>
-      <w:r>
-        <w:t>vom</w:t>
-      </w:r>
-      <w:proofErr w:type="gramEnd"/>
-      <w:r>
-        <w:t xml:space="preserve"> Berg, University of Applied Sciences Bremerhaven, Germany</w:t>
+        <w:t>Benjamin Wagner vom Berg, University of Applied Sciences Bremerhaven, Germany</w:t>
       </w:r>
     </w:p>
     <w:p>
@@ -3183,21 +3071,7 @@
       <w:rPr>
         <w:lang w:val="de-DE"/>
       </w:rPr>
-      <w:t xml:space="preserve">(Hrsg.): </w:t>
-    </w:r>
-    <w:proofErr w:type="spellStart"/>
-    <w:r>
-      <w:rPr>
-        <w:lang w:val="de-DE"/>
-      </w:rPr>
-      <w:t>EnviroInfo</w:t>
-    </w:r>
-    <w:proofErr w:type="spellEnd"/>
-    <w:r>
-      <w:rPr>
-        <w:lang w:val="de-DE"/>
-      </w:rPr>
-      <w:t xml:space="preserve"> 20</w:t>
+      <w:t>(Hrsg.): EnviroInfo 20</w:t>
     </w:r>
     <w:r>
       <w:rPr>
@@ -3229,33 +3103,11 @@
         <w:lang w:val="de-DE"/>
       </w:rPr>
     </w:pPr>
-    <w:proofErr w:type="spellStart"/>
     <w:r>
       <w:rPr>
         <w:lang w:val="de-DE"/>
       </w:rPr>
-      <w:t>Lecture</w:t>
-    </w:r>
-    <w:proofErr w:type="spellEnd"/>
-    <w:r>
-      <w:rPr>
-        <w:lang w:val="de-DE"/>
-      </w:rPr>
-      <w:t xml:space="preserve"> Notes in </w:t>
-    </w:r>
-    <w:proofErr w:type="spellStart"/>
-    <w:r>
-      <w:rPr>
-        <w:lang w:val="de-DE"/>
-      </w:rPr>
-      <w:t>Informatics</w:t>
-    </w:r>
-    <w:proofErr w:type="spellEnd"/>
-    <w:r>
-      <w:rPr>
-        <w:lang w:val="de-DE"/>
-      </w:rPr>
-      <w:t xml:space="preserve"> (LNI), Gesellschaft für Informatik, Bonn 202</w:t>
+      <w:t>Lecture Notes in Informatics (LNI), Gesellschaft für Informatik, Bonn 202</w:t>
     </w:r>
     <w:r>
       <w:rPr>

</xml_diff>

<commit_message>
proceedings neu gebaut (161 S.), Slices + ZIP aktualisiert, Seitenzahlen korrigiert
Co-Authored-By: Claude Sonnet 4.6 <noreply@anthropic.com>
</commit_message>
<xml_diff>
--- a/LNI-Startseiten.docx
+++ b/LNI-Startseiten.docx
@@ -434,6 +434,7 @@
           <w:lang w:val="en-US"/>
         </w:rPr>
       </w:pPr>
+      <w:proofErr w:type="spellStart"/>
       <w:r>
         <w:rPr>
           <w:snapToGrid/>
@@ -442,17 +443,9 @@
           <w:szCs w:val="32"/>
           <w:lang w:val="en-US"/>
         </w:rPr>
-        <w:t>EnviroInfo 2026</w:t>
-      </w:r>
-    </w:p>
-    <w:p>
-      <w:pPr>
-        <w:pStyle w:val="Buchuntertitel"/>
-        <w:rPr>
-          <w:color w:val="auto"/>
-          <w:lang w:val="en-US"/>
-        </w:rPr>
-      </w:pPr>
+        <w:t>EnviroInfo</w:t>
+      </w:r>
+      <w:proofErr w:type="spellEnd"/>
       <w:r>
         <w:rPr>
           <w:snapToGrid/>
@@ -461,7 +454,7 @@
           <w:szCs w:val="32"/>
           <w:lang w:val="en-US"/>
         </w:rPr>
-        <w:t>Short-/Work in Progress-Papers</w:t>
+        <w:t xml:space="preserve"> 2026</w:t>
       </w:r>
     </w:p>
     <w:p>
@@ -472,6 +465,16 @@
           <w:lang w:val="en-US"/>
         </w:rPr>
       </w:pPr>
+      <w:r>
+        <w:rPr>
+          <w:snapToGrid/>
+          <w:color w:val="auto"/>
+          <w:sz w:val="32"/>
+          <w:szCs w:val="32"/>
+          <w:lang w:val="en-US"/>
+        </w:rPr>
+        <w:t>Short-/Work in Progress-Papers</w:t>
+      </w:r>
     </w:p>
     <w:p>
       <w:pPr>
@@ -490,11 +493,20 @@
           <w:lang w:val="en-US"/>
         </w:rPr>
       </w:pPr>
-      <w:r>
+    </w:p>
+    <w:p>
+      <w:pPr>
+        <w:pStyle w:val="Buchuntertitel"/>
         <w:rPr>
           <w:color w:val="auto"/>
           <w:lang w:val="en-US"/>
         </w:rPr>
+      </w:pPr>
+      <w:r>
+        <w:rPr>
+          <w:color w:val="auto"/>
+          <w:lang w:val="en-US"/>
+        </w:rPr>
         <w:t>September 09-11, 2026</w:t>
       </w:r>
     </w:p>
@@ -506,12 +518,21 @@
           <w:lang w:val="de-AT"/>
         </w:rPr>
       </w:pPr>
+      <w:proofErr w:type="spellStart"/>
       <w:r>
         <w:rPr>
           <w:color w:val="auto"/>
           <w:lang w:val="de-AT"/>
         </w:rPr>
-        <w:t>Łódź- Poland</w:t>
+        <w:t>Łódź</w:t>
+      </w:r>
+      <w:proofErr w:type="spellEnd"/>
+      <w:r>
+        <w:rPr>
+          <w:color w:val="auto"/>
+          <w:lang w:val="de-AT"/>
+        </w:rPr>
+        <w:t>- Poland</w:t>
       </w:r>
     </w:p>
     <w:p>
@@ -924,8 +945,17 @@
                 <w:kern w:val="2"/>
                 <w14:ligatures w14:val="standardContextual"/>
               </w:rPr>
-              <w:t>Małgorzata Burchard-Dziubińska</w:t>
+              <w:t>Małgorzata Burchard-</w:t>
             </w:r>
+            <w:proofErr w:type="spellStart"/>
+            <w:r>
+              <w:rPr>
+                <w:kern w:val="2"/>
+                <w14:ligatures w14:val="standardContextual"/>
+              </w:rPr>
+              <w:t>Dziubińska</w:t>
+            </w:r>
+            <w:proofErr w:type="spellEnd"/>
           </w:p>
         </w:tc>
         <w:tc>
@@ -954,7 +984,39 @@
                 <w:kern w:val="2"/>
                 <w14:ligatures w14:val="standardContextual"/>
               </w:rPr>
-              <w:t>University of Łódź, Łódź, Poland</w:t>
+              <w:t xml:space="preserve">University of </w:t>
+            </w:r>
+            <w:proofErr w:type="spellStart"/>
+            <w:r>
+              <w:rPr>
+                <w:kern w:val="2"/>
+                <w14:ligatures w14:val="standardContextual"/>
+              </w:rPr>
+              <w:t>Łódź</w:t>
+            </w:r>
+            <w:proofErr w:type="spellEnd"/>
+            <w:r>
+              <w:rPr>
+                <w:kern w:val="2"/>
+                <w14:ligatures w14:val="standardContextual"/>
+              </w:rPr>
+              <w:t xml:space="preserve">, </w:t>
+            </w:r>
+            <w:proofErr w:type="spellStart"/>
+            <w:r>
+              <w:rPr>
+                <w:kern w:val="2"/>
+                <w14:ligatures w14:val="standardContextual"/>
+              </w:rPr>
+              <w:t>Łódź</w:t>
+            </w:r>
+            <w:proofErr w:type="spellEnd"/>
+            <w:r>
+              <w:rPr>
+                <w:kern w:val="2"/>
+                <w14:ligatures w14:val="standardContextual"/>
+              </w:rPr>
+              <w:t>, Poland</w:t>
             </w:r>
           </w:p>
         </w:tc>
@@ -981,7 +1043,15 @@
         <w:pStyle w:val="Textkrper-Einzug2"/>
       </w:pPr>
       <w:r>
-        <w:t>Andreas Oberweis, KIT Karlsruhe,  (Chairman, andreas.oberweis@kit.edu)</w:t>
+        <w:t xml:space="preserve">Andreas Oberweis, KIT </w:t>
+      </w:r>
+      <w:proofErr w:type="gramStart"/>
+      <w:r>
+        <w:t>Karlsruhe,  (</w:t>
+      </w:r>
+      <w:proofErr w:type="gramEnd"/>
+      <w:r>
+        <w:t>Chairman, andreas.oberweis@kit.edu)</w:t>
       </w:r>
     </w:p>
     <w:p>
@@ -1239,6 +1309,7 @@
           <w:lang w:val="de-DE"/>
         </w:rPr>
       </w:pPr>
+      <w:proofErr w:type="spellStart"/>
       <w:r>
         <w:rPr>
           <w:b/>
@@ -1247,6 +1318,7 @@
         </w:rPr>
         <w:t>Dissertations</w:t>
       </w:r>
+      <w:proofErr w:type="spellEnd"/>
     </w:p>
     <w:p>
       <w:pPr>
@@ -1277,6 +1349,7 @@
           <w:lang w:val="de-DE"/>
         </w:rPr>
       </w:pPr>
+      <w:proofErr w:type="spellStart"/>
       <w:r>
         <w:rPr>
           <w:b/>
@@ -1285,6 +1358,7 @@
         </w:rPr>
         <w:t>Thematics</w:t>
       </w:r>
+      <w:proofErr w:type="spellEnd"/>
     </w:p>
     <w:p>
       <w:pPr>
@@ -1488,41 +1562,40 @@
           <w:szCs w:val="20"/>
           <w:lang w:val="en-US"/>
         </w:rPr>
-        <w:t>This book contains the short and work-in-progress contributions of the 40th International and Interdisciplinary Conference on Environmental Informatics – EnviroInfo 2026.</w:t>
-      </w:r>
-    </w:p>
-    <w:p>
-      <w:pPr>
-        <w:pStyle w:val="Zwischenberschriften"/>
-        <w:jc w:val="both"/>
+        <w:t xml:space="preserve">This book contains the short and work-in-progress contributions of the 40th International and Interdisciplinary Conference on Environmental Informatics – </w:t>
+      </w:r>
+      <w:proofErr w:type="spellStart"/>
+      <w:r>
         <w:rPr>
           <w:b w:val="0"/>
           <w:sz w:val="20"/>
           <w:szCs w:val="20"/>
           <w:lang w:val="en-US"/>
         </w:rPr>
-      </w:pPr>
-    </w:p>
-    <w:p>
-      <w:pPr>
-        <w:pStyle w:val="Zwischenberschriften"/>
-        <w:jc w:val="both"/>
+        <w:t>EnviroInfo</w:t>
+      </w:r>
+      <w:proofErr w:type="spellEnd"/>
+      <w:r>
         <w:rPr>
           <w:b w:val="0"/>
           <w:sz w:val="20"/>
           <w:szCs w:val="20"/>
           <w:lang w:val="en-US"/>
         </w:rPr>
-      </w:pPr>
-      <w:r>
+        <w:t xml:space="preserve"> 2026.</w:t>
+      </w:r>
+    </w:p>
+    <w:p>
+      <w:pPr>
+        <w:pStyle w:val="Zwischenberschriften"/>
+        <w:jc w:val="both"/>
         <w:rPr>
           <w:b w:val="0"/>
           <w:sz w:val="20"/>
           <w:szCs w:val="20"/>
           <w:lang w:val="en-US"/>
         </w:rPr>
-        <w:t xml:space="preserve">Held from 9 to 11 September 2026 at the University of Łódź, Poland, the conference was organized by the technical committee of Environmental Informatics of the Gesellschaft für Informatik e.V. (GI). It took place in conjunction with the international scientific conference "Sustainable Development and Other Paradigms and Concepts in the Context of Contemporary Civilization Trends – Global and Local Dimensions" (SD26) and the Annual Meeting of the Polish Association of Environmental Economists. </w:t>
-      </w:r>
+      </w:pPr>
     </w:p>
     <w:p>
       <w:pPr>
@@ -1535,18 +1608,16 @@
           <w:lang w:val="en-US"/>
         </w:rPr>
       </w:pPr>
-    </w:p>
-    <w:p>
-      <w:pPr>
-        <w:pStyle w:val="Zwischenberschriften"/>
-        <w:jc w:val="both"/>
+      <w:r>
         <w:rPr>
           <w:b w:val="0"/>
           <w:sz w:val="20"/>
           <w:szCs w:val="20"/>
           <w:lang w:val="en-US"/>
         </w:rPr>
-      </w:pPr>
+        <w:t xml:space="preserve">Held from 9 to 11 September 2026 at the University of </w:t>
+      </w:r>
+      <w:proofErr w:type="spellStart"/>
       <w:r>
         <w:rPr>
           <w:b w:val="0"/>
@@ -1554,20 +1625,18 @@
           <w:szCs w:val="20"/>
           <w:lang w:val="en-US"/>
         </w:rPr>
-        <w:t>Over four decades, the EnviroInfo series has brought together researchers and practitioners from across the world who work at the intersection of applied computer science and environmental sustainability. The shared ambition has always been to translate advances in information and communication technologies into concrete steps toward a more sustainable society.</w:t>
-      </w:r>
-    </w:p>
-    <w:p>
-      <w:pPr>
-        <w:pStyle w:val="Zwischenberschriften"/>
-        <w:jc w:val="both"/>
+        <w:t>Łódź</w:t>
+      </w:r>
+      <w:proofErr w:type="spellEnd"/>
+      <w:r>
         <w:rPr>
           <w:b w:val="0"/>
           <w:sz w:val="20"/>
           <w:szCs w:val="20"/>
           <w:lang w:val="en-US"/>
         </w:rPr>
-      </w:pPr>
+        <w:t xml:space="preserve">, Poland, the conference was organized by the technical committee of Environmental Informatics of the Gesellschaft für Informatik e.V. (GI). It took place in conjunction with the international scientific conference "Sustainable Development and Other Paradigms and Concepts in the Context of Contemporary Civilization Trends – Global and Local Dimensions" (SD26) and the Annual Meeting of the Polish Association of Environmental Economists. </w:t>
+      </w:r>
     </w:p>
     <w:p>
       <w:pPr>
@@ -1580,15 +1649,18 @@
           <w:lang w:val="en-US"/>
         </w:rPr>
       </w:pPr>
-      <w:r>
+    </w:p>
+    <w:p>
+      <w:pPr>
+        <w:pStyle w:val="Zwischenberschriften"/>
+        <w:jc w:val="both"/>
         <w:rPr>
           <w:b w:val="0"/>
           <w:sz w:val="20"/>
           <w:szCs w:val="20"/>
           <w:lang w:val="en-US"/>
         </w:rPr>
-        <w:t xml:space="preserve">The theme of EnviroInfo 2026 – "Sustainable Development and Other Paradigms and Concepts in the Context of Contemporary Civilization Trends – Global and Local Dimensions" – opens up the conversation beyond any single framework. It situates environmental informatics within a wider debate about how societies, at both local and global </w:t>
-      </w:r>
+      </w:pPr>
       <w:r>
         <w:rPr>
           <w:b w:val="0"/>
@@ -1596,8 +1668,9 @@
           <w:szCs w:val="20"/>
           <w:lang w:val="en-US"/>
         </w:rPr>
-        <w:t>scales</w:t>
-      </w:r>
+        <w:t xml:space="preserve">Over four decades, the </w:t>
+      </w:r>
+      <w:proofErr w:type="spellStart"/>
       <w:r>
         <w:rPr>
           <w:b w:val="0"/>
@@ -1605,20 +1678,18 @@
           <w:szCs w:val="20"/>
           <w:lang w:val="en-US"/>
         </w:rPr>
-        <w:t>, respond to the pressures of our time: through green computing and sustainable software, through circular economy models, through business intelligence, and through the critical examination of the paradigms that shape development itself.</w:t>
-      </w:r>
-    </w:p>
-    <w:p>
-      <w:pPr>
-        <w:pStyle w:val="Zwischenberschriften"/>
-        <w:jc w:val="both"/>
+        <w:t>EnviroInfo</w:t>
+      </w:r>
+      <w:proofErr w:type="spellEnd"/>
+      <w:r>
         <w:rPr>
           <w:b w:val="0"/>
           <w:sz w:val="20"/>
           <w:szCs w:val="20"/>
           <w:lang w:val="en-US"/>
         </w:rPr>
-      </w:pPr>
+        <w:t xml:space="preserve"> series has brought together researchers and practitioners from across the world who work at the intersection of applied computer science and environmental sustainability. The shared ambition has always been to translate advances in information and communication technologies into concrete steps toward a more sustainable society.</w:t>
+      </w:r>
     </w:p>
     <w:p>
       <w:pPr>
@@ -1631,39 +1702,38 @@
           <w:lang w:val="en-US"/>
         </w:rPr>
       </w:pPr>
-      <w:r>
+    </w:p>
+    <w:p>
+      <w:pPr>
+        <w:pStyle w:val="Zwischenberschriften"/>
+        <w:jc w:val="both"/>
         <w:rPr>
           <w:b w:val="0"/>
           <w:sz w:val="20"/>
           <w:szCs w:val="20"/>
           <w:lang w:val="en-US"/>
         </w:rPr>
-        <w:t>The contributions gathered here are works in progress or early-stage results – deliberately so. This volume is a space for approaches that are still taking shape, for questions not yet fully answered, and for methodological experiments that connect disciplines and cross the boundary between research and practice. Taken together, they map a field in motion: from data infrastructures and environmental management systems to green coding, sustainability indicators, and the interfaces between science, policy, and civil society.</w:t>
-      </w:r>
-    </w:p>
-    <w:p>
-      <w:pPr>
-        <w:pStyle w:val="Zwischenberschriften"/>
-        <w:jc w:val="both"/>
+      </w:pPr>
+      <w:r>
         <w:rPr>
           <w:b w:val="0"/>
           <w:sz w:val="20"/>
           <w:szCs w:val="20"/>
           <w:lang w:val="en-US"/>
         </w:rPr>
-      </w:pPr>
-    </w:p>
-    <w:p>
-      <w:pPr>
-        <w:pStyle w:val="Zwischenberschriften"/>
-        <w:jc w:val="both"/>
+        <w:t xml:space="preserve">The theme of </w:t>
+      </w:r>
+      <w:proofErr w:type="spellStart"/>
+      <w:r>
         <w:rPr>
           <w:b w:val="0"/>
           <w:sz w:val="20"/>
           <w:szCs w:val="20"/>
           <w:lang w:val="en-US"/>
         </w:rPr>
-      </w:pPr>
+        <w:t>EnviroInfo</w:t>
+      </w:r>
+      <w:proofErr w:type="spellEnd"/>
       <w:r>
         <w:rPr>
           <w:b w:val="0"/>
@@ -1671,7 +1741,7 @@
           <w:szCs w:val="20"/>
           <w:lang w:val="en-US"/>
         </w:rPr>
-        <w:t xml:space="preserve">We thank all authors for sharing their work at this stage of development. We equally thank the members of the program and organization committee for their thorough and careful reviews. </w:t>
+        <w:t xml:space="preserve"> 2026 – "Sustainable Development and Other Paradigms and Concepts in the Context of Contemporary Civilization Trends – Global and Local Dimensions" – opens up the conversation beyond any single framework. It situates environmental informatics within a wider debate about how societies, at both local and global </w:t>
       </w:r>
       <w:r>
         <w:rPr>
@@ -1680,7 +1750,7 @@
           <w:szCs w:val="20"/>
           <w:lang w:val="en-US"/>
         </w:rPr>
-        <w:t xml:space="preserve">We thank the University of Łódź as host, the organizers of SD26 and the Polish Association of Environmental Economists as co-organizers, and </w:t>
+        <w:t>scales</w:t>
       </w:r>
       <w:r>
         <w:rPr>
@@ -1689,7 +1759,7 @@
           <w:szCs w:val="20"/>
           <w:lang w:val="en-US"/>
         </w:rPr>
-        <w:t xml:space="preserve">the Gesellschaft für Informatik e.V. We also thank the European universities of the UNIC alliance (European University of Cities in Post-industrial Transition – UNIC 2.0), for their cooperation in making this conference possible. </w:t>
+        <w:t>, respond to the pressures of our time: through green computing and sustainable software, through circular economy models, through business intelligence, and through the critical examination of the paradigms that shape development itself.</w:t>
       </w:r>
     </w:p>
     <w:p>
@@ -1703,27 +1773,27 @@
           <w:lang w:val="en-US"/>
         </w:rPr>
       </w:pPr>
-      <w:r>
+    </w:p>
+    <w:p>
+      <w:pPr>
+        <w:pStyle w:val="Zwischenberschriften"/>
+        <w:jc w:val="both"/>
         <w:rPr>
           <w:b w:val="0"/>
           <w:sz w:val="20"/>
           <w:szCs w:val="20"/>
           <w:lang w:val="en-US"/>
         </w:rPr>
-        <w:t>Finally, we thank our sponsors, whose support was essential to making this conference happen.</w:t>
-      </w:r>
-    </w:p>
-    <w:p>
-      <w:pPr>
-        <w:pStyle w:val="Zwischenberschriften"/>
-        <w:jc w:val="both"/>
+      </w:pPr>
+      <w:r>
         <w:rPr>
           <w:b w:val="0"/>
           <w:sz w:val="20"/>
           <w:szCs w:val="20"/>
           <w:lang w:val="en-US"/>
         </w:rPr>
-      </w:pPr>
+        <w:t>The contributions gathered here are works in progress or early-stage results – deliberately so. This volume is a space for approaches that are still taking shape, for questions not yet fully answered, and for methodological experiments that connect disciplines and cross the boundary between research and practice. Taken together, they map a field in motion: from data infrastructures and environmental management systems to green coding, sustainability indicators, and the interfaces between science, policy, and civil society.</w:t>
+      </w:r>
     </w:p>
     <w:p>
       <w:pPr>
@@ -1736,26 +1806,27 @@
           <w:lang w:val="en-US"/>
         </w:rPr>
       </w:pPr>
-      <w:r>
+    </w:p>
+    <w:p>
+      <w:pPr>
+        <w:pStyle w:val="Zwischenberschriften"/>
+        <w:jc w:val="both"/>
         <w:rPr>
           <w:b w:val="0"/>
           <w:sz w:val="20"/>
           <w:szCs w:val="20"/>
           <w:lang w:val="en-US"/>
         </w:rPr>
-        <w:t>Łódź, September 2026</w:t>
-      </w:r>
-    </w:p>
-    <w:p>
-      <w:pPr>
-        <w:pStyle w:val="Zwischenberschriften"/>
+      </w:pPr>
+      <w:r>
         <w:rPr>
           <w:b w:val="0"/>
           <w:sz w:val="20"/>
           <w:szCs w:val="20"/>
           <w:lang w:val="en-US"/>
         </w:rPr>
-      </w:pPr>
+        <w:t xml:space="preserve">We thank all authors for sharing their work at this stage of development. We equally thank the members of the program and organization committee for their thorough and careful reviews. </w:t>
+      </w:r>
       <w:r>
         <w:rPr>
           <w:b w:val="0"/>
@@ -1763,21 +1834,145 @@
           <w:szCs w:val="20"/>
           <w:lang w:val="en-US"/>
         </w:rPr>
-        <w:t>On behalf of the Organizing Committee</w:t>
-      </w:r>
-    </w:p>
-    <w:p>
-      <w:pPr>
-        <w:pStyle w:val="Zwischenberschriften"/>
-      </w:pPr>
+        <w:t xml:space="preserve">We thank the University of </w:t>
+      </w:r>
+      <w:proofErr w:type="spellStart"/>
       <w:r>
         <w:rPr>
           <w:b w:val="0"/>
           <w:sz w:val="20"/>
           <w:szCs w:val="20"/>
-        </w:rPr>
-        <w:t>Volker Wohlgemuth, Stefan Naumann, Grit Behrens, Malgorzata Burchard-Dziubińska</w:t>
-      </w:r>
+          <w:lang w:val="en-US"/>
+        </w:rPr>
+        <w:t>Łódź</w:t>
+      </w:r>
+      <w:proofErr w:type="spellEnd"/>
+      <w:r>
+        <w:rPr>
+          <w:b w:val="0"/>
+          <w:sz w:val="20"/>
+          <w:szCs w:val="20"/>
+          <w:lang w:val="en-US"/>
+        </w:rPr>
+        <w:t xml:space="preserve"> as host, the organizers of SD26 and the Polish Association of Environmental Economists as co-organizers, and </w:t>
+      </w:r>
+      <w:r>
+        <w:rPr>
+          <w:b w:val="0"/>
+          <w:sz w:val="20"/>
+          <w:szCs w:val="20"/>
+          <w:lang w:val="en-US"/>
+        </w:rPr>
+        <w:t xml:space="preserve">the Gesellschaft für Informatik e.V. We also thank the European universities of the UNIC alliance (European University of Cities in Post-industrial Transition – UNIC 2.0), for their cooperation in making this conference possible. </w:t>
+      </w:r>
+    </w:p>
+    <w:p>
+      <w:pPr>
+        <w:pStyle w:val="Zwischenberschriften"/>
+        <w:jc w:val="both"/>
+        <w:rPr>
+          <w:b w:val="0"/>
+          <w:sz w:val="20"/>
+          <w:szCs w:val="20"/>
+          <w:lang w:val="en-US"/>
+        </w:rPr>
+      </w:pPr>
+      <w:r>
+        <w:rPr>
+          <w:b w:val="0"/>
+          <w:sz w:val="20"/>
+          <w:szCs w:val="20"/>
+          <w:lang w:val="en-US"/>
+        </w:rPr>
+        <w:t>Finally, we thank our sponsors, whose support was essential to making this conference happen.</w:t>
+      </w:r>
+    </w:p>
+    <w:p>
+      <w:pPr>
+        <w:pStyle w:val="Zwischenberschriften"/>
+        <w:jc w:val="both"/>
+        <w:rPr>
+          <w:b w:val="0"/>
+          <w:sz w:val="20"/>
+          <w:szCs w:val="20"/>
+          <w:lang w:val="en-US"/>
+        </w:rPr>
+      </w:pPr>
+    </w:p>
+    <w:p>
+      <w:pPr>
+        <w:pStyle w:val="Zwischenberschriften"/>
+        <w:jc w:val="both"/>
+        <w:rPr>
+          <w:b w:val="0"/>
+          <w:sz w:val="20"/>
+          <w:szCs w:val="20"/>
+          <w:lang w:val="en-US"/>
+        </w:rPr>
+      </w:pPr>
+      <w:proofErr w:type="spellStart"/>
+      <w:r>
+        <w:rPr>
+          <w:b w:val="0"/>
+          <w:sz w:val="20"/>
+          <w:szCs w:val="20"/>
+          <w:lang w:val="en-US"/>
+        </w:rPr>
+        <w:t>Łódź</w:t>
+      </w:r>
+      <w:proofErr w:type="spellEnd"/>
+      <w:r>
+        <w:rPr>
+          <w:b w:val="0"/>
+          <w:sz w:val="20"/>
+          <w:szCs w:val="20"/>
+          <w:lang w:val="en-US"/>
+        </w:rPr>
+        <w:t>, September 2026</w:t>
+      </w:r>
+    </w:p>
+    <w:p>
+      <w:pPr>
+        <w:pStyle w:val="Zwischenberschriften"/>
+        <w:rPr>
+          <w:b w:val="0"/>
+          <w:sz w:val="20"/>
+          <w:szCs w:val="20"/>
+          <w:lang w:val="en-US"/>
+        </w:rPr>
+      </w:pPr>
+      <w:r>
+        <w:rPr>
+          <w:b w:val="0"/>
+          <w:sz w:val="20"/>
+          <w:szCs w:val="20"/>
+          <w:lang w:val="en-US"/>
+        </w:rPr>
+        <w:t>On behalf of the Organizing Committee</w:t>
+      </w:r>
+    </w:p>
+    <w:p>
+      <w:pPr>
+        <w:pStyle w:val="Zwischenberschriften"/>
+      </w:pPr>
+      <w:r>
+        <w:rPr>
+          <w:b w:val="0"/>
+          <w:sz w:val="20"/>
+          <w:szCs w:val="20"/>
+        </w:rPr>
+        <w:t>Volker Wohlgemuth, Stefan Naumann, Grit Behrens, Malgorzata Burchard-</w:t>
+      </w:r>
+      <w:proofErr w:type="spellStart"/>
+      <w:r>
+        <w:rPr>
+          <w:b w:val="0"/>
+          <w:sz w:val="20"/>
+          <w:szCs w:val="20"/>
+        </w:rPr>
+        <w:t>Dziubińska</w:t>
+      </w:r>
+      <w:proofErr w:type="spellEnd"/>
       <w:r>
         <w:br w:type="page"/>
       </w:r>
@@ -1861,6 +2056,20 @@
             <w:r>
               <w:t>Hewlett Packard Enterprise</w:t>
             </w:r>
+          </w:p>
+          <w:p>
+            <w:pPr>
+              <w:tabs>
+                <w:tab w:val="left" w:pos="142"/>
+              </w:tabs>
+            </w:pPr>
+          </w:p>
+          <w:p>
+            <w:pPr>
+              <w:tabs>
+                <w:tab w:val="left" w:pos="142"/>
+              </w:tabs>
+            </w:pPr>
           </w:p>
         </w:tc>
         <w:tc>
@@ -1947,13 +2156,47 @@
               <w:tabs>
                 <w:tab w:val="left" w:pos="142"/>
               </w:tabs>
+              <w:rPr>
+                <w:lang w:val="de-AT"/>
+              </w:rPr>
             </w:pPr>
             <w:r>
               <w:rPr>
                 <w:lang w:val="de-AT"/>
               </w:rPr>
-              <w:t>German Informatics Society</w:t>
+              <w:t xml:space="preserve">German </w:t>
             </w:r>
+            <w:proofErr w:type="spellStart"/>
+            <w:r>
+              <w:rPr>
+                <w:lang w:val="de-AT"/>
+              </w:rPr>
+              <w:t>Informatics</w:t>
+            </w:r>
+            <w:proofErr w:type="spellEnd"/>
+            <w:r>
+              <w:rPr>
+                <w:lang w:val="de-AT"/>
+              </w:rPr>
+              <w:t xml:space="preserve"> Society</w:t>
+            </w:r>
+          </w:p>
+          <w:p>
+            <w:pPr>
+              <w:tabs>
+                <w:tab w:val="left" w:pos="142"/>
+              </w:tabs>
+              <w:rPr>
+                <w:lang w:val="de-AT"/>
+              </w:rPr>
+            </w:pPr>
+          </w:p>
+          <w:p>
+            <w:pPr>
+              <w:tabs>
+                <w:tab w:val="left" w:pos="142"/>
+              </w:tabs>
+            </w:pPr>
           </w:p>
         </w:tc>
         <w:tc>
@@ -2023,6 +2266,141 @@
           </w:p>
         </w:tc>
       </w:tr>
+      <w:tr>
+        <w:tc>
+          <w:tcPr>
+            <w:tcW w:w="3567" w:type="dxa"/>
+          </w:tcPr>
+          <w:p>
+            <w:pPr>
+              <w:tabs>
+                <w:tab w:val="left" w:pos="142"/>
+              </w:tabs>
+              <w:rPr>
+                <w:lang w:val="en-GB"/>
+              </w:rPr>
+            </w:pPr>
+          </w:p>
+          <w:p>
+            <w:pPr>
+              <w:tabs>
+                <w:tab w:val="left" w:pos="142"/>
+              </w:tabs>
+              <w:rPr>
+                <w:lang w:val="en-GB"/>
+              </w:rPr>
+            </w:pPr>
+          </w:p>
+          <w:p>
+            <w:pPr>
+              <w:tabs>
+                <w:tab w:val="left" w:pos="142"/>
+              </w:tabs>
+              <w:rPr>
+                <w:lang w:val="de-AT"/>
+              </w:rPr>
+            </w:pPr>
+            <w:proofErr w:type="spellStart"/>
+            <w:r>
+              <w:rPr>
+                <w:lang w:val="en-GB"/>
+              </w:rPr>
+              <w:t>Disy</w:t>
+            </w:r>
+            <w:proofErr w:type="spellEnd"/>
+            <w:r>
+              <w:rPr>
+                <w:lang w:val="en-GB"/>
+              </w:rPr>
+              <w:t xml:space="preserve"> </w:t>
+            </w:r>
+            <w:proofErr w:type="spellStart"/>
+            <w:r>
+              <w:rPr>
+                <w:lang w:val="en-GB"/>
+              </w:rPr>
+              <w:t>Informationssysteme</w:t>
+            </w:r>
+            <w:proofErr w:type="spellEnd"/>
+            <w:r>
+              <w:rPr>
+                <w:lang w:val="en-GB"/>
+              </w:rPr>
+              <w:t xml:space="preserve"> GmbH</w:t>
+            </w:r>
+          </w:p>
+        </w:tc>
+        <w:tc>
+          <w:tcPr>
+            <w:tcW w:w="3567" w:type="dxa"/>
+          </w:tcPr>
+          <w:p>
+            <w:pPr>
+              <w:tabs>
+                <w:tab w:val="left" w:pos="142"/>
+              </w:tabs>
+              <w:jc w:val="right"/>
+              <w:rPr>
+                <w:noProof/>
+                <w:lang w:val="de-DE"/>
+              </w:rPr>
+            </w:pPr>
+            <w:r>
+              <w:rPr>
+                <w:noProof/>
+                <w:lang w:val="de-DE"/>
+              </w:rPr>
+              <w:drawing>
+                <wp:inline distT="0" distB="0" distL="0" distR="0" wp14:anchorId="0C1E0BD0" wp14:editId="77B7ED3F">
+                  <wp:extent cx="834347" cy="506994"/>
+                  <wp:effectExtent l="0" t="0" r="4445" b="7620"/>
+                  <wp:docPr id="2" name="Bild 2"/>
+                  <wp:cNvGraphicFramePr>
+                    <a:graphicFrameLocks xmlns:a="http://schemas.openxmlformats.org/drawingml/2006/main" noChangeAspect="1"/>
+                  </wp:cNvGraphicFramePr>
+                  <a:graphic xmlns:a="http://schemas.openxmlformats.org/drawingml/2006/main">
+                    <a:graphicData uri="http://schemas.openxmlformats.org/drawingml/2006/picture">
+                      <pic:pic xmlns:pic="http://schemas.openxmlformats.org/drawingml/2006/picture">
+                        <pic:nvPicPr>
+                          <pic:cNvPr id="2" name="Bild 2"/>
+                          <pic:cNvPicPr>
+                            <a:picLocks noChangeAspect="1" noChangeArrowheads="1"/>
+                          </pic:cNvPicPr>
+                        </pic:nvPicPr>
+                        <pic:blipFill>
+                          <a:blip r:embed="rId13" cstate="print">
+                            <a:extLst>
+                              <a:ext uri="{28A0092B-C50C-407E-A947-70E740481C1C}">
+                                <a14:useLocalDpi xmlns:a14="http://schemas.microsoft.com/office/drawing/2010/main" val="0"/>
+                              </a:ext>
+                            </a:extLst>
+                          </a:blip>
+                          <a:stretch>
+                            <a:fillRect/>
+                          </a:stretch>
+                        </pic:blipFill>
+                        <pic:spPr bwMode="auto">
+                          <a:xfrm>
+                            <a:off x="0" y="0"/>
+                            <a:ext cx="857229" cy="520898"/>
+                          </a:xfrm>
+                          <a:prstGeom prst="rect">
+                            <a:avLst/>
+                          </a:prstGeom>
+                          <a:noFill/>
+                          <a:ln>
+                            <a:noFill/>
+                          </a:ln>
+                        </pic:spPr>
+                      </pic:pic>
+                    </a:graphicData>
+                  </a:graphic>
+                </wp:inline>
+              </w:drawing>
+            </w:r>
+          </w:p>
+        </w:tc>
+      </w:tr>
     </w:tbl>
     <w:p>
       <w:pPr>
@@ -2296,8 +2674,17 @@
                 <w:kern w:val="2"/>
                 <w14:ligatures w14:val="standardContextual"/>
               </w:rPr>
-              <w:t>Małgorzata Burchard-Dziubińska</w:t>
+              <w:t>Małgorzata Burchard-</w:t>
             </w:r>
+            <w:proofErr w:type="spellStart"/>
+            <w:r>
+              <w:rPr>
+                <w:kern w:val="2"/>
+                <w14:ligatures w14:val="standardContextual"/>
+              </w:rPr>
+              <w:t>Dziubińska</w:t>
+            </w:r>
+            <w:proofErr w:type="spellEnd"/>
           </w:p>
         </w:tc>
         <w:tc>
@@ -2326,7 +2713,39 @@
                 <w:kern w:val="2"/>
                 <w14:ligatures w14:val="standardContextual"/>
               </w:rPr>
-              <w:t>University of Łódź, Łódź, Poland</w:t>
+              <w:t xml:space="preserve">University of </w:t>
+            </w:r>
+            <w:proofErr w:type="spellStart"/>
+            <w:r>
+              <w:rPr>
+                <w:kern w:val="2"/>
+                <w14:ligatures w14:val="standardContextual"/>
+              </w:rPr>
+              <w:t>Łódź</w:t>
+            </w:r>
+            <w:proofErr w:type="spellEnd"/>
+            <w:r>
+              <w:rPr>
+                <w:kern w:val="2"/>
+                <w14:ligatures w14:val="standardContextual"/>
+              </w:rPr>
+              <w:t xml:space="preserve">, </w:t>
+            </w:r>
+            <w:proofErr w:type="spellStart"/>
+            <w:r>
+              <w:rPr>
+                <w:kern w:val="2"/>
+                <w14:ligatures w14:val="standardContextual"/>
+              </w:rPr>
+              <w:t>Łódź</w:t>
+            </w:r>
+            <w:proofErr w:type="spellEnd"/>
+            <w:r>
+              <w:rPr>
+                <w:kern w:val="2"/>
+                <w14:ligatures w14:val="standardContextual"/>
+              </w:rPr>
+              <w:t>, Poland</w:t>
             </w:r>
           </w:p>
         </w:tc>
@@ -2437,7 +2856,23 @@
         <w:jc w:val="both"/>
       </w:pPr>
       <w:r>
-        <w:t>Andreas Abecker, Disy Informationssysteme GmbH, Germany</w:t>
+        <w:t xml:space="preserve">Andreas Abecker, </w:t>
+      </w:r>
+      <w:proofErr w:type="spellStart"/>
+      <w:r>
+        <w:t>Disy</w:t>
+      </w:r>
+      <w:proofErr w:type="spellEnd"/>
+      <w:r>
+        <w:t xml:space="preserve"> </w:t>
+      </w:r>
+      <w:proofErr w:type="spellStart"/>
+      <w:r>
+        <w:t>Informationssysteme</w:t>
+      </w:r>
+      <w:proofErr w:type="spellEnd"/>
+      <w:r>
+        <w:t xml:space="preserve"> GmbH, Germany</w:t>
       </w:r>
     </w:p>
     <w:p>
@@ -2453,7 +2888,15 @@
         <w:jc w:val="both"/>
       </w:pPr>
       <w:r>
-        <w:t>Anna Zagorski, Umweltbundesamt - German Environment Agency, Germany</w:t>
+        <w:t xml:space="preserve">Anna Zagorski, </w:t>
+      </w:r>
+      <w:proofErr w:type="spellStart"/>
+      <w:r>
+        <w:t>Umweltbundesamt</w:t>
+      </w:r>
+      <w:proofErr w:type="spellEnd"/>
+      <w:r>
+        <w:t xml:space="preserve"> - German Environment Agency, Germany</w:t>
       </w:r>
     </w:p>
     <w:p>
@@ -2469,7 +2912,17 @@
         <w:jc w:val="both"/>
       </w:pPr>
       <w:r>
-        <w:t>Benjamin Wagner vom Berg, University of Applied Sciences Bremerhaven, Germany</w:t>
+        <w:t xml:space="preserve">Benjamin Wagner </w:t>
+      </w:r>
+      <w:proofErr w:type="spellStart"/>
+      <w:proofErr w:type="gramStart"/>
+      <w:r>
+        <w:t>vom</w:t>
+      </w:r>
+      <w:proofErr w:type="spellEnd"/>
+      <w:proofErr w:type="gramEnd"/>
+      <w:r>
+        <w:t xml:space="preserve"> Berg, University of Applied Sciences Bremerhaven, Germany</w:t>
       </w:r>
     </w:p>
     <w:p>
@@ -2517,7 +2970,15 @@
         <w:jc w:val="both"/>
       </w:pPr>
       <w:r>
-        <w:t>Frank Fuchs-Kittowski, HTW Berlin – University of Applied Sciences, Berlin, Germany</w:t>
+        <w:t>Frank Fuchs-</w:t>
+      </w:r>
+      <w:proofErr w:type="spellStart"/>
+      <w:r>
+        <w:t>Kittowski</w:t>
+      </w:r>
+      <w:proofErr w:type="spellEnd"/>
+      <w:r>
+        <w:t>, HTW Berlin – University of Applied Sciences, Berlin, Germany</w:t>
       </w:r>
     </w:p>
     <w:p>
@@ -2531,20 +2992,34 @@
         <w:rPr>
           <w:lang w:val="de-DE"/>
         </w:rPr>
-        <w:t>Friedhelm Hosenfeld, DigSyLand, Germany</w:t>
-      </w:r>
-    </w:p>
-    <w:p>
-      <w:pPr>
-        <w:jc w:val="both"/>
+        <w:t xml:space="preserve">Friedhelm Hosenfeld, </w:t>
+      </w:r>
+      <w:proofErr w:type="spellStart"/>
+      <w:r>
         <w:rPr>
           <w:lang w:val="de-DE"/>
         </w:rPr>
-      </w:pPr>
+        <w:t>DigSyLand</w:t>
+      </w:r>
+      <w:proofErr w:type="spellEnd"/>
       <w:r>
         <w:rPr>
           <w:lang w:val="de-DE"/>
         </w:rPr>
+        <w:t>, Germany</w:t>
+      </w:r>
+    </w:p>
+    <w:p>
+      <w:pPr>
+        <w:jc w:val="both"/>
+        <w:rPr>
+          <w:lang w:val="de-DE"/>
+        </w:rPr>
+      </w:pPr>
+      <w:r>
+        <w:rPr>
+          <w:lang w:val="de-DE"/>
+        </w:rPr>
         <w:t>Hans-Knud Arndt, Otto-von-Guericke-Universität, Magdeburg, Germany</w:t>
       </w:r>
     </w:p>
@@ -2561,7 +3036,15 @@
         <w:jc w:val="both"/>
       </w:pPr>
       <w:r>
-        <w:t>Horst Kremers, Horst Kremers UNDRR SEM - RIMMA CoE Community, Germany</w:t>
+        <w:t xml:space="preserve">Horst Kremers, Horst Kremers UNDRR SEM - RIMMA </w:t>
+      </w:r>
+      <w:proofErr w:type="spellStart"/>
+      <w:r>
+        <w:t>CoE</w:t>
+      </w:r>
+      <w:proofErr w:type="spellEnd"/>
+      <w:r>
+        <w:t xml:space="preserve"> Community, Germany</w:t>
       </w:r>
     </w:p>
     <w:p>
@@ -2585,7 +3068,15 @@
         <w:jc w:val="both"/>
       </w:pPr>
       <w:r>
-        <w:t>Karol Mrozik, Poznań University of Life Sciences, Poland</w:t>
+        <w:t xml:space="preserve">Karol Mrozik, </w:t>
+      </w:r>
+      <w:proofErr w:type="spellStart"/>
+      <w:r>
+        <w:t>Poznań</w:t>
+      </w:r>
+      <w:proofErr w:type="spellEnd"/>
+      <w:r>
+        <w:t xml:space="preserve"> University of Life Sciences, Poland</w:t>
       </w:r>
     </w:p>
     <w:p>
@@ -2609,7 +3100,15 @@
         <w:jc w:val="both"/>
       </w:pPr>
       <w:r>
-        <w:t>Margaret M. MacDonell, Argonne National Laboratory, USA</w:t>
+        <w:t xml:space="preserve">Margaret M. </w:t>
+      </w:r>
+      <w:proofErr w:type="spellStart"/>
+      <w:r>
+        <w:t>MacDonell</w:t>
+      </w:r>
+      <w:proofErr w:type="spellEnd"/>
+      <w:r>
+        <w:t>, Argonne National Laboratory, USA</w:t>
       </w:r>
     </w:p>
     <w:p>
@@ -2625,7 +3124,15 @@
         <w:jc w:val="both"/>
       </w:pPr>
       <w:r>
-        <w:t>Maximilian Höb, Leibniz Supercomputing Centre (LRZ) of the Bavarian Academy of Sciences and Humanities, Germany</w:t>
+        <w:t xml:space="preserve">Maximilian </w:t>
+      </w:r>
+      <w:proofErr w:type="spellStart"/>
+      <w:r>
+        <w:t>Höb</w:t>
+      </w:r>
+      <w:proofErr w:type="spellEnd"/>
+      <w:r>
+        <w:t>, Leibniz Supercomputing Centre (LRZ) of the Bavarian Academy of Sciences and Humanities, Germany</w:t>
       </w:r>
     </w:p>
     <w:p>
@@ -2665,7 +3172,15 @@
         <w:jc w:val="both"/>
       </w:pPr>
       <w:r>
-        <w:t>Stanisław Czaja, Wrocław University of Economics and Business, Poland</w:t>
+        <w:t xml:space="preserve">Stanisław Czaja, </w:t>
+      </w:r>
+      <w:proofErr w:type="spellStart"/>
+      <w:r>
+        <w:t>Wrocław</w:t>
+      </w:r>
+      <w:proofErr w:type="spellEnd"/>
+      <w:r>
+        <w:t xml:space="preserve"> University of Economics and Business, Poland</w:t>
       </w:r>
     </w:p>
     <w:p>
@@ -2860,8 +3375,17 @@
                 <w:szCs w:val="24"/>
                 <w:lang w:val="de-DE"/>
               </w:rPr>
-              <w:t>Małgorzata Burchard-Dziubińska</w:t>
+              <w:t>Małgorzata Burchard-</w:t>
             </w:r>
+            <w:proofErr w:type="spellStart"/>
+            <w:r>
+              <w:rPr>
+                <w:szCs w:val="24"/>
+                <w:lang w:val="de-DE"/>
+              </w:rPr>
+              <w:t>Dziubińska</w:t>
+            </w:r>
+            <w:proofErr w:type="spellEnd"/>
           </w:p>
         </w:tc>
         <w:tc>
@@ -2879,7 +3403,35 @@
               <w:rPr>
                 <w:szCs w:val="24"/>
               </w:rPr>
-              <w:t>University of Łódź, Łódź, Poland</w:t>
+              <w:t xml:space="preserve">University of </w:t>
+            </w:r>
+            <w:proofErr w:type="spellStart"/>
+            <w:r>
+              <w:rPr>
+                <w:szCs w:val="24"/>
+              </w:rPr>
+              <w:t>Łódź</w:t>
+            </w:r>
+            <w:proofErr w:type="spellEnd"/>
+            <w:r>
+              <w:rPr>
+                <w:szCs w:val="24"/>
+              </w:rPr>
+              <w:t xml:space="preserve">, </w:t>
+            </w:r>
+            <w:proofErr w:type="spellStart"/>
+            <w:r>
+              <w:rPr>
+                <w:szCs w:val="24"/>
+              </w:rPr>
+              <w:t>Łódź</w:t>
+            </w:r>
+            <w:proofErr w:type="spellEnd"/>
+            <w:r>
+              <w:rPr>
+                <w:szCs w:val="24"/>
+              </w:rPr>
+              <w:t>, Poland</w:t>
             </w:r>
           </w:p>
         </w:tc>
@@ -2996,7 +3548,7 @@
       </w:r>
     </w:p>
     <w:sectPr>
-      <w:headerReference w:type="first" r:id="rId13"/>
+      <w:headerReference w:type="first" r:id="rId14"/>
       <w:footnotePr>
         <w:numRestart w:val="eachSect"/>
       </w:footnotePr>
@@ -3178,7 +3730,7 @@
         <v:path o:extrusionok="f" gradientshapeok="t" o:connecttype="rect"/>
         <o:lock v:ext="edit" aspectratio="t"/>
       </v:shapetype>
-      <v:shape id="_x0000_i1025" type="#_x0000_t75" style="width:27.05pt;height:27.05pt;visibility:visible;mso-wrap-style:square" o:bullet="t">
+      <v:shape id="_x0000_i1025" type="#_x0000_t75" style="width:26.9pt;height:26.9pt;visibility:visible;mso-wrap-style:square" o:bullet="t">
         <v:imagedata r:id="rId1" o:title=""/>
       </v:shape>
     </w:pict>

</xml_diff>